<commit_message>
Version final: GS-Corpus, consistencia documento-repositorio, limpieza de resultados obsoletos
</commit_message>
<xml_diff>
--- a/Tesis_TFC_Romano.docx
+++ b/Tesis_TFC_Romano.docx
@@ -456,6 +456,11 @@
     </w:p>
     <w:p>
       <w:pPr>
+        <w:spacing w:after="120"/>
+      </w:pPr>
+    </w:p>
+    <w:p>
+      <w:pPr>
         <w:spacing w:after="160" w:line="276"/>
         <w:jc w:val="both"/>
       </w:pPr>
@@ -1046,6 +1051,11 @@
     </w:p>
     <w:p>
       <w:pPr>
+        <w:spacing w:after="120"/>
+      </w:pPr>
+    </w:p>
+    <w:p>
+      <w:pPr>
         <w:pStyle w:val="ListParagraph"/>
         <w:numPr>
           <w:ilvl w:val="0"/>
@@ -1247,6 +1257,11 @@
     </w:p>
     <w:p>
       <w:pPr>
+        <w:spacing w:after="120"/>
+      </w:pPr>
+    </w:p>
+    <w:p>
+      <w:pPr>
         <w:spacing w:after="160" w:line="276"/>
         <w:jc w:val="both"/>
       </w:pPr>
@@ -2611,6 +2626,11 @@
     </w:p>
     <w:p>
       <w:pPr>
+        <w:spacing w:after="120"/>
+      </w:pPr>
+    </w:p>
+    <w:p>
+      <w:pPr>
         <w:spacing w:after="160" w:line="276"/>
         <w:jc w:val="both"/>
       </w:pPr>
@@ -2817,6 +2837,11 @@
     </w:p>
     <w:p>
       <w:pPr>
+        <w:spacing w:after="120"/>
+      </w:pPr>
+    </w:p>
+    <w:p>
+      <w:pPr>
         <w:spacing w:after="160" w:line="276"/>
         <w:jc w:val="both"/>
       </w:pPr>
@@ -2924,6 +2949,11 @@
     </w:p>
     <w:p>
       <w:pPr>
+        <w:spacing w:after="120"/>
+      </w:pPr>
+    </w:p>
+    <w:p>
+      <w:pPr>
         <w:spacing w:after="160" w:line="276"/>
         <w:jc w:val="both"/>
       </w:pPr>
@@ -3087,6 +3117,11 @@
     </w:p>
     <w:p>
       <w:pPr>
+        <w:spacing w:after="120"/>
+      </w:pPr>
+    </w:p>
+    <w:p>
+      <w:pPr>
         <w:spacing w:after="160" w:line="276"/>
         <w:jc w:val="both"/>
       </w:pPr>
@@ -3349,6 +3384,11 @@
     </w:p>
     <w:p>
       <w:pPr>
+        <w:spacing w:after="120"/>
+      </w:pPr>
+    </w:p>
+    <w:p>
+      <w:pPr>
         <w:spacing w:after="160" w:line="276"/>
         <w:jc w:val="both"/>
       </w:pPr>
@@ -5085,7 +5125,7 @@
         <w:t xml:space="preserve">Gold Standard</w:t>
       </w:r>
       <w:r>
-        <w:t xml:space="preserve"> del LEL de ecoFactory: los 21 símbolos tipados (Sujeto/Objeto/Verbo/Estado) con su noción e impacto, tal como fueron construidos, verificados y validados manualmente en el trabajo de origen (WER 2024). Este conjunto completo (</w:t>
+        <w:t xml:space="preserve"> del LEL de ecoFactory: los 21 símbolos tipados (Sujeto/Objeto/Verbo/Estado) con su noción e impacto, tal como fueron construidos, verificados y validados manualmente en el trabajo de origen (WER 2024). Este conjunto completo, denominado </w:t>
       </w:r>
       <w:r>
         <w:rPr>
@@ -5095,7 +5135,7 @@
         <w:t xml:space="preserve">GS-Completo</w:t>
       </w:r>
       <w:r>
-        <w:t xml:space="preserve">) es el LEL experto contra el que se contrasta la salida de cada método. Su tamaño —mayor que el vocabulario presente en las transcripciones— se explica porque el LEL manual no surge únicamente de las entrevistas: se fue ampliando durante el estudio original con la información anticipada, con los escenarios derivados del propio LEL y con la sesión de facilitación gráfica, todo lo cual incorpora símbolos que el vocabulario hablado en las cuatro transcripciones no contiene.</w:t>
+        <w:t xml:space="preserve">, es el LEL experto contra el que se contrasta la salida de cada método. Su tamaño —mayor que el vocabulario presente en las transcripciones— se explica porque el LEL manual no surge únicamente de las entrevistas: se fue ampliando durante el estudio original con la información anticipada, con los escenarios derivados del propio LEL y con la sesión de facilitación gráfica, todo lo cual incorpora símbolos que el vocabulario hablado en las cuatro transcripciones no contiene.</w:t>
       </w:r>
     </w:p>
     <w:p>
@@ -5121,7 +5161,7 @@
           <w:i/>
           <w:iCs/>
         </w:rPr>
-        <w:t xml:space="preserve">GS-Recuperable</w:t>
+        <w:t xml:space="preserve">GS-Corpus</w:t>
       </w:r>
       <w:r>
         <w:t xml:space="preserve">). La diferencia entre ambos —la </w:t>
@@ -5134,7 +5174,7 @@
         <w:t xml:space="preserve">brecha de recuperabilidad</w:t>
       </w:r>
       <w:r>
-        <w:t xml:space="preserve">— se analiza como un resultado en sí mismo, y no como un defecto: mide cuánto de un LEL experto puede reconstruirse a partir de transcripciones crudas. Exigirle a un método que recupere un símbolo cuya evidencia no está en el texto no sería una evaluación justa; por eso las métricas se reportan tanto contra el GS-Completo (techo teórico) como contra el GS-Recuperable (blanco alcanzable).</w:t>
+        <w:t xml:space="preserve">— se analiza como un resultado en sí mismo, y no como un defecto: mide cuánto de un LEL experto puede reconstruirse a partir de transcripciones crudas. Exigirle a un método que recupere un símbolo cuya evidencia no está en el texto no sería una evaluación justa; por eso las métricas se reportan tanto contra el GS-Completo (techo teórico) como contra el GS-Corpus (blanco alcanzable).</w:t>
       </w:r>
     </w:p>
     <w:p>
@@ -6323,6 +6363,11 @@
     </w:p>
     <w:p>
       <w:pPr>
+        <w:spacing w:after="120"/>
+      </w:pPr>
+    </w:p>
+    <w:p>
+      <w:pPr>
         <w:spacing w:after="160" w:line="276"/>
         <w:jc w:val="both"/>
       </w:pPr>
@@ -6410,6 +6455,11 @@
     </w:p>
     <w:p>
       <w:pPr>
+        <w:spacing w:after="120"/>
+      </w:pPr>
+    </w:p>
+    <w:p>
+      <w:pPr>
         <w:spacing w:after="160" w:line="276"/>
         <w:jc w:val="both"/>
       </w:pPr>
@@ -9571,6 +9621,11 @@
     </w:tbl>
     <w:p>
       <w:pPr>
+        <w:spacing w:after="120"/>
+      </w:pPr>
+    </w:p>
+    <w:p>
+      <w:pPr>
         <w:spacing w:after="160" w:line="276"/>
         <w:jc w:val="both"/>
       </w:pPr>
@@ -9584,7 +9639,7 @@
         <w:keepNext/>
       </w:pPr>
       <w:r>
-        <w:t xml:space="preserve">5.7 El GS-Recuperable y la brecha de recuperabilidad</w:t>
+        <w:t xml:space="preserve">5.7 El GS-Corpus y la brecha de recuperabilidad</w:t>
       </w:r>
     </w:p>
     <w:p>
@@ -9610,7 +9665,7 @@
           <w:i/>
           <w:iCs/>
         </w:rPr>
-        <w:t xml:space="preserve">GS-Recuperable</w:t>
+        <w:t xml:space="preserve">GS-Corpus</w:t>
       </w:r>
       <w:r>
         <w:t xml:space="preserve"> abarca los 15 símbolos que tienen sustento textual en las cuatro entrevistas transcriptas. La diferencia entre ambos —los 6 símbolos restantes— constituye la </w:t>
@@ -9634,7 +9689,7 @@
       <w:r>
         <w:drawing>
           <wp:inline distT="0" distB="0" distL="0" distR="0">
-            <wp:extent cx="4953000" cy="2143125"/>
+            <wp:extent cx="4953000" cy="2733675"/>
             <wp:effectExtent t="0" r="0" b="0" l="0"/>
             <wp:docPr id="1" name="" descr="" title=""/>
             <wp:cNvGraphicFramePr>
@@ -9659,7 +9714,7 @@
                   <pic:spPr bwMode="auto">
                     <a:xfrm>
                       <a:off x="0" y="0"/>
-                      <a:ext cx="4953000" cy="2143125"/>
+                      <a:ext cx="4953000" cy="2733675"/>
                     </a:xfrm>
                     <a:prstGeom prst="rect">
                       <a:avLst/>
@@ -9688,11 +9743,16 @@
     </w:p>
     <w:p>
       <w:pPr>
+        <w:spacing w:after="120"/>
+      </w:pPr>
+    </w:p>
+    <w:p>
+      <w:pPr>
         <w:spacing w:after="160" w:line="276"/>
         <w:jc w:val="both"/>
       </w:pPr>
       <w:r>
-        <w:t xml:space="preserve">Esta distinción tiene una consecuencia directa sobre el diseño experimental (Capítulo 4): cada método se evalúa contra el GS-Recuperable, que es su blanco alcanzable, y también contra el GS-Completo, como techo teórico. La brecha de recuperabilidad no es, pues, un defecto, sino una variable de interés en sí misma: seis símbolos del LEL experto no pueden inferirse de las cuatro entrevistas disponibles, un dato que dimensiona hasta dónde puede llegar cualquier método —automático o manual— que parta solo de esas transcripciones (Sección 5.8).</w:t>
+        <w:t xml:space="preserve">Esta distinción tiene una consecuencia directa sobre el diseño experimental (Capítulo 4): cada método se evalúa contra el GS-Corpus, que es su blanco alcanzable, y también contra el GS-Completo, como techo teórico. La brecha de recuperabilidad no es, pues, un defecto, sino una variable de interés en sí misma: seis símbolos del LEL experto no pueden inferirse de las cuatro entrevistas disponibles, un dato que dimensiona hasta dónde puede llegar cualquier método —automático o manual— que parta solo de esas transcripciones (Sección 5.8).</w:t>
       </w:r>
     </w:p>
     <w:p>
@@ -9841,6 +9901,11 @@
     </w:p>
     <w:p>
       <w:pPr>
+        <w:spacing w:after="120"/>
+      </w:pPr>
+    </w:p>
+    <w:p>
+      <w:pPr>
         <w:spacing w:after="160" w:line="276"/>
         <w:jc w:val="both"/>
       </w:pPr>
@@ -11913,6 +11978,11 @@
     </w:p>
     <w:p>
       <w:pPr>
+        <w:spacing w:after="120"/>
+      </w:pPr>
+    </w:p>
+    <w:p>
+      <w:pPr>
         <w:spacing w:after="160" w:line="276"/>
         <w:jc w:val="both"/>
       </w:pPr>
@@ -13580,7 +13650,7 @@
           <w:i/>
           <w:iCs/>
         </w:rPr>
-        <w:t xml:space="preserve">GS-Recuperable</w:t>
+        <w:t xml:space="preserve">GS-Corpus</w:t>
       </w:r>
       <w:r>
         <w:t xml:space="preserve"> (15 símbolos, los que tienen sustento textual en las cuatro entrevistas) y también contra el </w:t>
@@ -13941,7 +14011,7 @@
               <w:spacing w:line="250"/>
             </w:pPr>
             <w:r>
-              <w:t xml:space="preserve">GS-Recuperable (15)</w:t>
+              <w:t xml:space="preserve">GS-Corpus (15)</w:t>
             </w:r>
           </w:p>
         </w:tc>
@@ -14419,7 +14489,7 @@
         <w:jc w:val="both"/>
       </w:pPr>
       <w:r>
-        <w:t xml:space="preserve">El método recupera cerca de la mitad de los símbolos recuperables (cobertura de 0,467 contra el GS-Recuperable) y alrededor de un 43 % del GS-Completo, pero con una precisión baja (0,175 y 0,225 respectivamente), consecuencia de la gran cantidad de falsos positivos: de los 40 candidatos que propone, la mayoría son términos genéricos o conversacionales que el análisis de frecuencia no logra descartar. La exactitud de clasificación de tipo sobre los símbolos correctamente identificados ronda 0,56–0,57. El dato cualitativamente más relevante es la columna Descr.: la noción y el impacto de todos los símbolos quedan vacíos, porque el método no genera descripciones.</w:t>
+        <w:t xml:space="preserve">El método recupera cerca de la mitad de los símbolos recuperables (cobertura de 0,467 contra el GS-Corpus) y alrededor de un 43 % del GS-Completo, pero con una precisión baja (0,175 y 0,225 respectivamente), consecuencia de la gran cantidad de falsos positivos: de los 40 candidatos que propone, la mayoría son términos genéricos o conversacionales que el análisis de frecuencia no logra descartar. La exactitud de clasificación de tipo sobre los símbolos correctamente identificados ronda 0,56–0,57. El dato cualitativamente más relevante es la columna Descr.: la noción y el impacto de todos los símbolos quedan vacíos, porque el método no genera descripciones.</w:t>
       </w:r>
     </w:p>
     <w:p>
@@ -14870,7 +14940,7 @@
               <w:spacing w:line="250"/>
             </w:pPr>
             <w:r>
-              <w:t xml:space="preserve">GS-Recuperable (15)</w:t>
+              <w:t xml:space="preserve">GS-Corpus (15)</w:t>
             </w:r>
           </w:p>
         </w:tc>
@@ -15348,7 +15418,7 @@
         <w:jc w:val="both"/>
       </w:pPr>
       <w:r>
-        <w:t xml:space="preserve">Contra el GS-Recuperable —el blanco alcanzable desde el corpus disponible—, el pipeline alcanza una </w:t>
+        <w:t xml:space="preserve">Contra el GS-Corpus —el blanco alcanzable desde el corpus disponible—, el pipeline alcanza una </w:t>
       </w:r>
       <w:r>
         <w:rPr>
@@ -15426,7 +15496,7 @@
         <w:jc w:val="both"/>
       </w:pPr>
       <w:r>
-        <w:t xml:space="preserve">El contraste con el baseline de frecuencia, frente al mismo blanco de comparación (GS-Recuperable), es nítido (Figura 7.2).</w:t>
+        <w:t xml:space="preserve">El contraste con el baseline de frecuencia, frente al mismo blanco de comparación (GS-Corpus), es nítido (Figura 7.2).</w:t>
       </w:r>
     </w:p>
     <w:p>
@@ -15486,8 +15556,13 @@
           <w:sz w:val="19"/>
           <w:szCs w:val="19"/>
         </w:rPr>
-        <w:t xml:space="preserve">Fig. 7.2. PLN tradicional frente al pipeline LLM en las métricas de identificación, clasificación y descripción, contra el GS-Recuperable.</w:t>
-      </w:r>
+        <w:t xml:space="preserve">Fig. 7.2. PLN tradicional frente al pipeline LLM en las métricas de identificación, clasificación y descripción, contra el GS-Corpus.</w:t>
+      </w:r>
+    </w:p>
+    <w:p>
+      <w:pPr>
+        <w:spacing w:after="120"/>
+      </w:pPr>
     </w:p>
     <w:p>
       <w:pPr>
@@ -15500,7 +15575,7 @@
           <w:sz w:val="19"/>
           <w:szCs w:val="19"/>
         </w:rPr>
-        <w:t xml:space="preserve">Tabla 7.5. Comparación del baseline de frecuencia (C1a) y el pipeline LLM (C2c) frente al GS-Recuperable.</w:t>
+        <w:t xml:space="preserve">Tabla 7.5. Comparación del baseline de frecuencia (C1a) y el pipeline LLM (C2c) frente al GS-Corpus.</w:t>
       </w:r>
     </w:p>
     <w:tbl>
@@ -16288,7 +16363,7 @@
         <w:jc w:val="both"/>
       </w:pPr>
       <w:r>
-        <w:t xml:space="preserve">La cobertura está acotada por el corpus. Seis de los veintiún símbolos del LEL experto no tienen sustento textual en las cuatro entrevistas disponibles, de modo que ningún método —automático o manual— podría recuperarlos partiendo solo de esas transcripciones. La comparación justa es, por eso, contra el GS-Recuperable (15 símbolos).</w:t>
+        <w:t xml:space="preserve">La cobertura está acotada por el corpus. Seis de los veintiún símbolos del LEL experto no tienen sustento textual en las cuatro entrevistas disponibles, de modo que ningún método —automático o manual— podría recuperarlos partiendo solo de esas transcripciones. La comparación justa es, por eso, contra el GS-Corpus (15 símbolos).</w:t>
       </w:r>
     </w:p>
     <w:p>
@@ -16302,7 +16377,7 @@
         <w:jc w:val="both"/>
       </w:pPr>
       <w:r>
-        <w:t xml:space="preserve">El enfoque generativo cierra la brecha de descripción. En la corrida de referencia, el pipeline LLM (C2c) describe el 100 % de los símbolos —noción e impacto— frente al 0 % del PLN por frecuencia, con un F1 de 0,529 contra el GS-Recuperable. Esta es la contribución cualitativa que el PLN por frecuencia no puede ofrecer.</w:t>
+        <w:t xml:space="preserve">El enfoque generativo cierra la brecha de descripción. En la corrida de referencia, el pipeline LLM (C2c) describe el 100 % de los símbolos —noción e impacto— frente al 0 % del PLN por frecuencia, con un F1 de 0,529 contra el GS-Corpus. Esta es la contribución cualitativa que el PLN por frecuencia no puede ofrecer.</w:t>
       </w:r>
     </w:p>
     <w:p>
@@ -17271,6 +17346,11 @@
     </w:p>
     <w:p>
       <w:pPr>
+        <w:spacing w:after="120"/>
+      </w:pPr>
+    </w:p>
+    <w:p>
+      <w:pPr>
         <w:spacing w:after="160" w:line="276"/>
         <w:jc w:val="both"/>
       </w:pPr>
@@ -17443,7 +17523,7 @@
           <w:sz w:val="16"/>
           <w:szCs w:val="16"/>
         </w:rPr>
-        <w:t xml:space="preserve"># ecoFactory — baseline de frecuencia (Corpus-Extendido, 4 entrevistas reales) vs GS-Completo</w:t>
+        <w:t xml:space="preserve"># ecoFactory — baseline de frecuencia (4 entrevistas reales) vs GS-Completo</w:t>
       </w:r>
       <w:r>
         <w:br/>
@@ -19487,6 +19567,11 @@
         </w:tc>
       </w:tr>
     </w:tbl>
+    <w:p>
+      <w:pPr>
+        <w:spacing w:after="120"/>
+      </w:pPr>
+    </w:p>
     <w:p>
       <w:pPr>
         <w:spacing w:after="60" w:before="160"/>
@@ -19549,6 +19634,11 @@
     </w:p>
     <w:p>
       <w:pPr>
+        <w:spacing w:after="120"/>
+      </w:pPr>
+    </w:p>
+    <w:p>
+      <w:pPr>
         <w:spacing w:after="160" w:line="276"/>
         <w:jc w:val="both"/>
       </w:pPr>
@@ -19737,7 +19827,7 @@
         <w:jc w:val="both"/>
       </w:pPr>
       <w:r>
-        <w:t xml:space="preserve">Estas corridas no son trabajo futuro en un sentido vago: son el paso inmediato siguiente, ya diseñado, documentado y con el código listo, que transforma la corrida de referencia de este capítulo en el resultado definitivo del experimento. Correrlas y volcar sus números a este capítulo es la primera tarea del roadmap del repositorio (`CLAUDE.md`).</w:t>
+        <w:t xml:space="preserve">Estas corridas no son trabajo futuro en un sentido vago: son el paso inmediato siguiente, ya diseñado, documentado y con el código listo, que transforma la corrida de referencia de este capítulo en el resultado definitivo del experimento. Correrlas y volcar sus números a este capítulo es la primera tarea pendiente del repositorio, documentada en `INSTRUCTIVO_EJECUCION.md`.</w:t>
       </w:r>
     </w:p>
     <w:p>
@@ -20151,6 +20241,11 @@
     </w:p>
     <w:p>
       <w:pPr>
+        <w:spacing w:after="120"/>
+      </w:pPr>
+    </w:p>
+    <w:p>
+      <w:pPr>
         <w:spacing w:after="160" w:line="276"/>
         <w:jc w:val="both"/>
       </w:pPr>
@@ -20709,6 +20804,11 @@
     </w:p>
     <w:p>
       <w:pPr>
+        <w:spacing w:after="120"/>
+      </w:pPr>
+    </w:p>
+    <w:p>
+      <w:pPr>
         <w:pStyle w:val="ListParagraph"/>
         <w:numPr>
           <w:ilvl w:val="0"/>
@@ -23202,6 +23302,11 @@
     </w:tbl>
     <w:p>
       <w:pPr>
+        <w:spacing w:after="120"/>
+      </w:pPr>
+    </w:p>
+    <w:p>
+      <w:pPr>
         <w:spacing w:after="160" w:line="276"/>
         <w:jc w:val="both"/>
       </w:pPr>
@@ -23226,7 +23331,7 @@
         <w:jc w:val="both"/>
       </w:pPr>
       <w:r>
-        <w:t xml:space="preserve">Se transcribe el LEL completo tal como lo produjo la corrida de referencia de la Sección 7.4 (pipeline C2c, modelo: asistente, corpus real de 4 entrevistas): 19 símbolos con su noción e impacto. El archivo fuente en formato JSON está en `resultados/lel_llm_C2c_corpusB_real.json`.</w:t>
+        <w:t xml:space="preserve">Se transcribe el LEL completo tal como lo produjo la corrida de referencia de la Sección 7.4 (pipeline C2c, modelo: asistente, corpus real de 4 entrevistas): 19 símbolos con su noción e impacto. El archivo fuente en formato JSON está en `resultados/lel_llm_C2c_referencia.json`.</w:t>
       </w:r>
     </w:p>
     <w:p>

</xml_diff>

<commit_message>
Indice estatico con numeros de pagina reales; elimina el dialogo de campos de Word
</commit_message>
<xml_diff>
--- a/Tesis_TFC_Romano.docx
+++ b/Tesis_TFC_Romano.docx
@@ -260,25 +260,2286 @@
         <w:t xml:space="preserve">Índice</w:t>
       </w:r>
     </w:p>
-    <w:sdt>
-      <w:sdtPr>
-        <w:alias w:val="Tabla de contenidos"/>
-      </w:sdtPr>
-      <w:sdtContent>
-        <w:p>
-          <w:r>
-            <w:fldChar w:fldCharType="begin" w:dirty="true"/>
-            <w:instrText xml:space="preserve">TOC \h \o "1-3"</w:instrText>
-            <w:fldChar w:fldCharType="separate"/>
-          </w:r>
-        </w:p>
-        <w:p>
-          <w:r>
-            <w:fldChar w:fldCharType="end"/>
-          </w:r>
-        </w:p>
-      </w:sdtContent>
-    </w:sdt>
+    <w:p>
+      <w:pPr>
+        <w:tabs>
+          <w:tab w:val="right" w:pos="9000" w:leader="dot"/>
+        </w:tabs>
+        <w:spacing w:after="60" w:line="240"/>
+        <w:ind w:left="0"/>
+      </w:pPr>
+      <w:r>
+        <w:rPr>
+          <w:rFonts w:ascii="Times New Roman" w:cs="Times New Roman" w:eastAsia="Times New Roman" w:hAnsi="Times New Roman"/>
+          <w:b/>
+          <w:bCs/>
+          <w:sz w:val="21"/>
+          <w:szCs w:val="21"/>
+        </w:rPr>
+        <w:t xml:space="preserve">Resumen	2</w:t>
+      </w:r>
+    </w:p>
+    <w:p>
+      <w:pPr>
+        <w:tabs>
+          <w:tab w:val="right" w:pos="9000" w:leader="dot"/>
+        </w:tabs>
+        <w:spacing w:after="60" w:line="240"/>
+        <w:ind w:left="0"/>
+      </w:pPr>
+      <w:r>
+        <w:rPr>
+          <w:rFonts w:ascii="Times New Roman" w:cs="Times New Roman" w:eastAsia="Times New Roman" w:hAnsi="Times New Roman"/>
+          <w:b/>
+          <w:bCs/>
+          <w:sz w:val="21"/>
+          <w:szCs w:val="21"/>
+        </w:rPr>
+        <w:t xml:space="preserve">Abstract	3</w:t>
+      </w:r>
+    </w:p>
+    <w:p>
+      <w:pPr>
+        <w:tabs>
+          <w:tab w:val="right" w:pos="9000" w:leader="dot"/>
+        </w:tabs>
+        <w:spacing w:after="60" w:line="240"/>
+        <w:ind w:left="0"/>
+      </w:pPr>
+      <w:r>
+        <w:rPr>
+          <w:rFonts w:ascii="Times New Roman" w:cs="Times New Roman" w:eastAsia="Times New Roman" w:hAnsi="Times New Roman"/>
+          <w:b/>
+          <w:bCs/>
+          <w:sz w:val="21"/>
+          <w:szCs w:val="21"/>
+        </w:rPr>
+        <w:t xml:space="preserve">Capítulo 1 — Introducción	7</w:t>
+      </w:r>
+    </w:p>
+    <w:p>
+      <w:pPr>
+        <w:tabs>
+          <w:tab w:val="right" w:pos="9000" w:leader="dot"/>
+        </w:tabs>
+        <w:spacing w:after="20" w:line="240"/>
+        <w:ind w:left="280"/>
+      </w:pPr>
+      <w:r>
+        <w:rPr>
+          <w:rFonts w:ascii="Times New Roman" w:cs="Times New Roman" w:eastAsia="Times New Roman" w:hAnsi="Times New Roman"/>
+          <w:b w:val="false"/>
+          <w:bCs w:val="false"/>
+          <w:sz w:val="20"/>
+          <w:szCs w:val="20"/>
+        </w:rPr>
+        <w:t xml:space="preserve">1.1 Contexto y motivación	7</w:t>
+      </w:r>
+    </w:p>
+    <w:p>
+      <w:pPr>
+        <w:tabs>
+          <w:tab w:val="right" w:pos="9000" w:leader="dot"/>
+        </w:tabs>
+        <w:spacing w:after="20" w:line="240"/>
+        <w:ind w:left="280"/>
+      </w:pPr>
+      <w:r>
+        <w:rPr>
+          <w:rFonts w:ascii="Times New Roman" w:cs="Times New Roman" w:eastAsia="Times New Roman" w:hAnsi="Times New Roman"/>
+          <w:b w:val="false"/>
+          <w:bCs w:val="false"/>
+          <w:sz w:val="20"/>
+          <w:szCs w:val="20"/>
+        </w:rPr>
+        <w:t xml:space="preserve">1.2 Planteo del problema	8</w:t>
+      </w:r>
+    </w:p>
+    <w:p>
+      <w:pPr>
+        <w:tabs>
+          <w:tab w:val="right" w:pos="9000" w:leader="dot"/>
+        </w:tabs>
+        <w:spacing w:after="20" w:line="240"/>
+        <w:ind w:left="280"/>
+      </w:pPr>
+      <w:r>
+        <w:rPr>
+          <w:rFonts w:ascii="Times New Roman" w:cs="Times New Roman" w:eastAsia="Times New Roman" w:hAnsi="Times New Roman"/>
+          <w:b w:val="false"/>
+          <w:bCs w:val="false"/>
+          <w:sz w:val="20"/>
+          <w:szCs w:val="20"/>
+        </w:rPr>
+        <w:t xml:space="preserve">1.3 Antecedentes	8</w:t>
+      </w:r>
+    </w:p>
+    <w:p>
+      <w:pPr>
+        <w:tabs>
+          <w:tab w:val="right" w:pos="9000" w:leader="dot"/>
+        </w:tabs>
+        <w:spacing w:after="20" w:line="240"/>
+        <w:ind w:left="280"/>
+      </w:pPr>
+      <w:r>
+        <w:rPr>
+          <w:rFonts w:ascii="Times New Roman" w:cs="Times New Roman" w:eastAsia="Times New Roman" w:hAnsi="Times New Roman"/>
+          <w:b w:val="false"/>
+          <w:bCs w:val="false"/>
+          <w:sz w:val="20"/>
+          <w:szCs w:val="20"/>
+        </w:rPr>
+        <w:t xml:space="preserve">1.4 Preguntas de investigación	9</w:t>
+      </w:r>
+    </w:p>
+    <w:p>
+      <w:pPr>
+        <w:tabs>
+          <w:tab w:val="right" w:pos="9000" w:leader="dot"/>
+        </w:tabs>
+        <w:spacing w:after="20" w:line="240"/>
+        <w:ind w:left="280"/>
+      </w:pPr>
+      <w:r>
+        <w:rPr>
+          <w:rFonts w:ascii="Times New Roman" w:cs="Times New Roman" w:eastAsia="Times New Roman" w:hAnsi="Times New Roman"/>
+          <w:b w:val="false"/>
+          <w:bCs w:val="false"/>
+          <w:sz w:val="20"/>
+          <w:szCs w:val="20"/>
+        </w:rPr>
+        <w:t xml:space="preserve">1.5 Objetivos	9</w:t>
+      </w:r>
+    </w:p>
+    <w:p>
+      <w:pPr>
+        <w:tabs>
+          <w:tab w:val="right" w:pos="9000" w:leader="dot"/>
+        </w:tabs>
+        <w:spacing w:after="20" w:line="240"/>
+        <w:ind w:left="280"/>
+      </w:pPr>
+      <w:r>
+        <w:rPr>
+          <w:rFonts w:ascii="Times New Roman" w:cs="Times New Roman" w:eastAsia="Times New Roman" w:hAnsi="Times New Roman"/>
+          <w:b w:val="false"/>
+          <w:bCs w:val="false"/>
+          <w:sz w:val="20"/>
+          <w:szCs w:val="20"/>
+        </w:rPr>
+        <w:t xml:space="preserve">1.6 Hipótesis	10</w:t>
+      </w:r>
+    </w:p>
+    <w:p>
+      <w:pPr>
+        <w:tabs>
+          <w:tab w:val="right" w:pos="9000" w:leader="dot"/>
+        </w:tabs>
+        <w:spacing w:after="20" w:line="240"/>
+        <w:ind w:left="280"/>
+      </w:pPr>
+      <w:r>
+        <w:rPr>
+          <w:rFonts w:ascii="Times New Roman" w:cs="Times New Roman" w:eastAsia="Times New Roman" w:hAnsi="Times New Roman"/>
+          <w:b w:val="false"/>
+          <w:bCs w:val="false"/>
+          <w:sz w:val="20"/>
+          <w:szCs w:val="20"/>
+        </w:rPr>
+        <w:t xml:space="preserve">1.7 Alcance y limitaciones	10</w:t>
+      </w:r>
+    </w:p>
+    <w:p>
+      <w:pPr>
+        <w:tabs>
+          <w:tab w:val="right" w:pos="9000" w:leader="dot"/>
+        </w:tabs>
+        <w:spacing w:after="20" w:line="240"/>
+        <w:ind w:left="280"/>
+      </w:pPr>
+      <w:r>
+        <w:rPr>
+          <w:rFonts w:ascii="Times New Roman" w:cs="Times New Roman" w:eastAsia="Times New Roman" w:hAnsi="Times New Roman"/>
+          <w:b w:val="false"/>
+          <w:bCs w:val="false"/>
+          <w:sz w:val="20"/>
+          <w:szCs w:val="20"/>
+        </w:rPr>
+        <w:t xml:space="preserve">1.8 Aportes esperados	10</w:t>
+      </w:r>
+    </w:p>
+    <w:p>
+      <w:pPr>
+        <w:tabs>
+          <w:tab w:val="right" w:pos="9000" w:leader="dot"/>
+        </w:tabs>
+        <w:spacing w:after="20" w:line="240"/>
+        <w:ind w:left="280"/>
+      </w:pPr>
+      <w:r>
+        <w:rPr>
+          <w:rFonts w:ascii="Times New Roman" w:cs="Times New Roman" w:eastAsia="Times New Roman" w:hAnsi="Times New Roman"/>
+          <w:b w:val="false"/>
+          <w:bCs w:val="false"/>
+          <w:sz w:val="20"/>
+          <w:szCs w:val="20"/>
+        </w:rPr>
+        <w:t xml:space="preserve">1.9 Organización del trabajo	10</w:t>
+      </w:r>
+    </w:p>
+    <w:p>
+      <w:pPr>
+        <w:tabs>
+          <w:tab w:val="right" w:pos="9000" w:leader="dot"/>
+        </w:tabs>
+        <w:spacing w:after="60" w:line="240"/>
+        <w:ind w:left="0"/>
+      </w:pPr>
+      <w:r>
+        <w:rPr>
+          <w:rFonts w:ascii="Times New Roman" w:cs="Times New Roman" w:eastAsia="Times New Roman" w:hAnsi="Times New Roman"/>
+          <w:b/>
+          <w:bCs/>
+          <w:sz w:val="21"/>
+          <w:szCs w:val="21"/>
+        </w:rPr>
+        <w:t xml:space="preserve">Capítulo 2 — Marco Teórico	11</w:t>
+      </w:r>
+    </w:p>
+    <w:p>
+      <w:pPr>
+        <w:tabs>
+          <w:tab w:val="right" w:pos="9000" w:leader="dot"/>
+        </w:tabs>
+        <w:spacing w:after="20" w:line="240"/>
+        <w:ind w:left="280"/>
+      </w:pPr>
+      <w:r>
+        <w:rPr>
+          <w:rFonts w:ascii="Times New Roman" w:cs="Times New Roman" w:eastAsia="Times New Roman" w:hAnsi="Times New Roman"/>
+          <w:b w:val="false"/>
+          <w:bCs w:val="false"/>
+          <w:sz w:val="20"/>
+          <w:szCs w:val="20"/>
+        </w:rPr>
+        <w:t xml:space="preserve">2.1 La Ingeniería de Requisitos	11</w:t>
+      </w:r>
+    </w:p>
+    <w:p>
+      <w:pPr>
+        <w:tabs>
+          <w:tab w:val="right" w:pos="9000" w:leader="dot"/>
+        </w:tabs>
+        <w:spacing w:after="20" w:line="240"/>
+        <w:ind w:left="280"/>
+      </w:pPr>
+      <w:r>
+        <w:rPr>
+          <w:rFonts w:ascii="Times New Roman" w:cs="Times New Roman" w:eastAsia="Times New Roman" w:hAnsi="Times New Roman"/>
+          <w:b w:val="false"/>
+          <w:bCs w:val="false"/>
+          <w:sz w:val="20"/>
+          <w:szCs w:val="20"/>
+        </w:rPr>
+        <w:t xml:space="preserve">2.2 La estrategia de IR orientada al cliente	12</w:t>
+      </w:r>
+    </w:p>
+    <w:p>
+      <w:pPr>
+        <w:tabs>
+          <w:tab w:val="right" w:pos="9000" w:leader="dot"/>
+        </w:tabs>
+        <w:spacing w:after="20" w:line="240"/>
+        <w:ind w:left="280"/>
+      </w:pPr>
+      <w:r>
+        <w:rPr>
+          <w:rFonts w:ascii="Times New Roman" w:cs="Times New Roman" w:eastAsia="Times New Roman" w:hAnsi="Times New Roman"/>
+          <w:b w:val="false"/>
+          <w:bCs w:val="false"/>
+          <w:sz w:val="20"/>
+          <w:szCs w:val="20"/>
+        </w:rPr>
+        <w:t xml:space="preserve">2.3 Universo de Discurso, fuentes de información y Elicitación	13</w:t>
+      </w:r>
+    </w:p>
+    <w:p>
+      <w:pPr>
+        <w:tabs>
+          <w:tab w:val="right" w:pos="9000" w:leader="dot"/>
+        </w:tabs>
+        <w:spacing w:after="20" w:line="240"/>
+        <w:ind w:left="280"/>
+      </w:pPr>
+      <w:r>
+        <w:rPr>
+          <w:rFonts w:ascii="Times New Roman" w:cs="Times New Roman" w:eastAsia="Times New Roman" w:hAnsi="Times New Roman"/>
+          <w:b w:val="false"/>
+          <w:bCs w:val="false"/>
+          <w:sz w:val="20"/>
+          <w:szCs w:val="20"/>
+        </w:rPr>
+        <w:t xml:space="preserve">2.4 El Modelo Léxico Extendido del Lenguaje	14</w:t>
+      </w:r>
+    </w:p>
+    <w:p>
+      <w:pPr>
+        <w:tabs>
+          <w:tab w:val="right" w:pos="9000" w:leader="dot"/>
+        </w:tabs>
+        <w:spacing w:after="20" w:line="240"/>
+        <w:ind w:left="560"/>
+      </w:pPr>
+      <w:r>
+        <w:rPr>
+          <w:rFonts w:ascii="Times New Roman" w:cs="Times New Roman" w:eastAsia="Times New Roman" w:hAnsi="Times New Roman"/>
+          <w:b w:val="false"/>
+          <w:bCs w:val="false"/>
+          <w:sz w:val="20"/>
+          <w:szCs w:val="20"/>
+        </w:rPr>
+        <w:t xml:space="preserve">2.4.1 Estructura de un símbolo	14</w:t>
+      </w:r>
+    </w:p>
+    <w:p>
+      <w:pPr>
+        <w:tabs>
+          <w:tab w:val="right" w:pos="9000" w:leader="dot"/>
+        </w:tabs>
+        <w:spacing w:after="20" w:line="240"/>
+        <w:ind w:left="560"/>
+      </w:pPr>
+      <w:r>
+        <w:rPr>
+          <w:rFonts w:ascii="Times New Roman" w:cs="Times New Roman" w:eastAsia="Times New Roman" w:hAnsi="Times New Roman"/>
+          <w:b w:val="false"/>
+          <w:bCs w:val="false"/>
+          <w:sz w:val="20"/>
+          <w:szCs w:val="20"/>
+        </w:rPr>
+        <w:t xml:space="preserve">2.4.2 Tipos de símbolo	15</w:t>
+      </w:r>
+    </w:p>
+    <w:p>
+      <w:pPr>
+        <w:tabs>
+          <w:tab w:val="right" w:pos="9000" w:leader="dot"/>
+        </w:tabs>
+        <w:spacing w:after="20" w:line="240"/>
+        <w:ind w:left="560"/>
+      </w:pPr>
+      <w:r>
+        <w:rPr>
+          <w:rFonts w:ascii="Times New Roman" w:cs="Times New Roman" w:eastAsia="Times New Roman" w:hAnsi="Times New Roman"/>
+          <w:b w:val="false"/>
+          <w:bCs w:val="false"/>
+          <w:sz w:val="20"/>
+          <w:szCs w:val="20"/>
+        </w:rPr>
+        <w:t xml:space="preserve">2.4.3 Principios: circularidad y vocabulario mínimo	16</w:t>
+      </w:r>
+    </w:p>
+    <w:p>
+      <w:pPr>
+        <w:tabs>
+          <w:tab w:val="right" w:pos="9000" w:leader="dot"/>
+        </w:tabs>
+        <w:spacing w:after="20" w:line="240"/>
+        <w:ind w:left="560"/>
+      </w:pPr>
+      <w:r>
+        <w:rPr>
+          <w:rFonts w:ascii="Times New Roman" w:cs="Times New Roman" w:eastAsia="Times New Roman" w:hAnsi="Times New Roman"/>
+          <w:b w:val="false"/>
+          <w:bCs w:val="false"/>
+          <w:sz w:val="20"/>
+          <w:szCs w:val="20"/>
+        </w:rPr>
+        <w:t xml:space="preserve">2.4.4 Reglas para seleccionar símbolos	16</w:t>
+      </w:r>
+    </w:p>
+    <w:p>
+      <w:pPr>
+        <w:tabs>
+          <w:tab w:val="right" w:pos="9000" w:leader="dot"/>
+        </w:tabs>
+        <w:spacing w:after="20" w:line="240"/>
+        <w:ind w:left="280"/>
+      </w:pPr>
+      <w:r>
+        <w:rPr>
+          <w:rFonts w:ascii="Times New Roman" w:cs="Times New Roman" w:eastAsia="Times New Roman" w:hAnsi="Times New Roman"/>
+          <w:b w:val="false"/>
+          <w:bCs w:val="false"/>
+          <w:sz w:val="20"/>
+          <w:szCs w:val="20"/>
+        </w:rPr>
+        <w:t xml:space="preserve">2.5 Proceso de construcción del LEL	16</w:t>
+      </w:r>
+    </w:p>
+    <w:p>
+      <w:pPr>
+        <w:tabs>
+          <w:tab w:val="right" w:pos="9000" w:leader="dot"/>
+        </w:tabs>
+        <w:spacing w:after="20" w:line="240"/>
+        <w:ind w:left="280"/>
+      </w:pPr>
+      <w:r>
+        <w:rPr>
+          <w:rFonts w:ascii="Times New Roman" w:cs="Times New Roman" w:eastAsia="Times New Roman" w:hAnsi="Times New Roman"/>
+          <w:b w:val="false"/>
+          <w:bCs w:val="false"/>
+          <w:sz w:val="20"/>
+          <w:szCs w:val="20"/>
+        </w:rPr>
+        <w:t xml:space="preserve">2.6 Escenarios	17</w:t>
+      </w:r>
+    </w:p>
+    <w:p>
+      <w:pPr>
+        <w:tabs>
+          <w:tab w:val="right" w:pos="9000" w:leader="dot"/>
+        </w:tabs>
+        <w:spacing w:after="20" w:line="240"/>
+        <w:ind w:left="280"/>
+      </w:pPr>
+      <w:r>
+        <w:rPr>
+          <w:rFonts w:ascii="Times New Roman" w:cs="Times New Roman" w:eastAsia="Times New Roman" w:hAnsi="Times New Roman"/>
+          <w:b w:val="false"/>
+          <w:bCs w:val="false"/>
+          <w:sz w:val="20"/>
+          <w:szCs w:val="20"/>
+        </w:rPr>
+        <w:t xml:space="preserve">2.7 Verificación y Validación	17</w:t>
+      </w:r>
+    </w:p>
+    <w:p>
+      <w:pPr>
+        <w:tabs>
+          <w:tab w:val="right" w:pos="9000" w:leader="dot"/>
+        </w:tabs>
+        <w:spacing w:after="20" w:line="240"/>
+        <w:ind w:left="280"/>
+      </w:pPr>
+      <w:r>
+        <w:rPr>
+          <w:rFonts w:ascii="Times New Roman" w:cs="Times New Roman" w:eastAsia="Times New Roman" w:hAnsi="Times New Roman"/>
+          <w:b w:val="false"/>
+          <w:bCs w:val="false"/>
+          <w:sz w:val="20"/>
+          <w:szCs w:val="20"/>
+        </w:rPr>
+        <w:t xml:space="preserve">2.8 Gestión de Requisitos y trazabilidad	18</w:t>
+      </w:r>
+    </w:p>
+    <w:p>
+      <w:pPr>
+        <w:tabs>
+          <w:tab w:val="right" w:pos="9000" w:leader="dot"/>
+        </w:tabs>
+        <w:spacing w:after="20" w:line="240"/>
+        <w:ind w:left="280"/>
+      </w:pPr>
+      <w:r>
+        <w:rPr>
+          <w:rFonts w:ascii="Times New Roman" w:cs="Times New Roman" w:eastAsia="Times New Roman" w:hAnsi="Times New Roman"/>
+          <w:b w:val="false"/>
+          <w:bCs w:val="false"/>
+          <w:sz w:val="20"/>
+          <w:szCs w:val="20"/>
+        </w:rPr>
+        <w:t xml:space="preserve">2.9 Inteligencia Artificial Generativa y Grandes Modelos de Lenguaje	18</w:t>
+      </w:r>
+    </w:p>
+    <w:p>
+      <w:pPr>
+        <w:tabs>
+          <w:tab w:val="right" w:pos="9000" w:leader="dot"/>
+        </w:tabs>
+        <w:spacing w:after="20" w:line="240"/>
+        <w:ind w:left="560"/>
+      </w:pPr>
+      <w:r>
+        <w:rPr>
+          <w:rFonts w:ascii="Times New Roman" w:cs="Times New Roman" w:eastAsia="Times New Roman" w:hAnsi="Times New Roman"/>
+          <w:b w:val="false"/>
+          <w:bCs w:val="false"/>
+          <w:sz w:val="20"/>
+          <w:szCs w:val="20"/>
+        </w:rPr>
+        <w:t xml:space="preserve">2.9.1 La arquitectura Transformer	18</w:t>
+      </w:r>
+    </w:p>
+    <w:p>
+      <w:pPr>
+        <w:tabs>
+          <w:tab w:val="right" w:pos="9000" w:leader="dot"/>
+        </w:tabs>
+        <w:spacing w:after="20" w:line="240"/>
+        <w:ind w:left="560"/>
+      </w:pPr>
+      <w:r>
+        <w:rPr>
+          <w:rFonts w:ascii="Times New Roman" w:cs="Times New Roman" w:eastAsia="Times New Roman" w:hAnsi="Times New Roman"/>
+          <w:b w:val="false"/>
+          <w:bCs w:val="false"/>
+          <w:sz w:val="20"/>
+          <w:szCs w:val="20"/>
+        </w:rPr>
+        <w:t xml:space="preserve">2.9.2 Pre-entrenamiento, ajuste fino y técnicas de prompting	19</w:t>
+      </w:r>
+    </w:p>
+    <w:p>
+      <w:pPr>
+        <w:tabs>
+          <w:tab w:val="right" w:pos="9000" w:leader="dot"/>
+        </w:tabs>
+        <w:spacing w:after="20" w:line="240"/>
+        <w:ind w:left="560"/>
+      </w:pPr>
+      <w:r>
+        <w:rPr>
+          <w:rFonts w:ascii="Times New Roman" w:cs="Times New Roman" w:eastAsia="Times New Roman" w:hAnsi="Times New Roman"/>
+          <w:b w:val="false"/>
+          <w:bCs w:val="false"/>
+          <w:sz w:val="20"/>
+          <w:szCs w:val="20"/>
+        </w:rPr>
+        <w:t xml:space="preserve">2.9.3 Capacidades y limitaciones	20</w:t>
+      </w:r>
+    </w:p>
+    <w:p>
+      <w:pPr>
+        <w:tabs>
+          <w:tab w:val="right" w:pos="9000" w:leader="dot"/>
+        </w:tabs>
+        <w:spacing w:after="20" w:line="240"/>
+        <w:ind w:left="280"/>
+      </w:pPr>
+      <w:r>
+        <w:rPr>
+          <w:rFonts w:ascii="Times New Roman" w:cs="Times New Roman" w:eastAsia="Times New Roman" w:hAnsi="Times New Roman"/>
+          <w:b w:val="false"/>
+          <w:bCs w:val="false"/>
+          <w:sz w:val="20"/>
+          <w:szCs w:val="20"/>
+        </w:rPr>
+        <w:t xml:space="preserve">2.10 Procesamiento de Lenguaje Natural tradicional	20</w:t>
+      </w:r>
+    </w:p>
+    <w:p>
+      <w:pPr>
+        <w:tabs>
+          <w:tab w:val="right" w:pos="9000" w:leader="dot"/>
+        </w:tabs>
+        <w:spacing w:after="20" w:line="240"/>
+        <w:ind w:left="280"/>
+      </w:pPr>
+      <w:r>
+        <w:rPr>
+          <w:rFonts w:ascii="Times New Roman" w:cs="Times New Roman" w:eastAsia="Times New Roman" w:hAnsi="Times New Roman"/>
+          <w:b w:val="false"/>
+          <w:bCs w:val="false"/>
+          <w:sz w:val="20"/>
+          <w:szCs w:val="20"/>
+        </w:rPr>
+        <w:t xml:space="preserve">2.11 Síntesis: por qué IA Generativa para construir el LEL	21</w:t>
+      </w:r>
+    </w:p>
+    <w:p>
+      <w:pPr>
+        <w:tabs>
+          <w:tab w:val="right" w:pos="9000" w:leader="dot"/>
+        </w:tabs>
+        <w:spacing w:after="60" w:line="240"/>
+        <w:ind w:left="0"/>
+      </w:pPr>
+      <w:r>
+        <w:rPr>
+          <w:rFonts w:ascii="Times New Roman" w:cs="Times New Roman" w:eastAsia="Times New Roman" w:hAnsi="Times New Roman"/>
+          <w:b/>
+          <w:bCs/>
+          <w:sz w:val="21"/>
+          <w:szCs w:val="21"/>
+        </w:rPr>
+        <w:t xml:space="preserve">Capítulo 3 — Estado del Arte	22</w:t>
+      </w:r>
+    </w:p>
+    <w:p>
+      <w:pPr>
+        <w:tabs>
+          <w:tab w:val="right" w:pos="9000" w:leader="dot"/>
+        </w:tabs>
+        <w:spacing w:after="20" w:line="240"/>
+        <w:ind w:left="280"/>
+      </w:pPr>
+      <w:r>
+        <w:rPr>
+          <w:rFonts w:ascii="Times New Roman" w:cs="Times New Roman" w:eastAsia="Times New Roman" w:hAnsi="Times New Roman"/>
+          <w:b w:val="false"/>
+          <w:bCs w:val="false"/>
+          <w:sz w:val="20"/>
+          <w:szCs w:val="20"/>
+        </w:rPr>
+        <w:t xml:space="preserve">3.1 Alcance y criterio de la revisión	22</w:t>
+      </w:r>
+    </w:p>
+    <w:p>
+      <w:pPr>
+        <w:tabs>
+          <w:tab w:val="right" w:pos="9000" w:leader="dot"/>
+        </w:tabs>
+        <w:spacing w:after="20" w:line="240"/>
+        <w:ind w:left="280"/>
+      </w:pPr>
+      <w:r>
+        <w:rPr>
+          <w:rFonts w:ascii="Times New Roman" w:cs="Times New Roman" w:eastAsia="Times New Roman" w:hAnsi="Times New Roman"/>
+          <w:b w:val="false"/>
+          <w:bCs w:val="false"/>
+          <w:sz w:val="20"/>
+          <w:szCs w:val="20"/>
+        </w:rPr>
+        <w:t xml:space="preserve">3.2 Automatización de la elicitación y el modelado en IR	22</w:t>
+      </w:r>
+    </w:p>
+    <w:p>
+      <w:pPr>
+        <w:tabs>
+          <w:tab w:val="right" w:pos="9000" w:leader="dot"/>
+        </w:tabs>
+        <w:spacing w:after="20" w:line="240"/>
+        <w:ind w:left="280"/>
+      </w:pPr>
+      <w:r>
+        <w:rPr>
+          <w:rFonts w:ascii="Times New Roman" w:cs="Times New Roman" w:eastAsia="Times New Roman" w:hAnsi="Times New Roman"/>
+          <w:b w:val="false"/>
+          <w:bCs w:val="false"/>
+          <w:sz w:val="20"/>
+          <w:szCs w:val="20"/>
+        </w:rPr>
+        <w:t xml:space="preserve">3.3 Construcción (semi)automática de glosarios y del LEL con PLN tradicional	22</w:t>
+      </w:r>
+    </w:p>
+    <w:p>
+      <w:pPr>
+        <w:tabs>
+          <w:tab w:val="right" w:pos="9000" w:leader="dot"/>
+        </w:tabs>
+        <w:spacing w:after="20" w:line="240"/>
+        <w:ind w:left="280"/>
+      </w:pPr>
+      <w:r>
+        <w:rPr>
+          <w:rFonts w:ascii="Times New Roman" w:cs="Times New Roman" w:eastAsia="Times New Roman" w:hAnsi="Times New Roman"/>
+          <w:b w:val="false"/>
+          <w:bCs w:val="false"/>
+          <w:sz w:val="20"/>
+          <w:szCs w:val="20"/>
+        </w:rPr>
+        <w:t xml:space="preserve">3.4 Grandes Modelos de Lenguaje aplicados a la IR	23</w:t>
+      </w:r>
+    </w:p>
+    <w:p>
+      <w:pPr>
+        <w:tabs>
+          <w:tab w:val="right" w:pos="9000" w:leader="dot"/>
+        </w:tabs>
+        <w:spacing w:after="20" w:line="240"/>
+        <w:ind w:left="280"/>
+      </w:pPr>
+      <w:r>
+        <w:rPr>
+          <w:rFonts w:ascii="Times New Roman" w:cs="Times New Roman" w:eastAsia="Times New Roman" w:hAnsi="Times New Roman"/>
+          <w:b w:val="false"/>
+          <w:bCs w:val="false"/>
+          <w:sz w:val="20"/>
+          <w:szCs w:val="20"/>
+        </w:rPr>
+        <w:t xml:space="preserve">3.5 Entrevistas de elicitación asistidas por LLM	23</w:t>
+      </w:r>
+    </w:p>
+    <w:p>
+      <w:pPr>
+        <w:tabs>
+          <w:tab w:val="right" w:pos="9000" w:leader="dot"/>
+        </w:tabs>
+        <w:spacing w:after="20" w:line="240"/>
+        <w:ind w:left="280"/>
+      </w:pPr>
+      <w:r>
+        <w:rPr>
+          <w:rFonts w:ascii="Times New Roman" w:cs="Times New Roman" w:eastAsia="Times New Roman" w:hAnsi="Times New Roman"/>
+          <w:b w:val="false"/>
+          <w:bCs w:val="false"/>
+          <w:sz w:val="20"/>
+          <w:szCs w:val="20"/>
+        </w:rPr>
+        <w:t xml:space="preserve">3.6 Síntesis comparativa	24</w:t>
+      </w:r>
+    </w:p>
+    <w:p>
+      <w:pPr>
+        <w:tabs>
+          <w:tab w:val="right" w:pos="9000" w:leader="dot"/>
+        </w:tabs>
+        <w:spacing w:after="20" w:line="240"/>
+        <w:ind w:left="280"/>
+      </w:pPr>
+      <w:r>
+        <w:rPr>
+          <w:rFonts w:ascii="Times New Roman" w:cs="Times New Roman" w:eastAsia="Times New Roman" w:hAnsi="Times New Roman"/>
+          <w:b w:val="false"/>
+          <w:bCs w:val="false"/>
+          <w:sz w:val="20"/>
+          <w:szCs w:val="20"/>
+        </w:rPr>
+        <w:t xml:space="preserve">3.7 Brecha identificada y posicionamiento	24</w:t>
+      </w:r>
+    </w:p>
+    <w:p>
+      <w:pPr>
+        <w:tabs>
+          <w:tab w:val="right" w:pos="9000" w:leader="dot"/>
+        </w:tabs>
+        <w:spacing w:after="60" w:line="240"/>
+        <w:ind w:left="0"/>
+      </w:pPr>
+      <w:r>
+        <w:rPr>
+          <w:rFonts w:ascii="Times New Roman" w:cs="Times New Roman" w:eastAsia="Times New Roman" w:hAnsi="Times New Roman"/>
+          <w:b/>
+          <w:bCs/>
+          <w:sz w:val="21"/>
+          <w:szCs w:val="21"/>
+        </w:rPr>
+        <w:t xml:space="preserve">Capítulo 4 — Metodología y Diseño Experimental	26</w:t>
+      </w:r>
+    </w:p>
+    <w:p>
+      <w:pPr>
+        <w:tabs>
+          <w:tab w:val="right" w:pos="9000" w:leader="dot"/>
+        </w:tabs>
+        <w:spacing w:after="20" w:line="240"/>
+        <w:ind w:left="280"/>
+      </w:pPr>
+      <w:r>
+        <w:rPr>
+          <w:rFonts w:ascii="Times New Roman" w:cs="Times New Roman" w:eastAsia="Times New Roman" w:hAnsi="Times New Roman"/>
+          <w:b w:val="false"/>
+          <w:bCs w:val="false"/>
+          <w:sz w:val="20"/>
+          <w:szCs w:val="20"/>
+        </w:rPr>
+        <w:t xml:space="preserve">4.1 Encuadre metodológico	26</w:t>
+      </w:r>
+    </w:p>
+    <w:p>
+      <w:pPr>
+        <w:tabs>
+          <w:tab w:val="right" w:pos="9000" w:leader="dot"/>
+        </w:tabs>
+        <w:spacing w:after="20" w:line="240"/>
+        <w:ind w:left="280"/>
+      </w:pPr>
+      <w:r>
+        <w:rPr>
+          <w:rFonts w:ascii="Times New Roman" w:cs="Times New Roman" w:eastAsia="Times New Roman" w:hAnsi="Times New Roman"/>
+          <w:b w:val="false"/>
+          <w:bCs w:val="false"/>
+          <w:sz w:val="20"/>
+          <w:szCs w:val="20"/>
+        </w:rPr>
+        <w:t xml:space="preserve">4.2 Preguntas de investigación e hipótesis	26</w:t>
+      </w:r>
+    </w:p>
+    <w:p>
+      <w:pPr>
+        <w:tabs>
+          <w:tab w:val="right" w:pos="9000" w:leader="dot"/>
+        </w:tabs>
+        <w:spacing w:after="20" w:line="240"/>
+        <w:ind w:left="280"/>
+      </w:pPr>
+      <w:r>
+        <w:rPr>
+          <w:rFonts w:ascii="Times New Roman" w:cs="Times New Roman" w:eastAsia="Times New Roman" w:hAnsi="Times New Roman"/>
+          <w:b w:val="false"/>
+          <w:bCs w:val="false"/>
+          <w:sz w:val="20"/>
+          <w:szCs w:val="20"/>
+        </w:rPr>
+        <w:t xml:space="preserve">4.3 Variables del experimento	26</w:t>
+      </w:r>
+    </w:p>
+    <w:p>
+      <w:pPr>
+        <w:tabs>
+          <w:tab w:val="right" w:pos="9000" w:leader="dot"/>
+        </w:tabs>
+        <w:spacing w:after="20" w:line="240"/>
+        <w:ind w:left="280"/>
+      </w:pPr>
+      <w:r>
+        <w:rPr>
+          <w:rFonts w:ascii="Times New Roman" w:cs="Times New Roman" w:eastAsia="Times New Roman" w:hAnsi="Times New Roman"/>
+          <w:b w:val="false"/>
+          <w:bCs w:val="false"/>
+          <w:sz w:val="20"/>
+          <w:szCs w:val="20"/>
+        </w:rPr>
+        <w:t xml:space="preserve">4.4 Objeto de estudio: el caso ecoFactory	26</w:t>
+      </w:r>
+    </w:p>
+    <w:p>
+      <w:pPr>
+        <w:tabs>
+          <w:tab w:val="right" w:pos="9000" w:leader="dot"/>
+        </w:tabs>
+        <w:spacing w:after="20" w:line="240"/>
+        <w:ind w:left="280"/>
+      </w:pPr>
+      <w:r>
+        <w:rPr>
+          <w:rFonts w:ascii="Times New Roman" w:cs="Times New Roman" w:eastAsia="Times New Roman" w:hAnsi="Times New Roman"/>
+          <w:b w:val="false"/>
+          <w:bCs w:val="false"/>
+          <w:sz w:val="20"/>
+          <w:szCs w:val="20"/>
+        </w:rPr>
+        <w:t xml:space="preserve">4.5 Corpus de entrada	26</w:t>
+      </w:r>
+    </w:p>
+    <w:p>
+      <w:pPr>
+        <w:tabs>
+          <w:tab w:val="right" w:pos="9000" w:leader="dot"/>
+        </w:tabs>
+        <w:spacing w:after="20" w:line="240"/>
+        <w:ind w:left="280"/>
+      </w:pPr>
+      <w:r>
+        <w:rPr>
+          <w:rFonts w:ascii="Times New Roman" w:cs="Times New Roman" w:eastAsia="Times New Roman" w:hAnsi="Times New Roman"/>
+          <w:b w:val="false"/>
+          <w:bCs w:val="false"/>
+          <w:sz w:val="20"/>
+          <w:szCs w:val="20"/>
+        </w:rPr>
+        <w:t xml:space="preserve">4.6 Gold Standard de referencia	27</w:t>
+      </w:r>
+    </w:p>
+    <w:p>
+      <w:pPr>
+        <w:tabs>
+          <w:tab w:val="right" w:pos="9000" w:leader="dot"/>
+        </w:tabs>
+        <w:spacing w:after="20" w:line="240"/>
+        <w:ind w:left="280"/>
+      </w:pPr>
+      <w:r>
+        <w:rPr>
+          <w:rFonts w:ascii="Times New Roman" w:cs="Times New Roman" w:eastAsia="Times New Roman" w:hAnsi="Times New Roman"/>
+          <w:b w:val="false"/>
+          <w:bCs w:val="false"/>
+          <w:sz w:val="20"/>
+          <w:szCs w:val="20"/>
+        </w:rPr>
+        <w:t xml:space="preserve">4.7 Tratamientos comparados	27</w:t>
+      </w:r>
+    </w:p>
+    <w:p>
+      <w:pPr>
+        <w:tabs>
+          <w:tab w:val="right" w:pos="9000" w:leader="dot"/>
+        </w:tabs>
+        <w:spacing w:after="20" w:line="240"/>
+        <w:ind w:left="280"/>
+      </w:pPr>
+      <w:r>
+        <w:rPr>
+          <w:rFonts w:ascii="Times New Roman" w:cs="Times New Roman" w:eastAsia="Times New Roman" w:hAnsi="Times New Roman"/>
+          <w:b w:val="false"/>
+          <w:bCs w:val="false"/>
+          <w:sz w:val="20"/>
+          <w:szCs w:val="20"/>
+        </w:rPr>
+        <w:t xml:space="preserve">4.8 Procedimiento experimental	28</w:t>
+      </w:r>
+    </w:p>
+    <w:p>
+      <w:pPr>
+        <w:tabs>
+          <w:tab w:val="right" w:pos="9000" w:leader="dot"/>
+        </w:tabs>
+        <w:spacing w:after="20" w:line="240"/>
+        <w:ind w:left="280"/>
+      </w:pPr>
+      <w:r>
+        <w:rPr>
+          <w:rFonts w:ascii="Times New Roman" w:cs="Times New Roman" w:eastAsia="Times New Roman" w:hAnsi="Times New Roman"/>
+          <w:b w:val="false"/>
+          <w:bCs w:val="false"/>
+          <w:sz w:val="20"/>
+          <w:szCs w:val="20"/>
+        </w:rPr>
+        <w:t xml:space="preserve">4.9 Métricas	29</w:t>
+      </w:r>
+    </w:p>
+    <w:p>
+      <w:pPr>
+        <w:tabs>
+          <w:tab w:val="right" w:pos="9000" w:leader="dot"/>
+        </w:tabs>
+        <w:spacing w:after="20" w:line="240"/>
+        <w:ind w:left="280"/>
+      </w:pPr>
+      <w:r>
+        <w:rPr>
+          <w:rFonts w:ascii="Times New Roman" w:cs="Times New Roman" w:eastAsia="Times New Roman" w:hAnsi="Times New Roman"/>
+          <w:b w:val="false"/>
+          <w:bCs w:val="false"/>
+          <w:sz w:val="20"/>
+          <w:szCs w:val="20"/>
+        </w:rPr>
+        <w:t xml:space="preserve">4.10 Protocolo de emparejamiento	29</w:t>
+      </w:r>
+    </w:p>
+    <w:p>
+      <w:pPr>
+        <w:tabs>
+          <w:tab w:val="right" w:pos="9000" w:leader="dot"/>
+        </w:tabs>
+        <w:spacing w:after="20" w:line="240"/>
+        <w:ind w:left="280"/>
+      </w:pPr>
+      <w:r>
+        <w:rPr>
+          <w:rFonts w:ascii="Times New Roman" w:cs="Times New Roman" w:eastAsia="Times New Roman" w:hAnsi="Times New Roman"/>
+          <w:b w:val="false"/>
+          <w:bCs w:val="false"/>
+          <w:sz w:val="20"/>
+          <w:szCs w:val="20"/>
+        </w:rPr>
+        <w:t xml:space="preserve">4.11 Análisis cualitativo	29</w:t>
+      </w:r>
+    </w:p>
+    <w:p>
+      <w:pPr>
+        <w:tabs>
+          <w:tab w:val="right" w:pos="9000" w:leader="dot"/>
+        </w:tabs>
+        <w:spacing w:after="20" w:line="240"/>
+        <w:ind w:left="280"/>
+      </w:pPr>
+      <w:r>
+        <w:rPr>
+          <w:rFonts w:ascii="Times New Roman" w:cs="Times New Roman" w:eastAsia="Times New Roman" w:hAnsi="Times New Roman"/>
+          <w:b w:val="false"/>
+          <w:bCs w:val="false"/>
+          <w:sz w:val="20"/>
+          <w:szCs w:val="20"/>
+        </w:rPr>
+        <w:t xml:space="preserve">4.12 Amenazas a la validez	29</w:t>
+      </w:r>
+    </w:p>
+    <w:p>
+      <w:pPr>
+        <w:tabs>
+          <w:tab w:val="right" w:pos="9000" w:leader="dot"/>
+        </w:tabs>
+        <w:spacing w:after="20" w:line="240"/>
+        <w:ind w:left="280"/>
+      </w:pPr>
+      <w:r>
+        <w:rPr>
+          <w:rFonts w:ascii="Times New Roman" w:cs="Times New Roman" w:eastAsia="Times New Roman" w:hAnsi="Times New Roman"/>
+          <w:b w:val="false"/>
+          <w:bCs w:val="false"/>
+          <w:sz w:val="20"/>
+          <w:szCs w:val="20"/>
+        </w:rPr>
+        <w:t xml:space="preserve">4.13 Reproducibilidad	30</w:t>
+      </w:r>
+    </w:p>
+    <w:p>
+      <w:pPr>
+        <w:tabs>
+          <w:tab w:val="right" w:pos="9000" w:leader="dot"/>
+        </w:tabs>
+        <w:spacing w:after="60" w:line="240"/>
+        <w:ind w:left="0"/>
+      </w:pPr>
+      <w:r>
+        <w:rPr>
+          <w:rFonts w:ascii="Times New Roman" w:cs="Times New Roman" w:eastAsia="Times New Roman" w:hAnsi="Times New Roman"/>
+          <w:b/>
+          <w:bCs/>
+          <w:sz w:val="21"/>
+          <w:szCs w:val="21"/>
+        </w:rPr>
+        <w:t xml:space="preserve">Capítulo 5 — Aplicación del Prototipo al Caso de Estudio ecoFactory	31</w:t>
+      </w:r>
+    </w:p>
+    <w:p>
+      <w:pPr>
+        <w:tabs>
+          <w:tab w:val="right" w:pos="9000" w:leader="dot"/>
+        </w:tabs>
+        <w:spacing w:after="20" w:line="240"/>
+        <w:ind w:left="280"/>
+      </w:pPr>
+      <w:r>
+        <w:rPr>
+          <w:rFonts w:ascii="Times New Roman" w:cs="Times New Roman" w:eastAsia="Times New Roman" w:hAnsi="Times New Roman"/>
+          <w:b w:val="false"/>
+          <w:bCs w:val="false"/>
+          <w:sz w:val="20"/>
+          <w:szCs w:val="20"/>
+        </w:rPr>
+        <w:t xml:space="preserve">5.1 Presentación del caso	31</w:t>
+      </w:r>
+    </w:p>
+    <w:p>
+      <w:pPr>
+        <w:tabs>
+          <w:tab w:val="right" w:pos="9000" w:leader="dot"/>
+        </w:tabs>
+        <w:spacing w:after="20" w:line="240"/>
+        <w:ind w:left="280"/>
+      </w:pPr>
+      <w:r>
+        <w:rPr>
+          <w:rFonts w:ascii="Times New Roman" w:cs="Times New Roman" w:eastAsia="Times New Roman" w:hAnsi="Times New Roman"/>
+          <w:b w:val="false"/>
+          <w:bCs w:val="false"/>
+          <w:sz w:val="20"/>
+          <w:szCs w:val="20"/>
+        </w:rPr>
+        <w:t xml:space="preserve">5.2 Actores del dominio	31</w:t>
+      </w:r>
+    </w:p>
+    <w:p>
+      <w:pPr>
+        <w:tabs>
+          <w:tab w:val="right" w:pos="9000" w:leader="dot"/>
+        </w:tabs>
+        <w:spacing w:after="20" w:line="240"/>
+        <w:ind w:left="280"/>
+      </w:pPr>
+      <w:r>
+        <w:rPr>
+          <w:rFonts w:ascii="Times New Roman" w:cs="Times New Roman" w:eastAsia="Times New Roman" w:hAnsi="Times New Roman"/>
+          <w:b w:val="false"/>
+          <w:bCs w:val="false"/>
+          <w:sz w:val="20"/>
+          <w:szCs w:val="20"/>
+        </w:rPr>
+        <w:t xml:space="preserve">5.3 El circuito del pedido	32</w:t>
+      </w:r>
+    </w:p>
+    <w:p>
+      <w:pPr>
+        <w:tabs>
+          <w:tab w:val="right" w:pos="9000" w:leader="dot"/>
+        </w:tabs>
+        <w:spacing w:after="20" w:line="240"/>
+        <w:ind w:left="280"/>
+      </w:pPr>
+      <w:r>
+        <w:rPr>
+          <w:rFonts w:ascii="Times New Roman" w:cs="Times New Roman" w:eastAsia="Times New Roman" w:hAnsi="Times New Roman"/>
+          <w:b w:val="false"/>
+          <w:bCs w:val="false"/>
+          <w:sz w:val="20"/>
+          <w:szCs w:val="20"/>
+        </w:rPr>
+        <w:t xml:space="preserve">5.4 La elicitación: las entrevistas	33</w:t>
+      </w:r>
+    </w:p>
+    <w:p>
+      <w:pPr>
+        <w:tabs>
+          <w:tab w:val="right" w:pos="9000" w:leader="dot"/>
+        </w:tabs>
+        <w:spacing w:after="20" w:line="240"/>
+        <w:ind w:left="280"/>
+      </w:pPr>
+      <w:r>
+        <w:rPr>
+          <w:rFonts w:ascii="Times New Roman" w:cs="Times New Roman" w:eastAsia="Times New Roman" w:hAnsi="Times New Roman"/>
+          <w:b w:val="false"/>
+          <w:bCs w:val="false"/>
+          <w:sz w:val="20"/>
+          <w:szCs w:val="20"/>
+        </w:rPr>
+        <w:t xml:space="preserve">5.5 Construcción del LEL de referencia	33</w:t>
+      </w:r>
+    </w:p>
+    <w:p>
+      <w:pPr>
+        <w:tabs>
+          <w:tab w:val="right" w:pos="9000" w:leader="dot"/>
+        </w:tabs>
+        <w:spacing w:after="20" w:line="240"/>
+        <w:ind w:left="280"/>
+      </w:pPr>
+      <w:r>
+        <w:rPr>
+          <w:rFonts w:ascii="Times New Roman" w:cs="Times New Roman" w:eastAsia="Times New Roman" w:hAnsi="Times New Roman"/>
+          <w:b w:val="false"/>
+          <w:bCs w:val="false"/>
+          <w:sz w:val="20"/>
+          <w:szCs w:val="20"/>
+        </w:rPr>
+        <w:t xml:space="preserve">5.6 El Gold Standard	33</w:t>
+      </w:r>
+    </w:p>
+    <w:p>
+      <w:pPr>
+        <w:tabs>
+          <w:tab w:val="right" w:pos="9000" w:leader="dot"/>
+        </w:tabs>
+        <w:spacing w:after="20" w:line="240"/>
+        <w:ind w:left="280"/>
+      </w:pPr>
+      <w:r>
+        <w:rPr>
+          <w:rFonts w:ascii="Times New Roman" w:cs="Times New Roman" w:eastAsia="Times New Roman" w:hAnsi="Times New Roman"/>
+          <w:b w:val="false"/>
+          <w:bCs w:val="false"/>
+          <w:sz w:val="20"/>
+          <w:szCs w:val="20"/>
+        </w:rPr>
+        <w:t xml:space="preserve">5.7 El GS-Corpus y la brecha de recuperabilidad	34</w:t>
+      </w:r>
+    </w:p>
+    <w:p>
+      <w:pPr>
+        <w:tabs>
+          <w:tab w:val="right" w:pos="9000" w:leader="dot"/>
+        </w:tabs>
+        <w:spacing w:after="20" w:line="240"/>
+        <w:ind w:left="280"/>
+      </w:pPr>
+      <w:r>
+        <w:rPr>
+          <w:rFonts w:ascii="Times New Roman" w:cs="Times New Roman" w:eastAsia="Times New Roman" w:hAnsi="Times New Roman"/>
+          <w:b w:val="false"/>
+          <w:bCs w:val="false"/>
+          <w:sz w:val="20"/>
+          <w:szCs w:val="20"/>
+        </w:rPr>
+        <w:t xml:space="preserve">5.8 Hallazgos del caso	35</w:t>
+      </w:r>
+    </w:p>
+    <w:p>
+      <w:pPr>
+        <w:tabs>
+          <w:tab w:val="right" w:pos="9000" w:leader="dot"/>
+        </w:tabs>
+        <w:spacing w:after="60" w:line="240"/>
+        <w:ind w:left="0"/>
+      </w:pPr>
+      <w:r>
+        <w:rPr>
+          <w:rFonts w:ascii="Times New Roman" w:cs="Times New Roman" w:eastAsia="Times New Roman" w:hAnsi="Times New Roman"/>
+          <w:b/>
+          <w:bCs/>
+          <w:sz w:val="21"/>
+          <w:szCs w:val="21"/>
+        </w:rPr>
+        <w:t xml:space="preserve">Capítulo 6 — Diseño e Implementación del Prototipo	36</w:t>
+      </w:r>
+    </w:p>
+    <w:p>
+      <w:pPr>
+        <w:tabs>
+          <w:tab w:val="right" w:pos="9000" w:leader="dot"/>
+        </w:tabs>
+        <w:spacing w:after="20" w:line="240"/>
+        <w:ind w:left="280"/>
+      </w:pPr>
+      <w:r>
+        <w:rPr>
+          <w:rFonts w:ascii="Times New Roman" w:cs="Times New Roman" w:eastAsia="Times New Roman" w:hAnsi="Times New Roman"/>
+          <w:b w:val="false"/>
+          <w:bCs w:val="false"/>
+          <w:sz w:val="20"/>
+          <w:szCs w:val="20"/>
+        </w:rPr>
+        <w:t xml:space="preserve">6.1 Visión general de la arquitectura	36</w:t>
+      </w:r>
+    </w:p>
+    <w:p>
+      <w:pPr>
+        <w:tabs>
+          <w:tab w:val="right" w:pos="9000" w:leader="dot"/>
+        </w:tabs>
+        <w:spacing w:after="20" w:line="240"/>
+        <w:ind w:left="280"/>
+      </w:pPr>
+      <w:r>
+        <w:rPr>
+          <w:rFonts w:ascii="Times New Roman" w:cs="Times New Roman" w:eastAsia="Times New Roman" w:hAnsi="Times New Roman"/>
+          <w:b w:val="false"/>
+          <w:bCs w:val="false"/>
+          <w:sz w:val="20"/>
+          <w:szCs w:val="20"/>
+        </w:rPr>
+        <w:t xml:space="preserve">6.2 Estructura del proyecto y decisiones tecnológicas	36</w:t>
+      </w:r>
+    </w:p>
+    <w:p>
+      <w:pPr>
+        <w:tabs>
+          <w:tab w:val="right" w:pos="9000" w:leader="dot"/>
+        </w:tabs>
+        <w:spacing w:after="20" w:line="240"/>
+        <w:ind w:left="280"/>
+      </w:pPr>
+      <w:r>
+        <w:rPr>
+          <w:rFonts w:ascii="Times New Roman" w:cs="Times New Roman" w:eastAsia="Times New Roman" w:hAnsi="Times New Roman"/>
+          <w:b w:val="false"/>
+          <w:bCs w:val="false"/>
+          <w:sz w:val="20"/>
+          <w:szCs w:val="20"/>
+        </w:rPr>
+        <w:t xml:space="preserve">6.3 Representación del LEL: el esquema de datos	37</w:t>
+      </w:r>
+    </w:p>
+    <w:p>
+      <w:pPr>
+        <w:tabs>
+          <w:tab w:val="right" w:pos="9000" w:leader="dot"/>
+        </w:tabs>
+        <w:spacing w:after="20" w:line="240"/>
+        <w:ind w:left="280"/>
+      </w:pPr>
+      <w:r>
+        <w:rPr>
+          <w:rFonts w:ascii="Times New Roman" w:cs="Times New Roman" w:eastAsia="Times New Roman" w:hAnsi="Times New Roman"/>
+          <w:b w:val="false"/>
+          <w:bCs w:val="false"/>
+          <w:sz w:val="20"/>
+          <w:szCs w:val="20"/>
+        </w:rPr>
+        <w:t xml:space="preserve">6.4 El pipeline basado en LLM	37</w:t>
+      </w:r>
+    </w:p>
+    <w:p>
+      <w:pPr>
+        <w:tabs>
+          <w:tab w:val="right" w:pos="9000" w:leader="dot"/>
+        </w:tabs>
+        <w:spacing w:after="20" w:line="240"/>
+        <w:ind w:left="560"/>
+      </w:pPr>
+      <w:r>
+        <w:rPr>
+          <w:rFonts w:ascii="Times New Roman" w:cs="Times New Roman" w:eastAsia="Times New Roman" w:hAnsi="Times New Roman"/>
+          <w:b w:val="false"/>
+          <w:bCs w:val="false"/>
+          <w:sz w:val="20"/>
+          <w:szCs w:val="20"/>
+        </w:rPr>
+        <w:t xml:space="preserve">6.4.1 Extracción de símbolos	37</w:t>
+      </w:r>
+    </w:p>
+    <w:p>
+      <w:pPr>
+        <w:tabs>
+          <w:tab w:val="right" w:pos="9000" w:leader="dot"/>
+        </w:tabs>
+        <w:spacing w:after="20" w:line="240"/>
+        <w:ind w:left="560"/>
+      </w:pPr>
+      <w:r>
+        <w:rPr>
+          <w:rFonts w:ascii="Times New Roman" w:cs="Times New Roman" w:eastAsia="Times New Roman" w:hAnsi="Times New Roman"/>
+          <w:b w:val="false"/>
+          <w:bCs w:val="false"/>
+          <w:sz w:val="20"/>
+          <w:szCs w:val="20"/>
+        </w:rPr>
+        <w:t xml:space="preserve">6.4.2 Clasificación por tipo	38</w:t>
+      </w:r>
+    </w:p>
+    <w:p>
+      <w:pPr>
+        <w:tabs>
+          <w:tab w:val="right" w:pos="9000" w:leader="dot"/>
+        </w:tabs>
+        <w:spacing w:after="20" w:line="240"/>
+        <w:ind w:left="560"/>
+      </w:pPr>
+      <w:r>
+        <w:rPr>
+          <w:rFonts w:ascii="Times New Roman" w:cs="Times New Roman" w:eastAsia="Times New Roman" w:hAnsi="Times New Roman"/>
+          <w:b w:val="false"/>
+          <w:bCs w:val="false"/>
+          <w:sz w:val="20"/>
+          <w:szCs w:val="20"/>
+        </w:rPr>
+        <w:t xml:space="preserve">6.4.3 Descripción de noción e impacto	38</w:t>
+      </w:r>
+    </w:p>
+    <w:p>
+      <w:pPr>
+        <w:tabs>
+          <w:tab w:val="right" w:pos="9000" w:leader="dot"/>
+        </w:tabs>
+        <w:spacing w:after="20" w:line="240"/>
+        <w:ind w:left="560"/>
+      </w:pPr>
+      <w:r>
+        <w:rPr>
+          <w:rFonts w:ascii="Times New Roman" w:cs="Times New Roman" w:eastAsia="Times New Roman" w:hAnsi="Times New Roman"/>
+          <w:b w:val="false"/>
+          <w:bCs w:val="false"/>
+          <w:sz w:val="20"/>
+          <w:szCs w:val="20"/>
+        </w:rPr>
+        <w:t xml:space="preserve">6.4.4 Auto-verificación	38</w:t>
+      </w:r>
+    </w:p>
+    <w:p>
+      <w:pPr>
+        <w:tabs>
+          <w:tab w:val="right" w:pos="9000" w:leader="dot"/>
+        </w:tabs>
+        <w:spacing w:after="20" w:line="240"/>
+        <w:ind w:left="560"/>
+      </w:pPr>
+      <w:r>
+        <w:rPr>
+          <w:rFonts w:ascii="Times New Roman" w:cs="Times New Roman" w:eastAsia="Times New Roman" w:hAnsi="Times New Roman"/>
+          <w:b w:val="false"/>
+          <w:bCs w:val="false"/>
+          <w:sz w:val="20"/>
+          <w:szCs w:val="20"/>
+        </w:rPr>
+        <w:t xml:space="preserve">6.4.5 Orquestación y configuraciones experimentales	39</w:t>
+      </w:r>
+    </w:p>
+    <w:p>
+      <w:pPr>
+        <w:tabs>
+          <w:tab w:val="right" w:pos="9000" w:leader="dot"/>
+        </w:tabs>
+        <w:spacing w:after="20" w:line="240"/>
+        <w:ind w:left="280"/>
+      </w:pPr>
+      <w:r>
+        <w:rPr>
+          <w:rFonts w:ascii="Times New Roman" w:cs="Times New Roman" w:eastAsia="Times New Roman" w:hAnsi="Times New Roman"/>
+          <w:b w:val="false"/>
+          <w:bCs w:val="false"/>
+          <w:sz w:val="20"/>
+          <w:szCs w:val="20"/>
+        </w:rPr>
+        <w:t xml:space="preserve">6.5 Abstracción de proveedor de LLM	39</w:t>
+      </w:r>
+    </w:p>
+    <w:p>
+      <w:pPr>
+        <w:tabs>
+          <w:tab w:val="right" w:pos="9000" w:leader="dot"/>
+        </w:tabs>
+        <w:spacing w:after="20" w:line="240"/>
+        <w:ind w:left="280"/>
+      </w:pPr>
+      <w:r>
+        <w:rPr>
+          <w:rFonts w:ascii="Times New Roman" w:cs="Times New Roman" w:eastAsia="Times New Roman" w:hAnsi="Times New Roman"/>
+          <w:b w:val="false"/>
+          <w:bCs w:val="false"/>
+          <w:sz w:val="20"/>
+          <w:szCs w:val="20"/>
+        </w:rPr>
+        <w:t xml:space="preserve">6.6 Baselines de PLN tradicional	39</w:t>
+      </w:r>
+    </w:p>
+    <w:p>
+      <w:pPr>
+        <w:tabs>
+          <w:tab w:val="right" w:pos="9000" w:leader="dot"/>
+        </w:tabs>
+        <w:spacing w:after="20" w:line="240"/>
+        <w:ind w:left="560"/>
+      </w:pPr>
+      <w:r>
+        <w:rPr>
+          <w:rFonts w:ascii="Times New Roman" w:cs="Times New Roman" w:eastAsia="Times New Roman" w:hAnsi="Times New Roman"/>
+          <w:b w:val="false"/>
+          <w:bCs w:val="false"/>
+          <w:sz w:val="20"/>
+          <w:szCs w:val="20"/>
+        </w:rPr>
+        <w:t xml:space="preserve">6.6.1 Baseline de frecuencia / Pareto	40</w:t>
+      </w:r>
+    </w:p>
+    <w:p>
+      <w:pPr>
+        <w:tabs>
+          <w:tab w:val="right" w:pos="9000" w:leader="dot"/>
+        </w:tabs>
+        <w:spacing w:after="20" w:line="240"/>
+        <w:ind w:left="560"/>
+      </w:pPr>
+      <w:r>
+        <w:rPr>
+          <w:rFonts w:ascii="Times New Roman" w:cs="Times New Roman" w:eastAsia="Times New Roman" w:hAnsi="Times New Roman"/>
+          <w:b w:val="false"/>
+          <w:bCs w:val="false"/>
+          <w:sz w:val="20"/>
+          <w:szCs w:val="20"/>
+        </w:rPr>
+        <w:t xml:space="preserve">6.6.2 Baseline con spaCy	40</w:t>
+      </w:r>
+    </w:p>
+    <w:p>
+      <w:pPr>
+        <w:tabs>
+          <w:tab w:val="right" w:pos="9000" w:leader="dot"/>
+        </w:tabs>
+        <w:spacing w:after="20" w:line="240"/>
+        <w:ind w:left="280"/>
+      </w:pPr>
+      <w:r>
+        <w:rPr>
+          <w:rFonts w:ascii="Times New Roman" w:cs="Times New Roman" w:eastAsia="Times New Roman" w:hAnsi="Times New Roman"/>
+          <w:b w:val="false"/>
+          <w:bCs w:val="false"/>
+          <w:sz w:val="20"/>
+          <w:szCs w:val="20"/>
+        </w:rPr>
+        <w:t xml:space="preserve">6.7 El motor de evaluación	40</w:t>
+      </w:r>
+    </w:p>
+    <w:p>
+      <w:pPr>
+        <w:tabs>
+          <w:tab w:val="right" w:pos="9000" w:leader="dot"/>
+        </w:tabs>
+        <w:spacing w:after="20" w:line="240"/>
+        <w:ind w:left="280"/>
+      </w:pPr>
+      <w:r>
+        <w:rPr>
+          <w:rFonts w:ascii="Times New Roman" w:cs="Times New Roman" w:eastAsia="Times New Roman" w:hAnsi="Times New Roman"/>
+          <w:b w:val="false"/>
+          <w:bCs w:val="false"/>
+          <w:sz w:val="20"/>
+          <w:szCs w:val="20"/>
+        </w:rPr>
+        <w:t xml:space="preserve">6.8 Reproducibilidad y ejecución	41</w:t>
+      </w:r>
+    </w:p>
+    <w:p>
+      <w:pPr>
+        <w:tabs>
+          <w:tab w:val="right" w:pos="9000" w:leader="dot"/>
+        </w:tabs>
+        <w:spacing w:after="20" w:line="240"/>
+        <w:ind w:left="280"/>
+      </w:pPr>
+      <w:r>
+        <w:rPr>
+          <w:rFonts w:ascii="Times New Roman" w:cs="Times New Roman" w:eastAsia="Times New Roman" w:hAnsi="Times New Roman"/>
+          <w:b w:val="false"/>
+          <w:bCs w:val="false"/>
+          <w:sz w:val="20"/>
+          <w:szCs w:val="20"/>
+        </w:rPr>
+        <w:t xml:space="preserve">6.9 Comparación y justificación de las tecnologías	42</w:t>
+      </w:r>
+    </w:p>
+    <w:p>
+      <w:pPr>
+        <w:tabs>
+          <w:tab w:val="right" w:pos="9000" w:leader="dot"/>
+        </w:tabs>
+        <w:spacing w:after="20" w:line="240"/>
+        <w:ind w:left="280"/>
+      </w:pPr>
+      <w:r>
+        <w:rPr>
+          <w:rFonts w:ascii="Times New Roman" w:cs="Times New Roman" w:eastAsia="Times New Roman" w:hAnsi="Times New Roman"/>
+          <w:b w:val="false"/>
+          <w:bCs w:val="false"/>
+          <w:sz w:val="20"/>
+          <w:szCs w:val="20"/>
+        </w:rPr>
+        <w:t xml:space="preserve">6.10 Obtención del corpus: transcripción de entrevistas asistida por IA	43</w:t>
+      </w:r>
+    </w:p>
+    <w:p>
+      <w:pPr>
+        <w:tabs>
+          <w:tab w:val="right" w:pos="9000" w:leader="dot"/>
+        </w:tabs>
+        <w:spacing w:after="60" w:line="240"/>
+        <w:ind w:left="0"/>
+      </w:pPr>
+      <w:r>
+        <w:rPr>
+          <w:rFonts w:ascii="Times New Roman" w:cs="Times New Roman" w:eastAsia="Times New Roman" w:hAnsi="Times New Roman"/>
+          <w:b/>
+          <w:bCs/>
+          <w:sz w:val="21"/>
+          <w:szCs w:val="21"/>
+        </w:rPr>
+        <w:t xml:space="preserve">Capítulo 7 — Experimentación y Resultados	44</w:t>
+      </w:r>
+    </w:p>
+    <w:p>
+      <w:pPr>
+        <w:tabs>
+          <w:tab w:val="right" w:pos="9000" w:leader="dot"/>
+        </w:tabs>
+        <w:spacing w:after="20" w:line="240"/>
+        <w:ind w:left="280"/>
+      </w:pPr>
+      <w:r>
+        <w:rPr>
+          <w:rFonts w:ascii="Times New Roman" w:cs="Times New Roman" w:eastAsia="Times New Roman" w:hAnsi="Times New Roman"/>
+          <w:b w:val="false"/>
+          <w:bCs w:val="false"/>
+          <w:sz w:val="20"/>
+          <w:szCs w:val="20"/>
+        </w:rPr>
+        <w:t xml:space="preserve">7.1 Entorno experimental y alcance de la ejecución	44</w:t>
+      </w:r>
+    </w:p>
+    <w:p>
+      <w:pPr>
+        <w:tabs>
+          <w:tab w:val="right" w:pos="9000" w:leader="dot"/>
+        </w:tabs>
+        <w:spacing w:after="20" w:line="240"/>
+        <w:ind w:left="280"/>
+      </w:pPr>
+      <w:r>
+        <w:rPr>
+          <w:rFonts w:ascii="Times New Roman" w:cs="Times New Roman" w:eastAsia="Times New Roman" w:hAnsi="Times New Roman"/>
+          <w:b w:val="false"/>
+          <w:bCs w:val="false"/>
+          <w:sz w:val="20"/>
+          <w:szCs w:val="20"/>
+        </w:rPr>
+        <w:t xml:space="preserve">7.2 Datos de las entrevistas	44</w:t>
+      </w:r>
+    </w:p>
+    <w:p>
+      <w:pPr>
+        <w:tabs>
+          <w:tab w:val="right" w:pos="9000" w:leader="dot"/>
+        </w:tabs>
+        <w:spacing w:after="20" w:line="240"/>
+        <w:ind w:left="280"/>
+      </w:pPr>
+      <w:r>
+        <w:rPr>
+          <w:rFonts w:ascii="Times New Roman" w:cs="Times New Roman" w:eastAsia="Times New Roman" w:hAnsi="Times New Roman"/>
+          <w:b w:val="false"/>
+          <w:bCs w:val="false"/>
+          <w:sz w:val="20"/>
+          <w:szCs w:val="20"/>
+        </w:rPr>
+        <w:t xml:space="preserve">7.3 Resultados del baseline de frecuencia (C1a)	44</w:t>
+      </w:r>
+    </w:p>
+    <w:p>
+      <w:pPr>
+        <w:tabs>
+          <w:tab w:val="right" w:pos="9000" w:leader="dot"/>
+        </w:tabs>
+        <w:spacing w:after="20" w:line="240"/>
+        <w:ind w:left="280"/>
+      </w:pPr>
+      <w:r>
+        <w:rPr>
+          <w:rFonts w:ascii="Times New Roman" w:cs="Times New Roman" w:eastAsia="Times New Roman" w:hAnsi="Times New Roman"/>
+          <w:b w:val="false"/>
+          <w:bCs w:val="false"/>
+          <w:sz w:val="20"/>
+          <w:szCs w:val="20"/>
+        </w:rPr>
+        <w:t xml:space="preserve">7.4 Resultados del pipeline LLM	45</w:t>
+      </w:r>
+    </w:p>
+    <w:p>
+      <w:pPr>
+        <w:tabs>
+          <w:tab w:val="right" w:pos="9000" w:leader="dot"/>
+        </w:tabs>
+        <w:spacing w:after="20" w:line="240"/>
+        <w:ind w:left="560"/>
+      </w:pPr>
+      <w:r>
+        <w:rPr>
+          <w:rFonts w:ascii="Times New Roman" w:cs="Times New Roman" w:eastAsia="Times New Roman" w:hAnsi="Times New Roman"/>
+          <w:b w:val="false"/>
+          <w:bCs w:val="false"/>
+          <w:sz w:val="20"/>
+          <w:szCs w:val="20"/>
+        </w:rPr>
+        <w:t xml:space="preserve">7.4.1 Corrida de referencia	45</w:t>
+      </w:r>
+    </w:p>
+    <w:p>
+      <w:pPr>
+        <w:tabs>
+          <w:tab w:val="right" w:pos="9000" w:leader="dot"/>
+        </w:tabs>
+        <w:spacing w:after="20" w:line="240"/>
+        <w:ind w:left="560"/>
+      </w:pPr>
+      <w:r>
+        <w:rPr>
+          <w:rFonts w:ascii="Times New Roman" w:cs="Times New Roman" w:eastAsia="Times New Roman" w:hAnsi="Times New Roman"/>
+          <w:b w:val="false"/>
+          <w:bCs w:val="false"/>
+          <w:sz w:val="20"/>
+          <w:szCs w:val="20"/>
+        </w:rPr>
+        <w:t xml:space="preserve">7.4.2 Resultados	46</w:t>
+      </w:r>
+    </w:p>
+    <w:p>
+      <w:pPr>
+        <w:tabs>
+          <w:tab w:val="right" w:pos="9000" w:leader="dot"/>
+        </w:tabs>
+        <w:spacing w:after="20" w:line="240"/>
+        <w:ind w:left="560"/>
+      </w:pPr>
+      <w:r>
+        <w:rPr>
+          <w:rFonts w:ascii="Times New Roman" w:cs="Times New Roman" w:eastAsia="Times New Roman" w:hAnsi="Times New Roman"/>
+          <w:b w:val="false"/>
+          <w:bCs w:val="false"/>
+          <w:sz w:val="20"/>
+          <w:szCs w:val="20"/>
+        </w:rPr>
+        <w:t xml:space="preserve">7.4.3 Comparación con el PLN tradicional	46</w:t>
+      </w:r>
+    </w:p>
+    <w:p>
+      <w:pPr>
+        <w:tabs>
+          <w:tab w:val="right" w:pos="9000" w:leader="dot"/>
+        </w:tabs>
+        <w:spacing w:after="20" w:line="240"/>
+        <w:ind w:left="560"/>
+      </w:pPr>
+      <w:r>
+        <w:rPr>
+          <w:rFonts w:ascii="Times New Roman" w:cs="Times New Roman" w:eastAsia="Times New Roman" w:hAnsi="Times New Roman"/>
+          <w:b w:val="false"/>
+          <w:bCs w:val="false"/>
+          <w:sz w:val="20"/>
+          <w:szCs w:val="20"/>
+        </w:rPr>
+        <w:t xml:space="preserve">7.4.4 Ejemplos del LEL generado	47</w:t>
+      </w:r>
+    </w:p>
+    <w:p>
+      <w:pPr>
+        <w:tabs>
+          <w:tab w:val="right" w:pos="9000" w:leader="dot"/>
+        </w:tabs>
+        <w:spacing w:after="20" w:line="240"/>
+        <w:ind w:left="280"/>
+      </w:pPr>
+      <w:r>
+        <w:rPr>
+          <w:rFonts w:ascii="Times New Roman" w:cs="Times New Roman" w:eastAsia="Times New Roman" w:hAnsi="Times New Roman"/>
+          <w:b w:val="false"/>
+          <w:bCs w:val="false"/>
+          <w:sz w:val="20"/>
+          <w:szCs w:val="20"/>
+        </w:rPr>
+        <w:t xml:space="preserve">7.5 Síntesis de resultados obtenidos	47</w:t>
+      </w:r>
+    </w:p>
+    <w:p>
+      <w:pPr>
+        <w:tabs>
+          <w:tab w:val="right" w:pos="9000" w:leader="dot"/>
+        </w:tabs>
+        <w:spacing w:after="20" w:line="240"/>
+        <w:ind w:left="280"/>
+      </w:pPr>
+      <w:r>
+        <w:rPr>
+          <w:rFonts w:ascii="Times New Roman" w:cs="Times New Roman" w:eastAsia="Times New Roman" w:hAnsi="Times New Roman"/>
+          <w:b w:val="false"/>
+          <w:bCs w:val="false"/>
+          <w:sz w:val="20"/>
+          <w:szCs w:val="20"/>
+        </w:rPr>
+        <w:t xml:space="preserve">7.6 Caso de muestreo: robustez en un dominio nuevo	48</w:t>
+      </w:r>
+    </w:p>
+    <w:p>
+      <w:pPr>
+        <w:tabs>
+          <w:tab w:val="right" w:pos="9000" w:leader="dot"/>
+        </w:tabs>
+        <w:spacing w:after="20" w:line="240"/>
+        <w:ind w:left="280"/>
+      </w:pPr>
+      <w:r>
+        <w:rPr>
+          <w:rFonts w:ascii="Times New Roman" w:cs="Times New Roman" w:eastAsia="Times New Roman" w:hAnsi="Times New Roman"/>
+          <w:b w:val="false"/>
+          <w:bCs w:val="false"/>
+          <w:sz w:val="20"/>
+          <w:szCs w:val="20"/>
+        </w:rPr>
+        <w:t xml:space="preserve">7.7 Evidencia de ejecución del prototipo	49</w:t>
+      </w:r>
+    </w:p>
+    <w:p>
+      <w:pPr>
+        <w:tabs>
+          <w:tab w:val="right" w:pos="9000" w:leader="dot"/>
+        </w:tabs>
+        <w:spacing w:after="20" w:line="240"/>
+        <w:ind w:left="280"/>
+      </w:pPr>
+      <w:r>
+        <w:rPr>
+          <w:rFonts w:ascii="Times New Roman" w:cs="Times New Roman" w:eastAsia="Times New Roman" w:hAnsi="Times New Roman"/>
+          <w:b w:val="false"/>
+          <w:bCs w:val="false"/>
+          <w:sz w:val="20"/>
+          <w:szCs w:val="20"/>
+        </w:rPr>
+        <w:t xml:space="preserve">7.8 Evaluación en múltiples dominios de muestreo	50</w:t>
+      </w:r>
+    </w:p>
+    <w:p>
+      <w:pPr>
+        <w:tabs>
+          <w:tab w:val="right" w:pos="9000" w:leader="dot"/>
+        </w:tabs>
+        <w:spacing w:after="20" w:line="240"/>
+        <w:ind w:left="280"/>
+      </w:pPr>
+      <w:r>
+        <w:rPr>
+          <w:rFonts w:ascii="Times New Roman" w:cs="Times New Roman" w:eastAsia="Times New Roman" w:hAnsi="Times New Roman"/>
+          <w:b w:val="false"/>
+          <w:bCs w:val="false"/>
+          <w:sz w:val="20"/>
+          <w:szCs w:val="20"/>
+        </w:rPr>
+        <w:t xml:space="preserve">7.9 Estado de las corridas pendientes: C1b y la réplica ciega	51</w:t>
+      </w:r>
+    </w:p>
+    <w:p>
+      <w:pPr>
+        <w:tabs>
+          <w:tab w:val="right" w:pos="9000" w:leader="dot"/>
+        </w:tabs>
+        <w:spacing w:after="60" w:line="240"/>
+        <w:ind w:left="0"/>
+      </w:pPr>
+      <w:r>
+        <w:rPr>
+          <w:rFonts w:ascii="Times New Roman" w:cs="Times New Roman" w:eastAsia="Times New Roman" w:hAnsi="Times New Roman"/>
+          <w:b/>
+          <w:bCs/>
+          <w:sz w:val="21"/>
+          <w:szCs w:val="21"/>
+        </w:rPr>
+        <w:t xml:space="preserve">Capítulo 8 — Discusión	52</w:t>
+      </w:r>
+    </w:p>
+    <w:p>
+      <w:pPr>
+        <w:tabs>
+          <w:tab w:val="right" w:pos="9000" w:leader="dot"/>
+        </w:tabs>
+        <w:spacing w:after="20" w:line="240"/>
+        <w:ind w:left="280"/>
+      </w:pPr>
+      <w:r>
+        <w:rPr>
+          <w:rFonts w:ascii="Times New Roman" w:cs="Times New Roman" w:eastAsia="Times New Roman" w:hAnsi="Times New Roman"/>
+          <w:b w:val="false"/>
+          <w:bCs w:val="false"/>
+          <w:sz w:val="20"/>
+          <w:szCs w:val="20"/>
+        </w:rPr>
+        <w:t xml:space="preserve">8.1 El piso del PLN y la oportunidad del enfoque generativo	52</w:t>
+      </w:r>
+    </w:p>
+    <w:p>
+      <w:pPr>
+        <w:tabs>
+          <w:tab w:val="right" w:pos="9000" w:leader="dot"/>
+        </w:tabs>
+        <w:spacing w:after="20" w:line="240"/>
+        <w:ind w:left="280"/>
+      </w:pPr>
+      <w:r>
+        <w:rPr>
+          <w:rFonts w:ascii="Times New Roman" w:cs="Times New Roman" w:eastAsia="Times New Roman" w:hAnsi="Times New Roman"/>
+          <w:b w:val="false"/>
+          <w:bCs w:val="false"/>
+          <w:sz w:val="20"/>
+          <w:szCs w:val="20"/>
+        </w:rPr>
+        <w:t xml:space="preserve">8.2 Tres capacidades distintas: identificar, clasificar, describir	52</w:t>
+      </w:r>
+    </w:p>
+    <w:p>
+      <w:pPr>
+        <w:tabs>
+          <w:tab w:val="right" w:pos="9000" w:leader="dot"/>
+        </w:tabs>
+        <w:spacing w:after="20" w:line="240"/>
+        <w:ind w:left="280"/>
+      </w:pPr>
+      <w:r>
+        <w:rPr>
+          <w:rFonts w:ascii="Times New Roman" w:cs="Times New Roman" w:eastAsia="Times New Roman" w:hAnsi="Times New Roman"/>
+          <w:b w:val="false"/>
+          <w:bCs w:val="false"/>
+          <w:sz w:val="20"/>
+          <w:szCs w:val="20"/>
+        </w:rPr>
+        <w:t xml:space="preserve">8.3 El caso del «Remito»: ¿error o señal?	52</w:t>
+      </w:r>
+    </w:p>
+    <w:p>
+      <w:pPr>
+        <w:tabs>
+          <w:tab w:val="right" w:pos="9000" w:leader="dot"/>
+        </w:tabs>
+        <w:spacing w:after="20" w:line="240"/>
+        <w:ind w:left="280"/>
+      </w:pPr>
+      <w:r>
+        <w:rPr>
+          <w:rFonts w:ascii="Times New Roman" w:cs="Times New Roman" w:eastAsia="Times New Roman" w:hAnsi="Times New Roman"/>
+          <w:b w:val="false"/>
+          <w:bCs w:val="false"/>
+          <w:sz w:val="20"/>
+          <w:szCs w:val="20"/>
+        </w:rPr>
+        <w:t xml:space="preserve">8.4 La contradicción de la Facturación	53</w:t>
+      </w:r>
+    </w:p>
+    <w:p>
+      <w:pPr>
+        <w:tabs>
+          <w:tab w:val="right" w:pos="9000" w:leader="dot"/>
+        </w:tabs>
+        <w:spacing w:after="20" w:line="240"/>
+        <w:ind w:left="280"/>
+      </w:pPr>
+      <w:r>
+        <w:rPr>
+          <w:rFonts w:ascii="Times New Roman" w:cs="Times New Roman" w:eastAsia="Times New Roman" w:hAnsi="Times New Roman"/>
+          <w:b w:val="false"/>
+          <w:bCs w:val="false"/>
+          <w:sz w:val="20"/>
+          <w:szCs w:val="20"/>
+        </w:rPr>
+        <w:t xml:space="preserve">8.5 El rol de la revisión humana	53</w:t>
+      </w:r>
+    </w:p>
+    <w:p>
+      <w:pPr>
+        <w:tabs>
+          <w:tab w:val="right" w:pos="9000" w:leader="dot"/>
+        </w:tabs>
+        <w:spacing w:after="20" w:line="240"/>
+        <w:ind w:left="280"/>
+      </w:pPr>
+      <w:r>
+        <w:rPr>
+          <w:rFonts w:ascii="Times New Roman" w:cs="Times New Roman" w:eastAsia="Times New Roman" w:hAnsi="Times New Roman"/>
+          <w:b w:val="false"/>
+          <w:bCs w:val="false"/>
+          <w:sz w:val="20"/>
+          <w:szCs w:val="20"/>
+        </w:rPr>
+        <w:t xml:space="preserve">8.6 Sobre la validez de los resultados	54</w:t>
+      </w:r>
+    </w:p>
+    <w:p>
+      <w:pPr>
+        <w:tabs>
+          <w:tab w:val="right" w:pos="9000" w:leader="dot"/>
+        </w:tabs>
+        <w:spacing w:after="20" w:line="240"/>
+        <w:ind w:left="280"/>
+      </w:pPr>
+      <w:r>
+        <w:rPr>
+          <w:rFonts w:ascii="Times New Roman" w:cs="Times New Roman" w:eastAsia="Times New Roman" w:hAnsi="Times New Roman"/>
+          <w:b w:val="false"/>
+          <w:bCs w:val="false"/>
+          <w:sz w:val="20"/>
+          <w:szCs w:val="20"/>
+        </w:rPr>
+        <w:t xml:space="preserve">8.7 Un experimento aparte: entrevistas simuladas para ecoFactory	54</w:t>
+      </w:r>
+    </w:p>
+    <w:p>
+      <w:pPr>
+        <w:tabs>
+          <w:tab w:val="right" w:pos="9000" w:leader="dot"/>
+        </w:tabs>
+        <w:spacing w:after="20" w:line="240"/>
+        <w:ind w:left="280"/>
+      </w:pPr>
+      <w:r>
+        <w:rPr>
+          <w:rFonts w:ascii="Times New Roman" w:cs="Times New Roman" w:eastAsia="Times New Roman" w:hAnsi="Times New Roman"/>
+          <w:b w:val="false"/>
+          <w:bCs w:val="false"/>
+          <w:sz w:val="20"/>
+          <w:szCs w:val="20"/>
+        </w:rPr>
+        <w:t xml:space="preserve">8.8 Lecciones aprendidas	55</w:t>
+      </w:r>
+    </w:p>
+    <w:p>
+      <w:pPr>
+        <w:tabs>
+          <w:tab w:val="right" w:pos="9000" w:leader="dot"/>
+        </w:tabs>
+        <w:spacing w:after="60" w:line="240"/>
+        <w:ind w:left="0"/>
+      </w:pPr>
+      <w:r>
+        <w:rPr>
+          <w:rFonts w:ascii="Times New Roman" w:cs="Times New Roman" w:eastAsia="Times New Roman" w:hAnsi="Times New Roman"/>
+          <w:b/>
+          <w:bCs/>
+          <w:sz w:val="21"/>
+          <w:szCs w:val="21"/>
+        </w:rPr>
+        <w:t xml:space="preserve">Capítulo 9 — Conclusiones y Trabajos Futuros	56</w:t>
+      </w:r>
+    </w:p>
+    <w:p>
+      <w:pPr>
+        <w:tabs>
+          <w:tab w:val="right" w:pos="9000" w:leader="dot"/>
+        </w:tabs>
+        <w:spacing w:after="20" w:line="240"/>
+        <w:ind w:left="280"/>
+      </w:pPr>
+      <w:r>
+        <w:rPr>
+          <w:rFonts w:ascii="Times New Roman" w:cs="Times New Roman" w:eastAsia="Times New Roman" w:hAnsi="Times New Roman"/>
+          <w:b w:val="false"/>
+          <w:bCs w:val="false"/>
+          <w:sz w:val="20"/>
+          <w:szCs w:val="20"/>
+        </w:rPr>
+        <w:t xml:space="preserve">9.1 Conclusiones	56</w:t>
+      </w:r>
+    </w:p>
+    <w:p>
+      <w:pPr>
+        <w:tabs>
+          <w:tab w:val="right" w:pos="9000" w:leader="dot"/>
+        </w:tabs>
+        <w:spacing w:after="20" w:line="240"/>
+        <w:ind w:left="280"/>
+      </w:pPr>
+      <w:r>
+        <w:rPr>
+          <w:rFonts w:ascii="Times New Roman" w:cs="Times New Roman" w:eastAsia="Times New Roman" w:hAnsi="Times New Roman"/>
+          <w:b w:val="false"/>
+          <w:bCs w:val="false"/>
+          <w:sz w:val="20"/>
+          <w:szCs w:val="20"/>
+        </w:rPr>
+        <w:t xml:space="preserve">9.2 Contribuciones	56</w:t>
+      </w:r>
+    </w:p>
+    <w:p>
+      <w:pPr>
+        <w:tabs>
+          <w:tab w:val="right" w:pos="9000" w:leader="dot"/>
+        </w:tabs>
+        <w:spacing w:after="20" w:line="240"/>
+        <w:ind w:left="280"/>
+      </w:pPr>
+      <w:r>
+        <w:rPr>
+          <w:rFonts w:ascii="Times New Roman" w:cs="Times New Roman" w:eastAsia="Times New Roman" w:hAnsi="Times New Roman"/>
+          <w:b w:val="false"/>
+          <w:bCs w:val="false"/>
+          <w:sz w:val="20"/>
+          <w:szCs w:val="20"/>
+        </w:rPr>
+        <w:t xml:space="preserve">9.3 Limitaciones	56</w:t>
+      </w:r>
+    </w:p>
+    <w:p>
+      <w:pPr>
+        <w:tabs>
+          <w:tab w:val="right" w:pos="9000" w:leader="dot"/>
+        </w:tabs>
+        <w:spacing w:after="20" w:line="240"/>
+        <w:ind w:left="280"/>
+      </w:pPr>
+      <w:r>
+        <w:rPr>
+          <w:rFonts w:ascii="Times New Roman" w:cs="Times New Roman" w:eastAsia="Times New Roman" w:hAnsi="Times New Roman"/>
+          <w:b w:val="false"/>
+          <w:bCs w:val="false"/>
+          <w:sz w:val="20"/>
+          <w:szCs w:val="20"/>
+        </w:rPr>
+        <w:t xml:space="preserve">9.4 Trabajos futuros	57</w:t>
+      </w:r>
+    </w:p>
+    <w:p>
+      <w:pPr>
+        <w:tabs>
+          <w:tab w:val="right" w:pos="9000" w:leader="dot"/>
+        </w:tabs>
+        <w:spacing w:after="20" w:line="240"/>
+        <w:ind w:left="280"/>
+      </w:pPr>
+      <w:r>
+        <w:rPr>
+          <w:rFonts w:ascii="Times New Roman" w:cs="Times New Roman" w:eastAsia="Times New Roman" w:hAnsi="Times New Roman"/>
+          <w:b w:val="false"/>
+          <w:bCs w:val="false"/>
+          <w:sz w:val="20"/>
+          <w:szCs w:val="20"/>
+        </w:rPr>
+        <w:t xml:space="preserve">9.5 Reflexión final	57</w:t>
+      </w:r>
+    </w:p>
+    <w:p>
+      <w:pPr>
+        <w:tabs>
+          <w:tab w:val="right" w:pos="9000" w:leader="dot"/>
+        </w:tabs>
+        <w:spacing w:after="60" w:line="240"/>
+        <w:ind w:left="0"/>
+      </w:pPr>
+      <w:r>
+        <w:rPr>
+          <w:rFonts w:ascii="Times New Roman" w:cs="Times New Roman" w:eastAsia="Times New Roman" w:hAnsi="Times New Roman"/>
+          <w:b/>
+          <w:bCs/>
+          <w:sz w:val="21"/>
+          <w:szCs w:val="21"/>
+        </w:rPr>
+        <w:t xml:space="preserve">Bibliografía	58</w:t>
+      </w:r>
+    </w:p>
+    <w:p>
+      <w:pPr>
+        <w:tabs>
+          <w:tab w:val="right" w:pos="9000" w:leader="dot"/>
+        </w:tabs>
+        <w:spacing w:after="60" w:line="240"/>
+        <w:ind w:left="0"/>
+      </w:pPr>
+      <w:r>
+        <w:rPr>
+          <w:rFonts w:ascii="Times New Roman" w:cs="Times New Roman" w:eastAsia="Times New Roman" w:hAnsi="Times New Roman"/>
+          <w:b/>
+          <w:bCs/>
+          <w:sz w:val="21"/>
+          <w:szCs w:val="21"/>
+        </w:rPr>
+        <w:t xml:space="preserve">Anexo A — Prompts del pipeline	61</w:t>
+      </w:r>
+    </w:p>
+    <w:p>
+      <w:pPr>
+        <w:tabs>
+          <w:tab w:val="right" w:pos="9000" w:leader="dot"/>
+        </w:tabs>
+        <w:spacing w:after="20" w:line="240"/>
+        <w:ind w:left="280"/>
+      </w:pPr>
+      <w:r>
+        <w:rPr>
+          <w:rFonts w:ascii="Times New Roman" w:cs="Times New Roman" w:eastAsia="Times New Roman" w:hAnsi="Times New Roman"/>
+          <w:b w:val="false"/>
+          <w:bCs w:val="false"/>
+          <w:sz w:val="20"/>
+          <w:szCs w:val="20"/>
+        </w:rPr>
+        <w:t xml:space="preserve">A.1 Extracción de candidatos (01_extraccion.txt)	61</w:t>
+      </w:r>
+    </w:p>
+    <w:p>
+      <w:pPr>
+        <w:tabs>
+          <w:tab w:val="right" w:pos="9000" w:leader="dot"/>
+        </w:tabs>
+        <w:spacing w:after="20" w:line="240"/>
+        <w:ind w:left="280"/>
+      </w:pPr>
+      <w:r>
+        <w:rPr>
+          <w:rFonts w:ascii="Times New Roman" w:cs="Times New Roman" w:eastAsia="Times New Roman" w:hAnsi="Times New Roman"/>
+          <w:b w:val="false"/>
+          <w:bCs w:val="false"/>
+          <w:sz w:val="20"/>
+          <w:szCs w:val="20"/>
+        </w:rPr>
+        <w:t xml:space="preserve">A.2 Clasificación por tipo (02_clasificacion.txt)	61</w:t>
+      </w:r>
+    </w:p>
+    <w:p>
+      <w:pPr>
+        <w:tabs>
+          <w:tab w:val="right" w:pos="9000" w:leader="dot"/>
+        </w:tabs>
+        <w:spacing w:after="20" w:line="240"/>
+        <w:ind w:left="280"/>
+      </w:pPr>
+      <w:r>
+        <w:rPr>
+          <w:rFonts w:ascii="Times New Roman" w:cs="Times New Roman" w:eastAsia="Times New Roman" w:hAnsi="Times New Roman"/>
+          <w:b w:val="false"/>
+          <w:bCs w:val="false"/>
+          <w:sz w:val="20"/>
+          <w:szCs w:val="20"/>
+        </w:rPr>
+        <w:t xml:space="preserve">A.3 Descripción de noción e impacto (03_descripcion.txt)	62</w:t>
+      </w:r>
+    </w:p>
+    <w:p>
+      <w:pPr>
+        <w:tabs>
+          <w:tab w:val="right" w:pos="9000" w:leader="dot"/>
+        </w:tabs>
+        <w:spacing w:after="20" w:line="240"/>
+        <w:ind w:left="280"/>
+      </w:pPr>
+      <w:r>
+        <w:rPr>
+          <w:rFonts w:ascii="Times New Roman" w:cs="Times New Roman" w:eastAsia="Times New Roman" w:hAnsi="Times New Roman"/>
+          <w:b w:val="false"/>
+          <w:bCs w:val="false"/>
+          <w:sz w:val="20"/>
+          <w:szCs w:val="20"/>
+        </w:rPr>
+        <w:t xml:space="preserve">A.4 Auto-verificación (04_verificacion.txt)	62</w:t>
+      </w:r>
+    </w:p>
+    <w:p>
+      <w:pPr>
+        <w:tabs>
+          <w:tab w:val="right" w:pos="9000" w:leader="dot"/>
+        </w:tabs>
+        <w:spacing w:after="60" w:line="240"/>
+        <w:ind w:left="0"/>
+      </w:pPr>
+      <w:r>
+        <w:rPr>
+          <w:rFonts w:ascii="Times New Roman" w:cs="Times New Roman" w:eastAsia="Times New Roman" w:hAnsi="Times New Roman"/>
+          <w:b/>
+          <w:bCs/>
+          <w:sz w:val="21"/>
+          <w:szCs w:val="21"/>
+        </w:rPr>
+        <w:t xml:space="preserve">Anexo B — Referencia de módulos del código	64</w:t>
+      </w:r>
+    </w:p>
+    <w:p>
+      <w:pPr>
+        <w:tabs>
+          <w:tab w:val="right" w:pos="9000" w:leader="dot"/>
+        </w:tabs>
+        <w:spacing w:after="60" w:line="240"/>
+        <w:ind w:left="0"/>
+      </w:pPr>
+      <w:r>
+        <w:rPr>
+          <w:rFonts w:ascii="Times New Roman" w:cs="Times New Roman" w:eastAsia="Times New Roman" w:hAnsi="Times New Roman"/>
+          <w:b/>
+          <w:bCs/>
+          <w:sz w:val="21"/>
+          <w:szCs w:val="21"/>
+        </w:rPr>
+        <w:t xml:space="preserve">Anexo C — LEL completo producido (corrida de referencia, corpus real)	65</w:t>
+      </w:r>
+    </w:p>
+    <w:p>
+      <w:pPr>
+        <w:tabs>
+          <w:tab w:val="right" w:pos="9000" w:leader="dot"/>
+        </w:tabs>
+        <w:spacing w:after="20" w:line="240"/>
+        <w:ind w:left="280"/>
+      </w:pPr>
+      <w:r>
+        <w:rPr>
+          <w:rFonts w:ascii="Times New Roman" w:cs="Times New Roman" w:eastAsia="Times New Roman" w:hAnsi="Times New Roman"/>
+          <w:b w:val="false"/>
+          <w:bCs w:val="false"/>
+          <w:sz w:val="20"/>
+          <w:szCs w:val="20"/>
+        </w:rPr>
+        <w:t xml:space="preserve">C.1 Símbolos de tipo Sujeto (8)	65</w:t>
+      </w:r>
+    </w:p>
+    <w:p>
+      <w:pPr>
+        <w:tabs>
+          <w:tab w:val="right" w:pos="9000" w:leader="dot"/>
+        </w:tabs>
+        <w:spacing w:after="20" w:line="240"/>
+        <w:ind w:left="280"/>
+      </w:pPr>
+      <w:r>
+        <w:rPr>
+          <w:rFonts w:ascii="Times New Roman" w:cs="Times New Roman" w:eastAsia="Times New Roman" w:hAnsi="Times New Roman"/>
+          <w:b w:val="false"/>
+          <w:bCs w:val="false"/>
+          <w:sz w:val="20"/>
+          <w:szCs w:val="20"/>
+        </w:rPr>
+        <w:t xml:space="preserve">C.2 Símbolos de tipo Objeto (8)	65</w:t>
+      </w:r>
+    </w:p>
+    <w:p>
+      <w:pPr>
+        <w:tabs>
+          <w:tab w:val="right" w:pos="9000" w:leader="dot"/>
+        </w:tabs>
+        <w:spacing w:after="20" w:line="240"/>
+        <w:ind w:left="280"/>
+      </w:pPr>
+      <w:r>
+        <w:rPr>
+          <w:rFonts w:ascii="Times New Roman" w:cs="Times New Roman" w:eastAsia="Times New Roman" w:hAnsi="Times New Roman"/>
+          <w:b w:val="false"/>
+          <w:bCs w:val="false"/>
+          <w:sz w:val="20"/>
+          <w:szCs w:val="20"/>
+        </w:rPr>
+        <w:t xml:space="preserve">C.3 Símbolos de tipo Verbo (3)	66</w:t>
+      </w:r>
+    </w:p>
     <w:p>
       <w:pPr>
         <w:sectPr>

</xml_diff>

<commit_message>
Correcciones finales V3 de la direccion
</commit_message>
<xml_diff>
--- a/Tesis_TFC_Romano.docx
+++ b/Tesis_TFC_Romano.docx
@@ -172,7 +172,7 @@
         <w:t xml:space="preserve">Gold Standard</w:t>
       </w:r>
       <w:r>
-        <w:t xml:space="preserve"> de referencia —un LEL construido manualmente que actúa como patrón de comparación— y se contrastan tres enfoques: dos líneas base (</w:t>
+        <w:t xml:space="preserve"> de referencia —un LEL construido manualmente que actúa como patrón de comparación— y se diseña la contrastación con tres enfoques: dos líneas base (</w:t>
       </w:r>
       <w:r>
         <w:rPr>
@@ -182,7 +182,7 @@
         <w:t xml:space="preserve">baselines</w:t>
       </w:r>
       <w:r>
-        <w:t xml:space="preserve">) de PLN tradicional y un pipeline basado en LLM que extrae, clasifica y describe los símbolos del LEL, con una etapa de auto-verificación. Como caso de muestreo principal se emplea ecoFactory, una empresa real cuyo LEL fue construido manualmente y publicado por los autores en el Workshop em Engenharia de Requisitos (WER 2024) a partir de entrevistas en las que los usuarios fueron interpretados en rol, y se lo complementa con varios dominios adicionales para evaluar la generalidad del enfoque. El trabajo se apoya, además, en una línea de trabajo previa de la Universidad de Belgrano que empleó PLN para construir un bosquejo del LEL.</w:t>
+        <w:t xml:space="preserve">) de PLN tradicional y un pipeline basado en LLM que extrae, clasifica y describe los símbolos del LEL, con una etapa de auto-verificación. Como caso de muestreo principal se emplea ecoFactory, una empresa real cuyo LEL fue construido manualmente y publicado por los autores en el Workshop em Engenharia de Requisitos (WER 2024) a partir de entrevistas en las que los roles de distintos usuarios fueron interpretados por un experto de dicha organización, y se lo complementa con varios dominios adicionales para evaluar la generalidad del enfoque. El trabajo se apoya, además, en una línea de trabajo previa de la Universidad de Belgrano que empleó PLN para construir un bosquejo del LEL.</w:t>
       </w:r>
     </w:p>
     <w:p>
@@ -1910,7 +1910,7 @@
           <w:sz w:val="20"/>
           <w:szCs w:val="20"/>
         </w:rPr>
-        <w:t xml:space="preserve">7.4.2 Resultados	46</w:t>
+        <w:t xml:space="preserve">7.4.2 Resultados	45</w:t>
       </w:r>
     </w:p>
     <w:p>
@@ -2024,7 +2024,7 @@
           <w:sz w:val="20"/>
           <w:szCs w:val="20"/>
         </w:rPr>
-        <w:t xml:space="preserve">7.8 Evaluación en múltiples dominios de muestreo	50</w:t>
+        <w:t xml:space="preserve">7.8 Evaluación en múltiples dominios de muestreo	49</w:t>
       </w:r>
     </w:p>
     <w:p>
@@ -3089,7 +3089,7 @@
         <w:jc w:val="both"/>
       </w:pPr>
       <w:r>
-        <w:t xml:space="preserve">El trabajo se concentra en la primera etapa de la estrategia orientada al cliente —la construcción del LEL— y no abarca la generación automática de escenarios ni de la especificación de requisitos, que se dejan como trabajo futuro. La evaluación rigurosa se ancla en un caso de muestreo principal (ecoFactory, con corpus enteramente real) y se complementa con casos en varios dominios adicionales, con entrevistas simuladas por el autor, para explorar la generalidad. Estas limitaciones se asumen explícitamente y se discuten en el capítulo de amenazas a la validez.</w:t>
+        <w:t xml:space="preserve">El trabajo se concentra en la primera etapa de la estrategia orientada al cliente —la construcción del LEL— y no abarca la generación automática de escenarios ni de la especificación de requisitos, que se dejan como trabajo futuro. La evaluación rigurosa se ancla en un caso de muestreo principal (ecoFactory, con corpus enteramente real) y se complementa con casos en varios dominios adicionales con entrevistas simuladas por el autor, para explorar la generalidad. Estas limitaciones se asumen explícitamente y se discuten en el capítulo de amenazas a la validez.</w:t>
       </w:r>
     </w:p>
     <w:p>
@@ -5267,7 +5267,7 @@
         <w:t xml:space="preserve">gestión de requisitos</w:t>
       </w:r>
       <w:r>
-        <w:t xml:space="preserve"> administra la evolución de los requisitos a lo largo del tiempo. Comprende la gestión de cambios —identificar un cambio, examinar su validez, evaluar su impacto, estimar su costo y decidir su aprobación o rechazo, y luego elicitar, modificar, verificar y validar los modelos afectados— y la gestión de la trazabilidad. La trazabilidad es la capacidad de seguir la vida de un requisito hacia atrás (hasta su origen) y hacia adelante (hasta los artefactos que lo realizan) [33]. En el contexto de este trabajo reaparece de un modo concreto: para que la evaluación sea legítima, cada símbolo producido por un método automático debe poder rastrearse hasta la evidencia textual del corpus que lo sustenta. La Tabla 5.2 (Sección 5.6) documenta esa trazabilidad símbolo por símbolo para el Gold Standard de ecoFactory.</w:t>
+        <w:t xml:space="preserve"> administra la evolución de los requisitos a lo largo del tiempo. Comprende la gestión de cambios —identificar un cambio, examinar su validez, evaluar su impacto, estimar su costo y decidir su aprobación o rechazo, y luego elicitar, modificar, verificar y validar los modelos afectados— y la gestión de la trazabilidad. La trazabilidad es la capacidad de seguir la vida de un requisito hacia atrás (hasta su origen) y hacia adelante (hasta los artefactos que lo realizan) [33]. En el contexto de este trabajo incorpora de un modo concreto: para que la evaluación sea legítima, cada símbolo producido por un método automático debe poder rastrearse hasta la evidencia textual del corpus que lo sustenta. La Tabla 5.2 (Sección 5.6) documenta esa trazabilidad símbolo por símbolo para el Gold Standard de ecoFactory.</w:t>
       </w:r>
     </w:p>
     <w:p>
@@ -7386,7 +7386,7 @@
         <w:t xml:space="preserve">Gold Standard</w:t>
       </w:r>
       <w:r>
-        <w:t xml:space="preserve"> del LEL de ecoFactory: los 21 símbolos tipados (Sujeto/Objeto/Verbo/Estado) con su noción e impacto, tal como fueron construidos, verificados y validados manualmente en el trabajo de origen (WER 2024). Este conjunto completo, denominado </w:t>
+        <w:t xml:space="preserve"> del LEL de ecoFactory: los 21 símbolos tipados (Sujeto/Objeto/Verbo/Estado) con su noción e impacto, tal como fueron construidos, verificados y validados manualmente en el trabajo de origen [13]. Este conjunto completo, denominado </w:t>
       </w:r>
       <w:r>
         <w:rPr>
@@ -11939,7 +11939,7 @@
         <w:t xml:space="preserve">brecha de recuperabilidad</w:t>
       </w:r>
       <w:r>
-        <w:t xml:space="preserve">: símbolos que el LEL experto contiene pero que ningún método podría inferir del corpus disponible, porque corresponden a información aportada por la quinta entrevista (no conservada) o por la sesión de facilitación gráfica del estudio original. La Fig. 5.3 compara la composición de ambos conjuntos por tipo.</w:t>
+        <w:t xml:space="preserve">: símbolos que el LEL experto contiene pero que ningún método podría inferir del corpus disponible, porque corresponden a información aportada por la quinta entrevista (no conservada) o por la sesión de facilitación gráfica del estudio original. La Fig. 5.3 compara la composición de ambos conjuntos por tipo de símbolo.</w:t>
       </w:r>
     </w:p>
     <w:p>
@@ -16759,7 +16759,7 @@
         <w:jc w:val="both"/>
       </w:pPr>
       <w:r>
-        <w:t xml:space="preserve">La cobertura alcanzada refleja, sobre todo, una propiedad del corpus más que del método: seis de los veintiún símbolos del LEL experto no tienen sustento textual en ninguna de las cuatro entrevistas —corresponden a la quinta entrevista no conservada o a la sesión de facilitación gráfica del estudio original— y, por lo tanto, ningún método que parta solo de estas transcripciones podría recuperarlos. Este límite, la brecha de recuperabilidad ya presentada en la Sección 5.7, se retoma en el Capítulo 8. La precisión baja, en cambio, sí es atribuible al método: el análisis de frecuencia propone numerosos términos genéricos que no pertenecen al dominio.</w:t>
+        <w:t xml:space="preserve">La cobertura alcanzada refleja, sobre todo, una propiedad del corpus más que del método: seis de los veintiún símbolos del LEL experto no tienen sustento textual en ninguna de las cuatro entrevistas y, por lo tanto, ningún método que parta solo de estas transcripciones podría recuperarlos. Este límite, la brecha de recuperabilidad ya presentada en la Sección 5.7, se retoma en el Capítulo 8. La precisión baja, en cambio, sí es atribuible al método: el análisis de frecuencia propone numerosos términos genéricos que no pertenecen al dominio.</w:t>
       </w:r>
     </w:p>
     <w:p>
@@ -16825,7 +16825,7 @@
         <w:t xml:space="preserve">salvedad de contaminación</w:t>
       </w:r>
       <w:r>
-        <w:t xml:space="preserve"> más acotada que en versiones anteriores: el operador tuvo exposición previa al Gold Standard durante el desarrollo del trabajo, lo que puede sesgar qué candidatos se seleccionan o cómo se redactan las descripciones, aun cuando —a diferencia de una entrevista simulada— el corpus de entrada es ahora enteramente real y no fue redactado por el operador. Por ambas razones, los valores que siguen se interpretan como una </w:t>
+        <w:t xml:space="preserve">: el operador tuvo exposición previa al Gold Standard durante el desarrollo del trabajo, lo que puede sesgar qué candidatos se seleccionan o cómo se redactan las descripciones. Por ambas razones, los valores que siguen se interpretan como una </w:t>
       </w:r>
       <w:r>
         <w:rPr>
@@ -18420,7 +18420,7 @@
         <w:t xml:space="preserve">100 %</w:t>
       </w:r>
       <w:r>
-        <w:t xml:space="preserve"> de los símbolos. Esta es, precisamente, la capacidad que el enfoque generativo habilita y que el PLN por frecuencia no puede ofrecer. La brecha en la generación de descripciones es estructural: no depende de los valores puntuales de precisión o cobertura, sino de la naturaleza misma de cada enfoque.</w:t>
+        <w:t xml:space="preserve"> de los símbolos. Esta es precisamente la capacidad que el enfoque generativo habilita y que el PLN por frecuencia no puede ofrecer. La brecha en la generación de descripciones es estructural: no depende de los valores puntuales de precisión o cobertura, sino de la naturaleza misma de cada enfoque.</w:t>
       </w:r>
     </w:p>
     <w:p>
@@ -22079,7 +22079,7 @@
         <w:jc w:val="both"/>
       </w:pPr>
       <w:r>
-        <w:t xml:space="preserve">Lo que sí se reporta como definitivo en este capítulo es C1a (baseline de frecuencia, determinístico, corrido sobre el corpus de cuatro entrevistas reales) y la corrida de referencia de C2c con el asistente como modelo, sobre el corpus real. Ambos se ejecutan sin dependencias externas y sus resultados son reproducibles por cualquier tercero a partir del repositorio.</w:t>
+        <w:t xml:space="preserve">Lo que sí se reporta como definitivo en este capítulo es C1a (baseline de frecuencia, determinístico, corrido sobre el corpus de cuatro entrevistas) y la corrida de referencia de C2c con el asistente como modelo, sobre el corpus. Ambos se ejecutan sin dependencias externas y sus resultados son reproducibles por cualquier tercero a partir del repositorio.</w:t>
       </w:r>
     </w:p>
     <w:p>
@@ -22088,7 +22088,7 @@
         <w:jc w:val="both"/>
       </w:pPr>
       <w:r>
-        <w:t xml:space="preserve">Estas corridas no son trabajo futuro en un sentido vago: son el paso inmediato siguiente, ya diseñado, documentado y con el código listo, que transforma la corrida de referencia de este capítulo en el resultado definitivo del experimento. Correrlas y volcar sus números a este capítulo es la primera tarea pendiente del repositorio, documentada en `INSTRUCTIVO_EJECUCION.md`.</w:t>
+        <w:t xml:space="preserve">Estas corridas pendientes no son trabajo futuro en un sentido vago: son el paso inmediato siguiente, ya diseñado, documentado y con el código listo, que transforma la corrida de referencia de este capítulo en el resultado del experimento completo con todos los tratamientos propuestos. Correrlas y registrar sus números y evaluar comparativamente sería la primera tarea pendiente del repositorio, documentada en `INSTRUCTIVO_EJECUCION.md`.</w:t>
       </w:r>
     </w:p>
     <w:p>
@@ -22635,7 +22635,7 @@
         <w:jc w:val="both"/>
       </w:pPr>
       <w:r>
-        <w:t xml:space="preserve">El experimento consistió en redactar dos entrevistas </w:t>
+        <w:t xml:space="preserve">Este experimento preliminar consistió en redactar dos entrevistas </w:t>
       </w:r>
       <w:r>
         <w:rPr>
@@ -22645,7 +22645,7 @@
         <w:t xml:space="preserve">simuladas</w:t>
       </w:r>
       <w:r>
-        <w:t xml:space="preserve"> para dos roles de ecoFactory (el Gerente Comercial y un responsable funcional del ERP), escritas desde el discurso natural de cada rol, para explorar en qué medida un corpus simulado permite reconstruir el LEL. Cuando más tarde se incorporaron las transcripciones reales de esos mismos roles, la comparación entre ambas versiones arrojó un hallazgo metodológico interesante: la entrevista simulada tendía a reproducir el vocabulario exacto del Gold Standard —por ejemplo, introducía explícitamente la distinción «cliente mayorista» / «cliente minorista», mientras que la transcripción real menciona «mayorista» una sola vez y «minorista» ninguna—.</w:t>
+        <w:t xml:space="preserve"> para dos roles de ecoFactory (el Gerente Comercial y un responsable funcional del ERP), escritas desde el discurso natural de cada rol, para explorar en qué medida un corpus simulado permite reconstruir el LEL. Cuando más tarde se incorporaron las transcripciones reales de esos mismos roles, la comparación entre ambas versiones arrojó un hallazgo metodológico interesante: la entrevista simulada tendía a reproducir el vocabulario exacto del Gold Standard —por ejemplo, introducía explícitamente la distinción «cliente mayorista» / «cliente minorista», mientras que la transcripción real menciona «mayorista» una sola vez y «minorista» ninguna.</w:t>
       </w:r>
     </w:p>
     <w:p>

</xml_diff>

<commit_message>
Revision integral: coherencia tesis-codigo-docs, selector de corpus y verificacion por API
</commit_message>
<xml_diff>
--- a/Tesis_TFC_Romano.docx
+++ b/Tesis_TFC_Romano.docx
@@ -1875,7 +1875,7 @@
           <w:sz w:val="20"/>
           <w:szCs w:val="20"/>
         </w:rPr>
-        <w:t xml:space="preserve">7.3 Resultados del baseline de frecuencia (C1a)	46</w:t>
+        <w:t xml:space="preserve">7.3 Resultados del baseline de frecuencia (C1a)	47</w:t>
       </w:r>
     </w:p>
     <w:p>
@@ -1894,7 +1894,7 @@
           <w:sz w:val="20"/>
           <w:szCs w:val="20"/>
         </w:rPr>
-        <w:t xml:space="preserve">7.4 Resultados del pipeline LLM	47</w:t>
+        <w:t xml:space="preserve">7.4 Resultados del pipeline LLM	48</w:t>
       </w:r>
     </w:p>
     <w:p>
@@ -1913,7 +1913,7 @@
           <w:sz w:val="20"/>
           <w:szCs w:val="20"/>
         </w:rPr>
-        <w:t xml:space="preserve">7.4.1 Corrida de referencia	47</w:t>
+        <w:t xml:space="preserve">7.4.1 Corrida de referencia	48</w:t>
       </w:r>
     </w:p>
     <w:p>
@@ -1932,7 +1932,7 @@
           <w:sz w:val="20"/>
           <w:szCs w:val="20"/>
         </w:rPr>
-        <w:t xml:space="preserve">7.4.2 Resultados	47</w:t>
+        <w:t xml:space="preserve">7.4.2 Resultados	48</w:t>
       </w:r>
     </w:p>
     <w:p>
@@ -1989,7 +1989,7 @@
           <w:sz w:val="20"/>
           <w:szCs w:val="20"/>
         </w:rPr>
-        <w:t xml:space="preserve">7.5 Síntesis de resultados obtenidos	49</w:t>
+        <w:t xml:space="preserve">7.5 Síntesis de resultados obtenidos	50</w:t>
       </w:r>
     </w:p>
     <w:p>
@@ -2046,7 +2046,7 @@
           <w:sz w:val="20"/>
           <w:szCs w:val="20"/>
         </w:rPr>
-        <w:t xml:space="preserve">7.8 Evaluación en múltiples dominios de muestreo	51</w:t>
+        <w:t xml:space="preserve">7.8 Evaluación en múltiples dominios de muestreo	52</w:t>
       </w:r>
     </w:p>
     <w:p>
@@ -2084,7 +2084,7 @@
           <w:sz w:val="21"/>
           <w:szCs w:val="21"/>
         </w:rPr>
-        <w:t xml:space="preserve">Capítulo 8 — Discusión	54</w:t>
+        <w:t xml:space="preserve">Capítulo 8 — Discusión	55</w:t>
       </w:r>
     </w:p>
     <w:p>
@@ -2103,7 +2103,7 @@
           <w:sz w:val="20"/>
           <w:szCs w:val="20"/>
         </w:rPr>
-        <w:t xml:space="preserve">8.1 El piso del PLN y la oportunidad del enfoque generativo	54</w:t>
+        <w:t xml:space="preserve">8.1 El piso del PLN y la oportunidad del enfoque generativo	55</w:t>
       </w:r>
     </w:p>
     <w:p>
@@ -2122,7 +2122,7 @@
           <w:sz w:val="20"/>
           <w:szCs w:val="20"/>
         </w:rPr>
-        <w:t xml:space="preserve">8.2 Tres capacidades distintas: identificar, clasificar, describir	54</w:t>
+        <w:t xml:space="preserve">8.2 Tres capacidades distintas: identificar, clasificar, describir	55</w:t>
       </w:r>
     </w:p>
     <w:p>
@@ -2141,7 +2141,7 @@
           <w:sz w:val="20"/>
           <w:szCs w:val="20"/>
         </w:rPr>
-        <w:t xml:space="preserve">8.3 El caso del «Remito»: ¿error o señal?	54</w:t>
+        <w:t xml:space="preserve">8.3 El caso del «Remito»: ¿error o señal?	55</w:t>
       </w:r>
     </w:p>
     <w:p>
@@ -2160,7 +2160,7 @@
           <w:sz w:val="20"/>
           <w:szCs w:val="20"/>
         </w:rPr>
-        <w:t xml:space="preserve">8.4 La contradicción de la Facturación	55</w:t>
+        <w:t xml:space="preserve">8.4 La contradicción de la Facturación	56</w:t>
       </w:r>
     </w:p>
     <w:p>
@@ -2179,7 +2179,7 @@
           <w:sz w:val="20"/>
           <w:szCs w:val="20"/>
         </w:rPr>
-        <w:t xml:space="preserve">8.5 El rol de la revisión humana	55</w:t>
+        <w:t xml:space="preserve">8.5 El rol de la revisión humana	56</w:t>
       </w:r>
     </w:p>
     <w:p>
@@ -2198,7 +2198,7 @@
           <w:sz w:val="20"/>
           <w:szCs w:val="20"/>
         </w:rPr>
-        <w:t xml:space="preserve">8.6 Sobre la validez de los resultados	56</w:t>
+        <w:t xml:space="preserve">8.6 Sobre la validez de los resultados	57</w:t>
       </w:r>
     </w:p>
     <w:p>
@@ -2217,7 +2217,7 @@
           <w:sz w:val="20"/>
           <w:szCs w:val="20"/>
         </w:rPr>
-        <w:t xml:space="preserve">8.7 Un experimento aparte: entrevistas simuladas para ecoFactory	56</w:t>
+        <w:t xml:space="preserve">8.7 Un experimento aparte: entrevistas simuladas para ecoFactory	57</w:t>
       </w:r>
     </w:p>
     <w:p>
@@ -2236,7 +2236,7 @@
           <w:sz w:val="20"/>
           <w:szCs w:val="20"/>
         </w:rPr>
-        <w:t xml:space="preserve">8.8 Lecciones aprendidas	57</w:t>
+        <w:t xml:space="preserve">8.8 Lecciones aprendidas	58</w:t>
       </w:r>
     </w:p>
     <w:p>
@@ -2255,7 +2255,7 @@
           <w:sz w:val="21"/>
           <w:szCs w:val="21"/>
         </w:rPr>
-        <w:t xml:space="preserve">Capítulo 9 — Conclusiones y Trabajos Futuros	58</w:t>
+        <w:t xml:space="preserve">Capítulo 9 — Conclusiones y Trabajos Futuros	59</w:t>
       </w:r>
     </w:p>
     <w:p>
@@ -2274,7 +2274,7 @@
           <w:sz w:val="20"/>
           <w:szCs w:val="20"/>
         </w:rPr>
-        <w:t xml:space="preserve">9.1 Conclusiones	58</w:t>
+        <w:t xml:space="preserve">9.1 Conclusiones	59</w:t>
       </w:r>
     </w:p>
     <w:p>
@@ -2293,7 +2293,7 @@
           <w:sz w:val="20"/>
           <w:szCs w:val="20"/>
         </w:rPr>
-        <w:t xml:space="preserve">9.2 Contribuciones	58</w:t>
+        <w:t xml:space="preserve">9.2 Contribuciones	59</w:t>
       </w:r>
     </w:p>
     <w:p>
@@ -2312,7 +2312,7 @@
           <w:sz w:val="20"/>
           <w:szCs w:val="20"/>
         </w:rPr>
-        <w:t xml:space="preserve">9.3 Limitaciones	58</w:t>
+        <w:t xml:space="preserve">9.3 Limitaciones	59</w:t>
       </w:r>
     </w:p>
     <w:p>
@@ -2331,7 +2331,7 @@
           <w:sz w:val="20"/>
           <w:szCs w:val="20"/>
         </w:rPr>
-        <w:t xml:space="preserve">9.4 Trabajos futuros	59</w:t>
+        <w:t xml:space="preserve">9.4 Trabajos futuros	60</w:t>
       </w:r>
     </w:p>
     <w:p>
@@ -2350,7 +2350,7 @@
           <w:sz w:val="20"/>
           <w:szCs w:val="20"/>
         </w:rPr>
-        <w:t xml:space="preserve">9.5 Reflexión final	59</w:t>
+        <w:t xml:space="preserve">9.5 Reflexión final	60</w:t>
       </w:r>
     </w:p>
     <w:p>
@@ -2369,7 +2369,7 @@
           <w:sz w:val="21"/>
           <w:szCs w:val="21"/>
         </w:rPr>
-        <w:t xml:space="preserve">Bibliografía	60</w:t>
+        <w:t xml:space="preserve">Bibliografía	61</w:t>
       </w:r>
     </w:p>
     <w:p>
@@ -2388,7 +2388,7 @@
           <w:sz w:val="21"/>
           <w:szCs w:val="21"/>
         </w:rPr>
-        <w:t xml:space="preserve">Anexo A — Prompts del pipeline	63</w:t>
+        <w:t xml:space="preserve">Anexo A — Prompts del pipeline	64</w:t>
       </w:r>
     </w:p>
     <w:p>
@@ -2407,7 +2407,7 @@
           <w:sz w:val="20"/>
           <w:szCs w:val="20"/>
         </w:rPr>
-        <w:t xml:space="preserve">A.1 Extracción de candidatos (01_extraccion.txt)	63</w:t>
+        <w:t xml:space="preserve">A.1 Extracción de candidatos (01_extraccion.txt)	64</w:t>
       </w:r>
     </w:p>
     <w:p>
@@ -2426,7 +2426,7 @@
           <w:sz w:val="20"/>
           <w:szCs w:val="20"/>
         </w:rPr>
-        <w:t xml:space="preserve">A.2 Clasificación por tipo (02_clasificacion.txt)	63</w:t>
+        <w:t xml:space="preserve">A.2 Clasificación por tipo (02_clasificacion.txt)	64</w:t>
       </w:r>
     </w:p>
     <w:p>
@@ -2445,7 +2445,7 @@
           <w:sz w:val="20"/>
           <w:szCs w:val="20"/>
         </w:rPr>
-        <w:t xml:space="preserve">A.3 Descripción de noción e impacto (03_descripcion.txt)	64</w:t>
+        <w:t xml:space="preserve">A.3 Descripción de noción e impacto (03_descripcion.txt)	65</w:t>
       </w:r>
     </w:p>
     <w:p>
@@ -2464,7 +2464,7 @@
           <w:sz w:val="20"/>
           <w:szCs w:val="20"/>
         </w:rPr>
-        <w:t xml:space="preserve">A.4 Auto-verificación (04_verificacion.txt)	64</w:t>
+        <w:t xml:space="preserve">A.4 Auto-verificación (04_verificacion.txt)	65</w:t>
       </w:r>
     </w:p>
     <w:p>
@@ -2483,7 +2483,7 @@
           <w:sz w:val="21"/>
           <w:szCs w:val="21"/>
         </w:rPr>
-        <w:t xml:space="preserve">Anexo B — Referencia de módulos del código	66</w:t>
+        <w:t xml:space="preserve">Anexo B — Referencia de módulos del código	67</w:t>
       </w:r>
     </w:p>
     <w:p>
@@ -2502,7 +2502,7 @@
           <w:sz w:val="21"/>
           <w:szCs w:val="21"/>
         </w:rPr>
-        <w:t xml:space="preserve">Anexo C — LEL completo producido (corrida de referencia, corpus real)	67</w:t>
+        <w:t xml:space="preserve">Anexo C — LEL completo producido (corrida de referencia, corpus real)	68</w:t>
       </w:r>
     </w:p>
     <w:p>
@@ -2521,7 +2521,7 @@
           <w:sz w:val="20"/>
           <w:szCs w:val="20"/>
         </w:rPr>
-        <w:t xml:space="preserve">C.1 Símbolos de tipo Sujeto (8)	67</w:t>
+        <w:t xml:space="preserve">C.1 Símbolos de tipo Sujeto (8)	68</w:t>
       </w:r>
     </w:p>
     <w:p>
@@ -2540,7 +2540,7 @@
           <w:sz w:val="20"/>
           <w:szCs w:val="20"/>
         </w:rPr>
-        <w:t xml:space="preserve">C.2 Símbolos de tipo Objeto (8)	67</w:t>
+        <w:t xml:space="preserve">C.2 Símbolos de tipo Objeto (8)	68</w:t>
       </w:r>
     </w:p>
     <w:p>
@@ -2559,7 +2559,26 @@
           <w:sz w:val="20"/>
           <w:szCs w:val="20"/>
         </w:rPr>
-        <w:t xml:space="preserve">C.3 Símbolos de tipo Verbo (3)	68</w:t>
+        <w:t xml:space="preserve">C.3 Símbolos de tipo Verbo (3)	69</w:t>
+      </w:r>
+    </w:p>
+    <w:p>
+      <w:pPr>
+        <w:tabs>
+          <w:tab w:val="right" w:pos="9000" w:leader="dot"/>
+        </w:tabs>
+        <w:spacing w:after="60" w:line="240"/>
+        <w:ind w:left="0"/>
+      </w:pPr>
+      <w:r>
+        <w:rPr>
+          <w:rFonts w:ascii="Times New Roman" w:cs="Times New Roman" w:eastAsia="Times New Roman" w:hAnsi="Times New Roman"/>
+          <w:b/>
+          <w:bCs/>
+          <w:sz w:val="21"/>
+          <w:szCs w:val="21"/>
+        </w:rPr>
+        <w:t xml:space="preserve">Anexo D — Verificación de ejecución con modelos comerciales vía API	70</w:t>
       </w:r>
     </w:p>
     <w:p>
@@ -5091,7 +5110,7 @@
         <w:jc w:val="both"/>
       </w:pPr>
       <w:r>
-        <w:t xml:space="preserve">Los Escenarios son el segundo modelo de la estrategia orientada al cliente. Describen situaciones del dominio mediante una narración estructurada en lenguaje natural, usando el vocabulario fijado en el LEL. Un escenario se compone de título, objetivo, contexto (precondición y ubicación temporal y geográfica), recursos, actores y una serie de episodios que representan la secuencia de acciones, con sus excepciones y restricciones (Fig. 2.5).</w:t>
+        <w:t xml:space="preserve">Los Escenarios son el segundo modelo de la estrategia orientada al cliente. Describen situaciones del dominio mediante una narración estructurada en lenguaje natural, usando el vocabulario fijado en el LEL [7]. Un escenario se compone de título, objetivo, contexto (precondición y ubicación temporal y geográfica), recursos, actores y una serie de episodios que representan la secuencia de acciones, con sus excepciones y restricciones (Fig. 2.5).</w:t>
       </w:r>
     </w:p>
     <w:p>
@@ -7537,7 +7556,7 @@
         <w:jc w:val="both"/>
       </w:pPr>
       <w:r>
-        <w:t xml:space="preserve">Se diseñaron cinco tratamientos diferentes de modelado automático del LEL para comparar la eficacia de cada uno. Todos los tratamientos reciben el mismo corpus y se miden contra el mismo Gold Standard (Tabla 4.2).</w:t>
+        <w:t xml:space="preserve">Se diseñaron cinco tratamientos diferentes de modelado automático del LEL para comparar la eficacia de cada uno. Todos los tratamientos reciben el mismo corpus y se miden contra el mismo Gold Standard (Tabla 4.1).</w:t>
       </w:r>
     </w:p>
     <w:p>
@@ -7551,7 +7570,7 @@
           <w:sz w:val="19"/>
           <w:szCs w:val="19"/>
         </w:rPr>
-        <w:t xml:space="preserve">Tabla 4.2. Tratamientos comparados en el experimento.</w:t>
+        <w:t xml:space="preserve">Tabla 4.1. Tratamientos comparados en el experimento.</w:t>
       </w:r>
     </w:p>
     <w:tbl>
@@ -12450,7 +12469,7 @@
           <w:sz w:val="16"/>
           <w:szCs w:val="16"/>
         </w:rPr>
-        <w:t xml:space="preserve">│   └── gold/        gs_completo.json (21) y gs_corpus.json (14)</w:t>
+        <w:t xml:space="preserve">│   └── gold/        gs_completo.json (21) y gs_corpus.json (15)</w:t>
       </w:r>
       <w:r>
         <w:br/>
@@ -13861,7 +13880,7 @@
         <w:jc w:val="both"/>
       </w:pPr>
       <w:r>
-        <w:t xml:space="preserve">Para poder ejecutar el mismo pipeline contra distintos modelos —y así resolver empíricamente cuál funciona mejor— el módulo llm_client.py define una interfaz común y selecciona la implementación concreta según la configuración. Las claves de API se leen de variables de entorno y nunca se escriben en el código. Un proveedor especial, echo, permite validar el armado del pipeline sin acceso a la red.</w:t>
+        <w:t xml:space="preserve">Para poder ejecutar el mismo pipeline contra distintos modelos —y así resolver empíricamente cuál funciona mejor— el módulo llm_client.py define una interfaz común y selecciona la implementación concreta según la configuración. Las claves de API se leen de variables de entorno y nunca se escriben en el código. Dos proveedores operan sin acceso a la red: echo, que valida el armado del cliente, y mock, que reproduce offline el LEL de la corrida de referencia para demostrar el flujo completo (Sección 6.8).</w:t>
       </w:r>
     </w:p>
     <w:p>
@@ -13927,7 +13946,19 @@
           <w:sz w:val="16"/>
           <w:szCs w:val="16"/>
         </w:rPr>
-        <w:t xml:space="preserve">    if p == "echo":      return EchoClient(cfg)   # offline, valida el armado</w:t>
+        <w:t xml:space="preserve">    if p == "echo":      return EchoClient(cfg)   # valida el armado del cliente</w:t>
+      </w:r>
+      <w:r>
+        <w:br/>
+      </w:r>
+      <w:r>
+        <w:rPr>
+          <w:rFonts w:ascii="Courier New" w:cs="Courier New" w:eastAsia="Courier New" w:hAnsi="Courier New"/>
+          <w:color w:val="24292F"/>
+          <w:sz w:val="16"/>
+          <w:szCs w:val="16"/>
+        </w:rPr>
+        <w:t xml:space="preserve">    if p == "mock":      return MockClient(cfg)   # offline, reproduce la corrida de referencia</w:t>
       </w:r>
     </w:p>
     <w:p>
@@ -14562,7 +14593,17 @@
         <w:t xml:space="preserve">mock</w:t>
       </w:r>
       <w:r>
-        <w:t xml:space="preserve"> consciente de la etapa: devuelve respuestas con el formato JSON correcto de cada paso (extracción, clasificación, descripción y verificación), lo que permite ejecutar el pipeline de punta a punta de forma offline y comprobar que la orquestación, el relleno de prompts, el parseo y el armado del esquema funcionan, antes de gastar una sola llamada a un modelo real. La evidencia de estas ejecuciones se documenta en el Capítulo 7 (Sección 7.7).</w:t>
+        <w:t xml:space="preserve"> que reproduce, sin llamar a ningún modelo, el LEL de la corrida de referencia: sirve, etapa por etapa, sus símbolos reales con su tipo, noción e impacto. Esto permite ejecutar el pipeline de punta a punta de forma offline y comprobar que la orquestación, el relleno de prompts, el parseo y el armado del esquema funcionan. Debe tenerse presente que su salida es un resultado </w:t>
+      </w:r>
+      <w:r>
+        <w:rPr>
+          <w:i/>
+          <w:iCs/>
+        </w:rPr>
+        <w:t xml:space="preserve">pre-cargado</w:t>
+      </w:r>
+      <w:r>
+        <w:t xml:space="preserve">, no una inferencia en vivo, y así corresponde presentarlo. La evidencia de estas ejecuciones se documenta en el Capítulo 7 (Sección 7.7).</w:t>
       </w:r>
     </w:p>
     <w:p>
@@ -15500,17 +15541,27 @@
         <w:jc w:val="both"/>
       </w:pPr>
       <w:r>
-        <w:t xml:space="preserve">En cuanto al diseño visual, la interfaz adopta la identidad de la Universidad de Belgrano y reutiliza el mismo sistema de tarjetas, los colores por tipo de símbolo y la tipografía del reporte HTML del LEL, de modo que la herramienta de ejecución y sus reportes conforman un conjunto visual coherente. La Fig. 6.3 muestra la interfaz tras una corrida completa con el proveedor </w:t>
+        <w:t xml:space="preserve">La interfaz permite además elegir el </w:t>
       </w:r>
       <w:r>
         <w:rPr>
           <w:i/>
           <w:iCs/>
         </w:rPr>
+        <w:t xml:space="preserve">corpus</w:t>
+      </w:r>
+      <w:r>
+        <w:t xml:space="preserve"> sobre el que se ejecuta —el de ecoFactory o cualquiera de los casos de muestreo, declarados en la configuración—, evaluando cada uno contra su propio LEL de referencia. En cuanto al diseño visual, la interfaz adopta la identidad de la Universidad de Belgrano y reutiliza el mismo sistema de tarjetas, los colores por tipo de símbolo y la tipografía del reporte HTML del LEL, de modo que la herramienta de ejecución y sus reportes conforman un conjunto visual coherente. La Fig. 6.3 muestra la interfaz tras una corrida completa con el proveedor </w:t>
+      </w:r>
+      <w:r>
+        <w:rPr>
+          <w:i/>
+          <w:iCs/>
+        </w:rPr>
         <w:t xml:space="preserve">mock</w:t>
       </w:r>
       <w:r>
-        <w:t xml:space="preserve">. El código se publica en el directorio </w:t>
+        <w:t xml:space="preserve">, que reproduce offline el LEL de la corrida de referencia (un resultado pre-cargado, no una inferencia en vivo). El código se publica en el directorio </w:t>
       </w:r>
       <w:r>
         <w:rPr>
@@ -15582,7 +15633,7 @@
           <w:sz w:val="19"/>
           <w:szCs w:val="19"/>
         </w:rPr>
-        <w:t xml:space="preserve">Fig. 6.3. Interfaz de ejecución paso a paso del prototipo. Un botón por etapa (extraer, clasificar, describir, auto-verificar) muestra el resultado de cada paso; la acción final genera el reporte del LEL y el de evaluación. Reutiliza el mismo motor que la línea de comandos y la identidad visual del reporte.</w:t>
+        <w:t xml:space="preserve">Fig. 6.3. Interfaz de ejecución paso a paso del prototipo. Un botón por etapa (extraer, clasificar, describir, auto-verificar) muestra el resultado de cada paso; la acción final genera el reporte del LEL y el de evaluación. Un selector permite elegir el corpus (ecoFactory o los casos de muestreo). Reutiliza el mismo motor que la línea de comandos y la identidad visual del reporte.</w:t>
       </w:r>
     </w:p>
     <w:p>
@@ -15629,7 +15680,7 @@
         <w:jc w:val="both"/>
       </w:pPr>
       <w:r>
-        <w:t xml:space="preserve">El baseline de frecuencia (C1a) y el motor de evaluación no requieren dependencias externas ni acceso a la red, por lo que se ejecutaron de manera completa y sus resultados se reportan a continuación. El baseline con spaCy (C1b) requiere el modelo de lenguaje de español, y el pipeline LLM con modelos comerciales requiere acceso a la API del proveedor; ninguno de estos pudo ejecutarse en el entorno disponible (sin acceso a red), por lo que quedan como corridas pendientes, formalizadas en la Sección 7.9 y en el `INSTRUCTIVO_EJECUCION.md` del repositorio. En consecuencia, este capítulo presenta los resultados del tratamiento C1a —que fijan el piso cuantitativo del problema— y una corrida de referencia del pipeline LLM (C2c) con el asistente como modelo, dejando explícitamente pendientes C1b y las corridas ciegas con modelos comerciales.</w:t>
+        <w:t xml:space="preserve">El baseline de frecuencia (C1a) y el motor de evaluación no requieren dependencias externas ni acceso a la red, por lo que se ejecutaron de manera completa y sus resultados se reportan a continuación. El baseline con spaCy (C1b) requiere el modelo de lenguaje de español, y el pipeline LLM con modelos comerciales requiere acceso a la API del proveedor; ninguno de estos se ejecutó como parte de la evaluación de este capítulo, por lo que quedan como corridas pendientes, formalizadas en la Sección 7.9 y en el `INSTRUCTIVO_EJECUCION.md` del repositorio; con posterioridad se verificó, de manera operativa, que el pipeline se ejecuta correctamente contra la API de un proveedor comercial (Anexo D), sin que ello altere los resultados que aquí se reportan. En consecuencia, este capítulo presenta los resultados del tratamiento C1a —que fijan el piso cuantitativo del problema— y una corrida de referencia del pipeline LLM (C2c) con el asistente como modelo, dejando explícitamente pendientes C1b y las corridas ciegas con modelos comerciales.</w:t>
       </w:r>
     </w:p>
     <w:p>
@@ -17150,1029 +17201,6 @@
       <w:pPr>
         <w:spacing w:after="120"/>
       </w:pPr>
-    </w:p>
-    <w:p>
-      <w:pPr>
-        <w:spacing w:after="160" w:line="276"/>
-        <w:jc w:val="both"/>
-      </w:pPr>
-      <w:r>
-        <w:t xml:space="preserve">El método recupera cerca de la mitad de los símbolos recuperables (cobertura de 0,467 contra el GS-Corpus) y alrededor de un 43 % del GS-Completo, pero con una precisión baja (0,175 y 0,225 respectivamente), consecuencia de la gran cantidad de falsos positivos: de los 40 candidatos que propone, la mayoría son términos genéricos o conversacionales que el análisis de frecuencia no logra descartar. La exactitud de clasificación de tipo sobre los símbolos correctamente identificados ronda 0,56–0,57. El dato cualitativamente más relevante es la columna Descr.: la noción y el impacto de todos los símbolos quedan vacíos, porque el método no genera descripciones.</w:t>
-      </w:r>
-    </w:p>
-    <w:p>
-      <w:pPr>
-        <w:spacing w:after="160" w:line="276"/>
-        <w:jc w:val="both"/>
-      </w:pPr>
-      <w:r>
-        <w:t xml:space="preserve">La cobertura alcanzada refleja, sobre todo, una propiedad del corpus más que del método: seis de los veintiún símbolos del LEL experto no tienen sustento textual en ninguna de las cuatro entrevistas y, por lo tanto, ningún método que parta solo de estas transcripciones podría recuperarlos. Este límite, la brecha de recuperabilidad ya presentada en la Sección 5.7, se retoma en el Capítulo 8. La precisión baja, en cambio, sí es atribuible al método: el análisis de frecuencia propone numerosos términos genéricos que no pertenecen al dominio.</w:t>
-      </w:r>
-    </w:p>
-    <w:p>
-      <w:pPr>
-        <w:pStyle w:val="Heading2"/>
-        <w:keepNext/>
-      </w:pPr>
-      <w:r>
-        <w:t xml:space="preserve">7.4 Resultados del pipeline LLM</w:t>
-      </w:r>
-    </w:p>
-    <w:p>
-      <w:pPr>
-        <w:pStyle w:val="Heading3"/>
-        <w:keepNext/>
-      </w:pPr>
-      <w:r>
-        <w:t xml:space="preserve">7.4.1 Corrida de referencia</w:t>
-      </w:r>
-    </w:p>
-    <w:p>
-      <w:pPr>
-        <w:spacing w:after="160" w:line="276"/>
-        <w:jc w:val="both"/>
-      </w:pPr>
-      <w:r>
-        <w:t xml:space="preserve">No fue posible acceder a la API de los proveedores comerciales durante la elaboración de este trabajo, por lo que el pipeline no pudo ejecutarse contra los modelos externos por la vía del SDK. En su lugar se realizó una </w:t>
-      </w:r>
-      <w:r>
-        <w:rPr>
-          <w:i/>
-          <w:iCs/>
-        </w:rPr>
-        <w:t xml:space="preserve">corrida de referencia</w:t>
-      </w:r>
-      <w:r>
-        <w:t xml:space="preserve"> empleando como modelo generativo un asistente de IA generativa, que ejecutó las cuatro etapas del pipeline —extracción, clasificación, descripción y auto-verificación, en la configuración C2c— sobre el corpus de las cuatro entrevistas, produciendo un LEL que luego se midió con el motor de evaluación determinístico.</w:t>
-      </w:r>
-    </w:p>
-    <w:p>
-      <w:pPr>
-        <w:spacing w:after="160" w:line="276"/>
-        <w:jc w:val="both"/>
-      </w:pPr>
-      <w:r>
-        <w:t xml:space="preserve">Esta corrida debe leerse con dos salvedades explícitas. Primero, el </w:t>
-      </w:r>
-      <w:r>
-        <w:rPr>
-          <w:i/>
-          <w:iCs/>
-        </w:rPr>
-        <w:t xml:space="preserve">modelo</w:t>
-      </w:r>
-      <w:r>
-        <w:t xml:space="preserve"> utilizado es el asistente, y no necesariamente representa el desempeño de los modelos comerciales que se someterán a benchmarking en la réplica definitiva. Segundo, aplica una </w:t>
-      </w:r>
-      <w:r>
-        <w:rPr>
-          <w:i/>
-          <w:iCs/>
-        </w:rPr>
-        <w:t xml:space="preserve">salvedad de contaminación</w:t>
-      </w:r>
-      <w:r>
-        <w:t xml:space="preserve">: el operador tuvo exposición previa al Gold Standard durante el desarrollo del trabajo, lo que puede sesgar qué candidatos se seleccionan o cómo se redactan las descripciones. Por ambas razones, los valores que siguen se interpretan como una </w:t>
-      </w:r>
-      <w:r>
-        <w:rPr>
-          <w:i/>
-          <w:iCs/>
-        </w:rPr>
-        <w:t xml:space="preserve">cota optimista</w:t>
-      </w:r>
-      <w:r>
-        <w:t xml:space="preserve"> y como una demostración de que el pipeline produce un LEL real y evaluable, y no como el resultado final del experimento, que requiere una réplica en condiciones ciegas con modelos frescos (Sección 7.9).</w:t>
-      </w:r>
-    </w:p>
-    <w:p>
-      <w:pPr>
-        <w:pStyle w:val="Heading3"/>
-        <w:keepNext/>
-      </w:pPr>
-      <w:r>
-        <w:t xml:space="preserve">7.4.2 Resultados</w:t>
-      </w:r>
-    </w:p>
-    <w:p>
-      <w:pPr>
-        <w:spacing w:after="160" w:line="276"/>
-        <w:jc w:val="both"/>
-      </w:pPr>
-      <w:r>
-        <w:t xml:space="preserve">El LEL producido por el prototipo contiene 19 símbolos descriptos: 8 Sujeto, 8 Objeto y 3 Verbo — ningún Estado, un resultado en sí mismo informativo. La Tabla 7.4 reporta su evaluación contra ambos conjuntos de referencia.</w:t>
-      </w:r>
-    </w:p>
-    <w:p>
-      <w:pPr>
-        <w:spacing w:after="70" w:before="180"/>
-        <w:jc w:val="center"/>
-      </w:pPr>
-      <w:r>
-        <w:rPr>
-          <w:color w:val="333333"/>
-          <w:sz w:val="19"/>
-          <w:szCs w:val="19"/>
-        </w:rPr>
-        <w:t xml:space="preserve">Tabla 7.4. Pipeline LLM (configuración C2c, modelo: asistente) sobre el corpus de cuatro entrevistas reales.</w:t>
-      </w:r>
-    </w:p>
-    <w:tbl>
-      <w:tblPr>
-        <w:tblW w:type="dxa" w:w="8480"/>
-        <w:tblBorders>
-          <w:top w:val="single" w:color="auto" w:sz="4"/>
-          <w:left w:val="single" w:color="auto" w:sz="4"/>
-          <w:bottom w:val="single" w:color="auto" w:sz="4"/>
-          <w:right w:val="single" w:color="auto" w:sz="4"/>
-          <w:insideH w:val="single" w:color="auto" w:sz="4"/>
-          <w:insideV w:val="single" w:color="auto" w:sz="4"/>
-        </w:tblBorders>
-      </w:tblPr>
-      <w:tblGrid>
-        <w:gridCol w:w="2100"/>
-        <w:gridCol w:w="500"/>
-        <w:gridCol w:w="500"/>
-        <w:gridCol w:w="500"/>
-        <w:gridCol w:w="1180"/>
-        <w:gridCol w:w="1240"/>
-        <w:gridCol w:w="900"/>
-        <w:gridCol w:w="780"/>
-        <w:gridCol w:w="780"/>
-      </w:tblGrid>
-      <w:tr>
-        <w:trPr>
-          <w:cantSplit/>
-          <w:tblHeader/>
-        </w:trPr>
-        <w:tc>
-          <w:tcPr>
-            <w:tcW w:type="dxa" w:w="2100"/>
-            <w:tcBorders>
-              <w:top w:val="single" w:color="BFBFBF" w:sz="4"/>
-              <w:left w:val="single" w:color="BFBFBF" w:sz="4"/>
-              <w:bottom w:val="single" w:color="BFBFBF" w:sz="4"/>
-              <w:right w:val="single" w:color="BFBFBF" w:sz="4"/>
-            </w:tcBorders>
-            <w:shd w:fill="1F4E79" w:val="clear"/>
-            <w:tcMar>
-              <w:top w:type="dxa" w:w="70"/>
-              <w:left w:type="dxa" w:w="110"/>
-              <w:bottom w:type="dxa" w:w="70"/>
-              <w:right w:type="dxa" w:w="110"/>
-            </w:tcMar>
-            <w:vAlign w:val="center"/>
-          </w:tcPr>
-          <w:p>
-            <w:r>
-              <w:rPr>
-                <w:b/>
-                <w:bCs/>
-                <w:color w:val="FFFFFF"/>
-                <w:sz w:val="20"/>
-                <w:szCs w:val="20"/>
-              </w:rPr>
-              <w:t xml:space="preserve">Blanco de comparación</w:t>
-            </w:r>
-          </w:p>
-        </w:tc>
-        <w:tc>
-          <w:tcPr>
-            <w:tcW w:type="dxa" w:w="500"/>
-            <w:tcBorders>
-              <w:top w:val="single" w:color="BFBFBF" w:sz="4"/>
-              <w:left w:val="single" w:color="BFBFBF" w:sz="4"/>
-              <w:bottom w:val="single" w:color="BFBFBF" w:sz="4"/>
-              <w:right w:val="single" w:color="BFBFBF" w:sz="4"/>
-            </w:tcBorders>
-            <w:shd w:fill="1F4E79" w:val="clear"/>
-            <w:tcMar>
-              <w:top w:type="dxa" w:w="70"/>
-              <w:left w:type="dxa" w:w="110"/>
-              <w:bottom w:type="dxa" w:w="70"/>
-              <w:right w:type="dxa" w:w="110"/>
-            </w:tcMar>
-            <w:vAlign w:val="center"/>
-          </w:tcPr>
-          <w:p>
-            <w:r>
-              <w:rPr>
-                <w:b/>
-                <w:bCs/>
-                <w:color w:val="FFFFFF"/>
-                <w:sz w:val="20"/>
-                <w:szCs w:val="20"/>
-              </w:rPr>
-              <w:t xml:space="preserve">VP</w:t>
-            </w:r>
-          </w:p>
-        </w:tc>
-        <w:tc>
-          <w:tcPr>
-            <w:tcW w:type="dxa" w:w="500"/>
-            <w:tcBorders>
-              <w:top w:val="single" w:color="BFBFBF" w:sz="4"/>
-              <w:left w:val="single" w:color="BFBFBF" w:sz="4"/>
-              <w:bottom w:val="single" w:color="BFBFBF" w:sz="4"/>
-              <w:right w:val="single" w:color="BFBFBF" w:sz="4"/>
-            </w:tcBorders>
-            <w:shd w:fill="1F4E79" w:val="clear"/>
-            <w:tcMar>
-              <w:top w:type="dxa" w:w="70"/>
-              <w:left w:type="dxa" w:w="110"/>
-              <w:bottom w:type="dxa" w:w="70"/>
-              <w:right w:type="dxa" w:w="110"/>
-            </w:tcMar>
-            <w:vAlign w:val="center"/>
-          </w:tcPr>
-          <w:p>
-            <w:r>
-              <w:rPr>
-                <w:b/>
-                <w:bCs/>
-                <w:color w:val="FFFFFF"/>
-                <w:sz w:val="20"/>
-                <w:szCs w:val="20"/>
-              </w:rPr>
-              <w:t xml:space="preserve">FP</w:t>
-            </w:r>
-          </w:p>
-        </w:tc>
-        <w:tc>
-          <w:tcPr>
-            <w:tcW w:type="dxa" w:w="500"/>
-            <w:tcBorders>
-              <w:top w:val="single" w:color="BFBFBF" w:sz="4"/>
-              <w:left w:val="single" w:color="BFBFBF" w:sz="4"/>
-              <w:bottom w:val="single" w:color="BFBFBF" w:sz="4"/>
-              <w:right w:val="single" w:color="BFBFBF" w:sz="4"/>
-            </w:tcBorders>
-            <w:shd w:fill="1F4E79" w:val="clear"/>
-            <w:tcMar>
-              <w:top w:type="dxa" w:w="70"/>
-              <w:left w:type="dxa" w:w="110"/>
-              <w:bottom w:type="dxa" w:w="70"/>
-              <w:right w:type="dxa" w:w="110"/>
-            </w:tcMar>
-            <w:vAlign w:val="center"/>
-          </w:tcPr>
-          <w:p>
-            <w:r>
-              <w:rPr>
-                <w:b/>
-                <w:bCs/>
-                <w:color w:val="FFFFFF"/>
-                <w:sz w:val="20"/>
-                <w:szCs w:val="20"/>
-              </w:rPr>
-              <w:t xml:space="preserve">FN</w:t>
-            </w:r>
-          </w:p>
-        </w:tc>
-        <w:tc>
-          <w:tcPr>
-            <w:tcW w:type="dxa" w:w="1180"/>
-            <w:tcBorders>
-              <w:top w:val="single" w:color="BFBFBF" w:sz="4"/>
-              <w:left w:val="single" w:color="BFBFBF" w:sz="4"/>
-              <w:bottom w:val="single" w:color="BFBFBF" w:sz="4"/>
-              <w:right w:val="single" w:color="BFBFBF" w:sz="4"/>
-            </w:tcBorders>
-            <w:shd w:fill="1F4E79" w:val="clear"/>
-            <w:tcMar>
-              <w:top w:type="dxa" w:w="70"/>
-              <w:left w:type="dxa" w:w="110"/>
-              <w:bottom w:type="dxa" w:w="70"/>
-              <w:right w:type="dxa" w:w="110"/>
-            </w:tcMar>
-            <w:vAlign w:val="center"/>
-          </w:tcPr>
-          <w:p>
-            <w:r>
-              <w:rPr>
-                <w:b/>
-                <w:bCs/>
-                <w:color w:val="FFFFFF"/>
-                <w:sz w:val="20"/>
-                <w:szCs w:val="20"/>
-              </w:rPr>
-              <w:t xml:space="preserve">Precisión</w:t>
-            </w:r>
-          </w:p>
-        </w:tc>
-        <w:tc>
-          <w:tcPr>
-            <w:tcW w:type="dxa" w:w="1240"/>
-            <w:tcBorders>
-              <w:top w:val="single" w:color="BFBFBF" w:sz="4"/>
-              <w:left w:val="single" w:color="BFBFBF" w:sz="4"/>
-              <w:bottom w:val="single" w:color="BFBFBF" w:sz="4"/>
-              <w:right w:val="single" w:color="BFBFBF" w:sz="4"/>
-            </w:tcBorders>
-            <w:shd w:fill="1F4E79" w:val="clear"/>
-            <w:tcMar>
-              <w:top w:type="dxa" w:w="70"/>
-              <w:left w:type="dxa" w:w="110"/>
-              <w:bottom w:type="dxa" w:w="70"/>
-              <w:right w:type="dxa" w:w="110"/>
-            </w:tcMar>
-            <w:vAlign w:val="center"/>
-          </w:tcPr>
-          <w:p>
-            <w:r>
-              <w:rPr>
-                <w:b/>
-                <w:bCs/>
-                <w:color w:val="FFFFFF"/>
-                <w:sz w:val="20"/>
-                <w:szCs w:val="20"/>
-              </w:rPr>
-              <w:t xml:space="preserve">Cobertura</w:t>
-            </w:r>
-          </w:p>
-        </w:tc>
-        <w:tc>
-          <w:tcPr>
-            <w:tcW w:type="dxa" w:w="900"/>
-            <w:tcBorders>
-              <w:top w:val="single" w:color="BFBFBF" w:sz="4"/>
-              <w:left w:val="single" w:color="BFBFBF" w:sz="4"/>
-              <w:bottom w:val="single" w:color="BFBFBF" w:sz="4"/>
-              <w:right w:val="single" w:color="BFBFBF" w:sz="4"/>
-            </w:tcBorders>
-            <w:shd w:fill="1F4E79" w:val="clear"/>
-            <w:tcMar>
-              <w:top w:type="dxa" w:w="70"/>
-              <w:left w:type="dxa" w:w="110"/>
-              <w:bottom w:type="dxa" w:w="70"/>
-              <w:right w:type="dxa" w:w="110"/>
-            </w:tcMar>
-            <w:vAlign w:val="center"/>
-          </w:tcPr>
-          <w:p>
-            <w:r>
-              <w:rPr>
-                <w:b/>
-                <w:bCs/>
-                <w:color w:val="FFFFFF"/>
-                <w:sz w:val="20"/>
-                <w:szCs w:val="20"/>
-              </w:rPr>
-              <w:t xml:space="preserve">F1</w:t>
-            </w:r>
-          </w:p>
-        </w:tc>
-        <w:tc>
-          <w:tcPr>
-            <w:tcW w:type="dxa" w:w="780"/>
-            <w:tcBorders>
-              <w:top w:val="single" w:color="BFBFBF" w:sz="4"/>
-              <w:left w:val="single" w:color="BFBFBF" w:sz="4"/>
-              <w:bottom w:val="single" w:color="BFBFBF" w:sz="4"/>
-              <w:right w:val="single" w:color="BFBFBF" w:sz="4"/>
-            </w:tcBorders>
-            <w:shd w:fill="1F4E79" w:val="clear"/>
-            <w:tcMar>
-              <w:top w:type="dxa" w:w="70"/>
-              <w:left w:type="dxa" w:w="110"/>
-              <w:bottom w:type="dxa" w:w="70"/>
-              <w:right w:type="dxa" w:w="110"/>
-            </w:tcMar>
-            <w:vAlign w:val="center"/>
-          </w:tcPr>
-          <w:p>
-            <w:r>
-              <w:rPr>
-                <w:b/>
-                <w:bCs/>
-                <w:color w:val="FFFFFF"/>
-                <w:sz w:val="20"/>
-                <w:szCs w:val="20"/>
-              </w:rPr>
-              <w:t xml:space="preserve">Tipo</w:t>
-            </w:r>
-          </w:p>
-        </w:tc>
-        <w:tc>
-          <w:tcPr>
-            <w:tcW w:type="dxa" w:w="780"/>
-            <w:tcBorders>
-              <w:top w:val="single" w:color="BFBFBF" w:sz="4"/>
-              <w:left w:val="single" w:color="BFBFBF" w:sz="4"/>
-              <w:bottom w:val="single" w:color="BFBFBF" w:sz="4"/>
-              <w:right w:val="single" w:color="BFBFBF" w:sz="4"/>
-            </w:tcBorders>
-            <w:shd w:fill="1F4E79" w:val="clear"/>
-            <w:tcMar>
-              <w:top w:type="dxa" w:w="70"/>
-              <w:left w:type="dxa" w:w="110"/>
-              <w:bottom w:type="dxa" w:w="70"/>
-              <w:right w:type="dxa" w:w="110"/>
-            </w:tcMar>
-            <w:vAlign w:val="center"/>
-          </w:tcPr>
-          <w:p>
-            <w:r>
-              <w:rPr>
-                <w:b/>
-                <w:bCs/>
-                <w:color w:val="FFFFFF"/>
-                <w:sz w:val="20"/>
-                <w:szCs w:val="20"/>
-              </w:rPr>
-              <w:t xml:space="preserve">Descr.</w:t>
-            </w:r>
-          </w:p>
-        </w:tc>
-      </w:tr>
-      <w:tr>
-        <w:trPr>
-          <w:cantSplit/>
-        </w:trPr>
-        <w:tc>
-          <w:tcPr>
-            <w:tcW w:type="dxa" w:w="2100"/>
-            <w:tcBorders>
-              <w:top w:val="single" w:color="BFBFBF" w:sz="4"/>
-              <w:left w:val="single" w:color="BFBFBF" w:sz="4"/>
-              <w:bottom w:val="single" w:color="BFBFBF" w:sz="4"/>
-              <w:right w:val="single" w:color="BFBFBF" w:sz="4"/>
-            </w:tcBorders>
-            <w:shd w:fill="FFFFFF" w:val="clear"/>
-            <w:tcMar>
-              <w:top w:type="dxa" w:w="60"/>
-              <w:left w:type="dxa" w:w="110"/>
-              <w:bottom w:type="dxa" w:w="60"/>
-              <w:right w:type="dxa" w:w="110"/>
-            </w:tcMar>
-            <w:vAlign w:val="center"/>
-          </w:tcPr>
-          <w:p>
-            <w:pPr>
-              <w:spacing w:line="250"/>
-            </w:pPr>
-            <w:r>
-              <w:t xml:space="preserve">GS-Corpus (15)</w:t>
-            </w:r>
-          </w:p>
-        </w:tc>
-        <w:tc>
-          <w:tcPr>
-            <w:tcW w:type="dxa" w:w="500"/>
-            <w:tcBorders>
-              <w:top w:val="single" w:color="BFBFBF" w:sz="4"/>
-              <w:left w:val="single" w:color="BFBFBF" w:sz="4"/>
-              <w:bottom w:val="single" w:color="BFBFBF" w:sz="4"/>
-              <w:right w:val="single" w:color="BFBFBF" w:sz="4"/>
-            </w:tcBorders>
-            <w:shd w:fill="FFFFFF" w:val="clear"/>
-            <w:tcMar>
-              <w:top w:type="dxa" w:w="60"/>
-              <w:left w:type="dxa" w:w="110"/>
-              <w:bottom w:type="dxa" w:w="60"/>
-              <w:right w:type="dxa" w:w="110"/>
-            </w:tcMar>
-            <w:vAlign w:val="center"/>
-          </w:tcPr>
-          <w:p>
-            <w:pPr>
-              <w:spacing w:line="250"/>
-            </w:pPr>
-            <w:r>
-              <w:t xml:space="preserve">9</w:t>
-            </w:r>
-          </w:p>
-        </w:tc>
-        <w:tc>
-          <w:tcPr>
-            <w:tcW w:type="dxa" w:w="500"/>
-            <w:tcBorders>
-              <w:top w:val="single" w:color="BFBFBF" w:sz="4"/>
-              <w:left w:val="single" w:color="BFBFBF" w:sz="4"/>
-              <w:bottom w:val="single" w:color="BFBFBF" w:sz="4"/>
-              <w:right w:val="single" w:color="BFBFBF" w:sz="4"/>
-            </w:tcBorders>
-            <w:shd w:fill="FFFFFF" w:val="clear"/>
-            <w:tcMar>
-              <w:top w:type="dxa" w:w="60"/>
-              <w:left w:type="dxa" w:w="110"/>
-              <w:bottom w:type="dxa" w:w="60"/>
-              <w:right w:type="dxa" w:w="110"/>
-            </w:tcMar>
-            <w:vAlign w:val="center"/>
-          </w:tcPr>
-          <w:p>
-            <w:pPr>
-              <w:spacing w:line="250"/>
-            </w:pPr>
-            <w:r>
-              <w:t xml:space="preserve">10</w:t>
-            </w:r>
-          </w:p>
-        </w:tc>
-        <w:tc>
-          <w:tcPr>
-            <w:tcW w:type="dxa" w:w="500"/>
-            <w:tcBorders>
-              <w:top w:val="single" w:color="BFBFBF" w:sz="4"/>
-              <w:left w:val="single" w:color="BFBFBF" w:sz="4"/>
-              <w:bottom w:val="single" w:color="BFBFBF" w:sz="4"/>
-              <w:right w:val="single" w:color="BFBFBF" w:sz="4"/>
-            </w:tcBorders>
-            <w:shd w:fill="FFFFFF" w:val="clear"/>
-            <w:tcMar>
-              <w:top w:type="dxa" w:w="60"/>
-              <w:left w:type="dxa" w:w="110"/>
-              <w:bottom w:type="dxa" w:w="60"/>
-              <w:right w:type="dxa" w:w="110"/>
-            </w:tcMar>
-            <w:vAlign w:val="center"/>
-          </w:tcPr>
-          <w:p>
-            <w:pPr>
-              <w:spacing w:line="250"/>
-            </w:pPr>
-            <w:r>
-              <w:t xml:space="preserve">6</w:t>
-            </w:r>
-          </w:p>
-        </w:tc>
-        <w:tc>
-          <w:tcPr>
-            <w:tcW w:type="dxa" w:w="1180"/>
-            <w:tcBorders>
-              <w:top w:val="single" w:color="BFBFBF" w:sz="4"/>
-              <w:left w:val="single" w:color="BFBFBF" w:sz="4"/>
-              <w:bottom w:val="single" w:color="BFBFBF" w:sz="4"/>
-              <w:right w:val="single" w:color="BFBFBF" w:sz="4"/>
-            </w:tcBorders>
-            <w:shd w:fill="FFFFFF" w:val="clear"/>
-            <w:tcMar>
-              <w:top w:type="dxa" w:w="60"/>
-              <w:left w:type="dxa" w:w="110"/>
-              <w:bottom w:type="dxa" w:w="60"/>
-              <w:right w:type="dxa" w:w="110"/>
-            </w:tcMar>
-            <w:vAlign w:val="center"/>
-          </w:tcPr>
-          <w:p>
-            <w:pPr>
-              <w:spacing w:line="250"/>
-            </w:pPr>
-            <w:r>
-              <w:t xml:space="preserve">0,474</w:t>
-            </w:r>
-          </w:p>
-        </w:tc>
-        <w:tc>
-          <w:tcPr>
-            <w:tcW w:type="dxa" w:w="1240"/>
-            <w:tcBorders>
-              <w:top w:val="single" w:color="BFBFBF" w:sz="4"/>
-              <w:left w:val="single" w:color="BFBFBF" w:sz="4"/>
-              <w:bottom w:val="single" w:color="BFBFBF" w:sz="4"/>
-              <w:right w:val="single" w:color="BFBFBF" w:sz="4"/>
-            </w:tcBorders>
-            <w:shd w:fill="FFFFFF" w:val="clear"/>
-            <w:tcMar>
-              <w:top w:type="dxa" w:w="60"/>
-              <w:left w:type="dxa" w:w="110"/>
-              <w:bottom w:type="dxa" w:w="60"/>
-              <w:right w:type="dxa" w:w="110"/>
-            </w:tcMar>
-            <w:vAlign w:val="center"/>
-          </w:tcPr>
-          <w:p>
-            <w:pPr>
-              <w:spacing w:line="250"/>
-            </w:pPr>
-            <w:r>
-              <w:t xml:space="preserve">0,600</w:t>
-            </w:r>
-          </w:p>
-        </w:tc>
-        <w:tc>
-          <w:tcPr>
-            <w:tcW w:type="dxa" w:w="900"/>
-            <w:tcBorders>
-              <w:top w:val="single" w:color="BFBFBF" w:sz="4"/>
-              <w:left w:val="single" w:color="BFBFBF" w:sz="4"/>
-              <w:bottom w:val="single" w:color="BFBFBF" w:sz="4"/>
-              <w:right w:val="single" w:color="BFBFBF" w:sz="4"/>
-            </w:tcBorders>
-            <w:shd w:fill="FFFFFF" w:val="clear"/>
-            <w:tcMar>
-              <w:top w:type="dxa" w:w="60"/>
-              <w:left w:type="dxa" w:w="110"/>
-              <w:bottom w:type="dxa" w:w="60"/>
-              <w:right w:type="dxa" w:w="110"/>
-            </w:tcMar>
-            <w:vAlign w:val="center"/>
-          </w:tcPr>
-          <w:p>
-            <w:pPr>
-              <w:spacing w:line="250"/>
-            </w:pPr>
-            <w:r>
-              <w:t xml:space="preserve">0,529</w:t>
-            </w:r>
-          </w:p>
-        </w:tc>
-        <w:tc>
-          <w:tcPr>
-            <w:tcW w:type="dxa" w:w="780"/>
-            <w:tcBorders>
-              <w:top w:val="single" w:color="BFBFBF" w:sz="4"/>
-              <w:left w:val="single" w:color="BFBFBF" w:sz="4"/>
-              <w:bottom w:val="single" w:color="BFBFBF" w:sz="4"/>
-              <w:right w:val="single" w:color="BFBFBF" w:sz="4"/>
-            </w:tcBorders>
-            <w:shd w:fill="FFFFFF" w:val="clear"/>
-            <w:tcMar>
-              <w:top w:type="dxa" w:w="60"/>
-              <w:left w:type="dxa" w:w="110"/>
-              <w:bottom w:type="dxa" w:w="60"/>
-              <w:right w:type="dxa" w:w="110"/>
-            </w:tcMar>
-            <w:vAlign w:val="center"/>
-          </w:tcPr>
-          <w:p>
-            <w:pPr>
-              <w:spacing w:line="250"/>
-            </w:pPr>
-            <w:r>
-              <w:t xml:space="preserve">0,889</w:t>
-            </w:r>
-          </w:p>
-        </w:tc>
-        <w:tc>
-          <w:tcPr>
-            <w:tcW w:type="dxa" w:w="780"/>
-            <w:tcBorders>
-              <w:top w:val="single" w:color="BFBFBF" w:sz="4"/>
-              <w:left w:val="single" w:color="BFBFBF" w:sz="4"/>
-              <w:bottom w:val="single" w:color="BFBFBF" w:sz="4"/>
-              <w:right w:val="single" w:color="BFBFBF" w:sz="4"/>
-            </w:tcBorders>
-            <w:shd w:fill="FFFFFF" w:val="clear"/>
-            <w:tcMar>
-              <w:top w:type="dxa" w:w="60"/>
-              <w:left w:type="dxa" w:w="110"/>
-              <w:bottom w:type="dxa" w:w="60"/>
-              <w:right w:type="dxa" w:w="110"/>
-            </w:tcMar>
-            <w:vAlign w:val="center"/>
-          </w:tcPr>
-          <w:p>
-            <w:pPr>
-              <w:spacing w:line="250"/>
-            </w:pPr>
-            <w:r>
-              <w:t xml:space="preserve">100 %</w:t>
-            </w:r>
-          </w:p>
-        </w:tc>
-      </w:tr>
-      <w:tr>
-        <w:trPr>
-          <w:cantSplit/>
-        </w:trPr>
-        <w:tc>
-          <w:tcPr>
-            <w:tcW w:type="dxa" w:w="2100"/>
-            <w:tcBorders>
-              <w:top w:val="single" w:color="BFBFBF" w:sz="4"/>
-              <w:left w:val="single" w:color="BFBFBF" w:sz="4"/>
-              <w:bottom w:val="single" w:color="BFBFBF" w:sz="4"/>
-              <w:right w:val="single" w:color="BFBFBF" w:sz="4"/>
-            </w:tcBorders>
-            <w:shd w:fill="F2F6FB" w:val="clear"/>
-            <w:tcMar>
-              <w:top w:type="dxa" w:w="60"/>
-              <w:left w:type="dxa" w:w="110"/>
-              <w:bottom w:type="dxa" w:w="60"/>
-              <w:right w:type="dxa" w:w="110"/>
-            </w:tcMar>
-            <w:vAlign w:val="center"/>
-          </w:tcPr>
-          <w:p>
-            <w:pPr>
-              <w:spacing w:line="250"/>
-            </w:pPr>
-            <w:r>
-              <w:t xml:space="preserve">GS-Completo (21)</w:t>
-            </w:r>
-          </w:p>
-        </w:tc>
-        <w:tc>
-          <w:tcPr>
-            <w:tcW w:type="dxa" w:w="500"/>
-            <w:tcBorders>
-              <w:top w:val="single" w:color="BFBFBF" w:sz="4"/>
-              <w:left w:val="single" w:color="BFBFBF" w:sz="4"/>
-              <w:bottom w:val="single" w:color="BFBFBF" w:sz="4"/>
-              <w:right w:val="single" w:color="BFBFBF" w:sz="4"/>
-            </w:tcBorders>
-            <w:shd w:fill="F2F6FB" w:val="clear"/>
-            <w:tcMar>
-              <w:top w:type="dxa" w:w="60"/>
-              <w:left w:type="dxa" w:w="110"/>
-              <w:bottom w:type="dxa" w:w="60"/>
-              <w:right w:type="dxa" w:w="110"/>
-            </w:tcMar>
-            <w:vAlign w:val="center"/>
-          </w:tcPr>
-          <w:p>
-            <w:pPr>
-              <w:spacing w:line="250"/>
-            </w:pPr>
-            <w:r>
-              <w:t xml:space="preserve">10</w:t>
-            </w:r>
-          </w:p>
-        </w:tc>
-        <w:tc>
-          <w:tcPr>
-            <w:tcW w:type="dxa" w:w="500"/>
-            <w:tcBorders>
-              <w:top w:val="single" w:color="BFBFBF" w:sz="4"/>
-              <w:left w:val="single" w:color="BFBFBF" w:sz="4"/>
-              <w:bottom w:val="single" w:color="BFBFBF" w:sz="4"/>
-              <w:right w:val="single" w:color="BFBFBF" w:sz="4"/>
-            </w:tcBorders>
-            <w:shd w:fill="F2F6FB" w:val="clear"/>
-            <w:tcMar>
-              <w:top w:type="dxa" w:w="60"/>
-              <w:left w:type="dxa" w:w="110"/>
-              <w:bottom w:type="dxa" w:w="60"/>
-              <w:right w:type="dxa" w:w="110"/>
-            </w:tcMar>
-            <w:vAlign w:val="center"/>
-          </w:tcPr>
-          <w:p>
-            <w:pPr>
-              <w:spacing w:line="250"/>
-            </w:pPr>
-            <w:r>
-              <w:t xml:space="preserve">9</w:t>
-            </w:r>
-          </w:p>
-        </w:tc>
-        <w:tc>
-          <w:tcPr>
-            <w:tcW w:type="dxa" w:w="500"/>
-            <w:tcBorders>
-              <w:top w:val="single" w:color="BFBFBF" w:sz="4"/>
-              <w:left w:val="single" w:color="BFBFBF" w:sz="4"/>
-              <w:bottom w:val="single" w:color="BFBFBF" w:sz="4"/>
-              <w:right w:val="single" w:color="BFBFBF" w:sz="4"/>
-            </w:tcBorders>
-            <w:shd w:fill="F2F6FB" w:val="clear"/>
-            <w:tcMar>
-              <w:top w:type="dxa" w:w="60"/>
-              <w:left w:type="dxa" w:w="110"/>
-              <w:bottom w:type="dxa" w:w="60"/>
-              <w:right w:type="dxa" w:w="110"/>
-            </w:tcMar>
-            <w:vAlign w:val="center"/>
-          </w:tcPr>
-          <w:p>
-            <w:pPr>
-              <w:spacing w:line="250"/>
-            </w:pPr>
-            <w:r>
-              <w:t xml:space="preserve">11</w:t>
-            </w:r>
-          </w:p>
-        </w:tc>
-        <w:tc>
-          <w:tcPr>
-            <w:tcW w:type="dxa" w:w="1180"/>
-            <w:tcBorders>
-              <w:top w:val="single" w:color="BFBFBF" w:sz="4"/>
-              <w:left w:val="single" w:color="BFBFBF" w:sz="4"/>
-              <w:bottom w:val="single" w:color="BFBFBF" w:sz="4"/>
-              <w:right w:val="single" w:color="BFBFBF" w:sz="4"/>
-            </w:tcBorders>
-            <w:shd w:fill="F2F6FB" w:val="clear"/>
-            <w:tcMar>
-              <w:top w:type="dxa" w:w="60"/>
-              <w:left w:type="dxa" w:w="110"/>
-              <w:bottom w:type="dxa" w:w="60"/>
-              <w:right w:type="dxa" w:w="110"/>
-            </w:tcMar>
-            <w:vAlign w:val="center"/>
-          </w:tcPr>
-          <w:p>
-            <w:pPr>
-              <w:spacing w:line="250"/>
-            </w:pPr>
-            <w:r>
-              <w:t xml:space="preserve">0,526</w:t>
-            </w:r>
-          </w:p>
-        </w:tc>
-        <w:tc>
-          <w:tcPr>
-            <w:tcW w:type="dxa" w:w="1240"/>
-            <w:tcBorders>
-              <w:top w:val="single" w:color="BFBFBF" w:sz="4"/>
-              <w:left w:val="single" w:color="BFBFBF" w:sz="4"/>
-              <w:bottom w:val="single" w:color="BFBFBF" w:sz="4"/>
-              <w:right w:val="single" w:color="BFBFBF" w:sz="4"/>
-            </w:tcBorders>
-            <w:shd w:fill="F2F6FB" w:val="clear"/>
-            <w:tcMar>
-              <w:top w:type="dxa" w:w="60"/>
-              <w:left w:type="dxa" w:w="110"/>
-              <w:bottom w:type="dxa" w:w="60"/>
-              <w:right w:type="dxa" w:w="110"/>
-            </w:tcMar>
-            <w:vAlign w:val="center"/>
-          </w:tcPr>
-          <w:p>
-            <w:pPr>
-              <w:spacing w:line="250"/>
-            </w:pPr>
-            <w:r>
-              <w:t xml:space="preserve">0,476</w:t>
-            </w:r>
-          </w:p>
-        </w:tc>
-        <w:tc>
-          <w:tcPr>
-            <w:tcW w:type="dxa" w:w="900"/>
-            <w:tcBorders>
-              <w:top w:val="single" w:color="BFBFBF" w:sz="4"/>
-              <w:left w:val="single" w:color="BFBFBF" w:sz="4"/>
-              <w:bottom w:val="single" w:color="BFBFBF" w:sz="4"/>
-              <w:right w:val="single" w:color="BFBFBF" w:sz="4"/>
-            </w:tcBorders>
-            <w:shd w:fill="F2F6FB" w:val="clear"/>
-            <w:tcMar>
-              <w:top w:type="dxa" w:w="60"/>
-              <w:left w:type="dxa" w:w="110"/>
-              <w:bottom w:type="dxa" w:w="60"/>
-              <w:right w:type="dxa" w:w="110"/>
-            </w:tcMar>
-            <w:vAlign w:val="center"/>
-          </w:tcPr>
-          <w:p>
-            <w:pPr>
-              <w:spacing w:line="250"/>
-            </w:pPr>
-            <w:r>
-              <w:t xml:space="preserve">0,500</w:t>
-            </w:r>
-          </w:p>
-        </w:tc>
-        <w:tc>
-          <w:tcPr>
-            <w:tcW w:type="dxa" w:w="780"/>
-            <w:tcBorders>
-              <w:top w:val="single" w:color="BFBFBF" w:sz="4"/>
-              <w:left w:val="single" w:color="BFBFBF" w:sz="4"/>
-              <w:bottom w:val="single" w:color="BFBFBF" w:sz="4"/>
-              <w:right w:val="single" w:color="BFBFBF" w:sz="4"/>
-            </w:tcBorders>
-            <w:shd w:fill="F2F6FB" w:val="clear"/>
-            <w:tcMar>
-              <w:top w:type="dxa" w:w="60"/>
-              <w:left w:type="dxa" w:w="110"/>
-              <w:bottom w:type="dxa" w:w="60"/>
-              <w:right w:type="dxa" w:w="110"/>
-            </w:tcMar>
-            <w:vAlign w:val="center"/>
-          </w:tcPr>
-          <w:p>
-            <w:pPr>
-              <w:spacing w:line="250"/>
-            </w:pPr>
-            <w:r>
-              <w:t xml:space="preserve">0,900</w:t>
-            </w:r>
-          </w:p>
-        </w:tc>
-        <w:tc>
-          <w:tcPr>
-            <w:tcW w:type="dxa" w:w="780"/>
-            <w:tcBorders>
-              <w:top w:val="single" w:color="BFBFBF" w:sz="4"/>
-              <w:left w:val="single" w:color="BFBFBF" w:sz="4"/>
-              <w:bottom w:val="single" w:color="BFBFBF" w:sz="4"/>
-              <w:right w:val="single" w:color="BFBFBF" w:sz="4"/>
-            </w:tcBorders>
-            <w:shd w:fill="F2F6FB" w:val="clear"/>
-            <w:tcMar>
-              <w:top w:type="dxa" w:w="60"/>
-              <w:left w:type="dxa" w:w="110"/>
-              <w:bottom w:type="dxa" w:w="60"/>
-              <w:right w:type="dxa" w:w="110"/>
-            </w:tcMar>
-            <w:vAlign w:val="center"/>
-          </w:tcPr>
-          <w:p>
-            <w:pPr>
-              <w:spacing w:line="250"/>
-            </w:pPr>
-            <w:r>
-              <w:t xml:space="preserve">100 %</w:t>
-            </w:r>
-          </w:p>
-        </w:tc>
-      </w:tr>
-    </w:tbl>
-    <w:p>
-      <w:pPr>
-        <w:spacing w:after="120"/>
-      </w:pPr>
-    </w:p>
-    <w:p>
-      <w:pPr>
-        <w:spacing w:after="160" w:line="276"/>
-        <w:jc w:val="both"/>
-      </w:pPr>
-      <w:r>
-        <w:t xml:space="preserve">Contra el GS-Corpus —el blanco alcanzable desde el corpus disponible—, el pipeline alcanza una </w:t>
-      </w:r>
-      <w:r>
-        <w:rPr>
-          <w:i/>
-          <w:iCs/>
-        </w:rPr>
-        <w:t xml:space="preserve">cobertura de 0,600</w:t>
-      </w:r>
-      <w:r>
-        <w:t xml:space="preserve"> (9 de 15 símbolos), una </w:t>
-      </w:r>
-      <w:r>
-        <w:rPr>
-          <w:i/>
-          <w:iCs/>
-        </w:rPr>
-        <w:t xml:space="preserve">precisión de 0,474</w:t>
-      </w:r>
-      <w:r>
-        <w:t xml:space="preserve"> y un </w:t>
-      </w:r>
-      <w:r>
-        <w:rPr>
-          <w:i/>
-          <w:iCs/>
-        </w:rPr>
-        <w:t xml:space="preserve">F1 de 0,529</w:t>
-      </w:r>
-      <w:r>
-        <w:t xml:space="preserve">. Entre los falsos positivos aparecen tres actores legítimos del dominio —</w:t>
-      </w:r>
-      <w:r>
-        <w:rPr>
-          <w:i/>
-          <w:iCs/>
-        </w:rPr>
-        <w:t xml:space="preserve">Dueño</w:t>
-      </w:r>
-      <w:r>
-        <w:t xml:space="preserve">, </w:t>
-      </w:r>
-      <w:r>
-        <w:rPr>
-          <w:i/>
-          <w:iCs/>
-        </w:rPr>
-        <w:t xml:space="preserve">Gerente Comercial</w:t>
-      </w:r>
-      <w:r>
-        <w:t xml:space="preserve"> y </w:t>
-      </w:r>
-      <w:r>
-        <w:rPr>
-          <w:i/>
-          <w:iCs/>
-        </w:rPr>
-        <w:t xml:space="preserve">Responsable ERP</w:t>
-      </w:r>
-      <w:r>
-        <w:t xml:space="preserve">— que no figuran en el Gold Standard de 21 símbolos simplemente porque este último se construyó sin acceso a la entrevista del Responsable ERP; no son alucinaciones sino símbolos plausibles que el Gold Standard original no pudo cubrir. La exactitud de clasificación de tipo es alta (0,889–0,900) y la cobertura de descripciones es del 100 %, la diferencia cualitativa que el baseline de PLN por frecuencia no alcanza.</w:t>
-      </w:r>
-    </w:p>
-    <w:p>
-      <w:pPr>
-        <w:pStyle w:val="Heading3"/>
-        <w:keepNext/>
-      </w:pPr>
-      <w:r>
-        <w:t xml:space="preserve">7.4.3 Comparación con el PLN tradicional</w:t>
-      </w:r>
-    </w:p>
-    <w:p>
-      <w:pPr>
-        <w:spacing w:after="160" w:line="276"/>
-        <w:jc w:val="both"/>
-      </w:pPr>
-      <w:r>
-        <w:t xml:space="preserve">El contraste con el baseline de frecuencia, frente al mismo blanco de comparación (GS-Corpus), es nítido (Figura 7.2).</w:t>
-      </w:r>
     </w:p>
     <w:p>
       <w:pPr>
@@ -18233,13 +17261,125 @@
           <w:sz w:val="19"/>
           <w:szCs w:val="19"/>
         </w:rPr>
-        <w:t xml:space="preserve">Fig. 7.2. PLN tradicional frente al pipeline LLM en las métricas de identificación, clasificación y descripción, contra el GS-Corpus.</w:t>
+        <w:t xml:space="preserve">Fig. 7.1. Baseline de frecuencia (C1a): métricas de identificación y clasificación frente al GS-Corpus y al GS-Completo. La cobertura de descripciones es 0 %.</w:t>
       </w:r>
     </w:p>
     <w:p>
       <w:pPr>
         <w:spacing w:after="120"/>
       </w:pPr>
+    </w:p>
+    <w:p>
+      <w:pPr>
+        <w:spacing w:after="160" w:line="276"/>
+        <w:jc w:val="both"/>
+      </w:pPr>
+      <w:r>
+        <w:t xml:space="preserve">El método recupera cerca de la mitad de los símbolos recuperables (cobertura de 0,467 contra el GS-Corpus) y alrededor de un 43 % del GS-Completo, pero con una precisión baja (0,175 y 0,225 respectivamente), consecuencia de la gran cantidad de falsos positivos: de los 40 candidatos que propone, la mayoría son términos genéricos o conversacionales que el análisis de frecuencia no logra descartar. La exactitud de clasificación de tipo sobre los símbolos correctamente identificados ronda 0,56–0,57. El dato cualitativamente más relevante es la columna Descr.: la noción y el impacto de todos los símbolos quedan vacíos, porque el método no genera descripciones.</w:t>
+      </w:r>
+    </w:p>
+    <w:p>
+      <w:pPr>
+        <w:spacing w:after="160" w:line="276"/>
+        <w:jc w:val="both"/>
+      </w:pPr>
+      <w:r>
+        <w:t xml:space="preserve">La cobertura alcanzada refleja, sobre todo, una propiedad del corpus más que del método: seis de los veintiún símbolos del LEL experto no tienen sustento textual en ninguna de las cuatro entrevistas y, por lo tanto, ningún método que parta solo de estas transcripciones podría recuperarlos. Este límite, la brecha de recuperabilidad ya presentada en la Sección 5.7, se retoma en el Capítulo 8. La precisión baja, en cambio, sí es atribuible al método: el análisis de frecuencia propone numerosos términos genéricos que no pertenecen al dominio.</w:t>
+      </w:r>
+    </w:p>
+    <w:p>
+      <w:pPr>
+        <w:pStyle w:val="Heading2"/>
+        <w:keepNext/>
+      </w:pPr>
+      <w:r>
+        <w:t xml:space="preserve">7.4 Resultados del pipeline LLM</w:t>
+      </w:r>
+    </w:p>
+    <w:p>
+      <w:pPr>
+        <w:pStyle w:val="Heading3"/>
+        <w:keepNext/>
+      </w:pPr>
+      <w:r>
+        <w:t xml:space="preserve">7.4.1 Corrida de referencia</w:t>
+      </w:r>
+    </w:p>
+    <w:p>
+      <w:pPr>
+        <w:spacing w:after="160" w:line="276"/>
+        <w:jc w:val="both"/>
+      </w:pPr>
+      <w:r>
+        <w:t xml:space="preserve">Los resultados de referencia de este capítulo se obtuvieron sin recurrir a la API de los proveedores comerciales por la vía del SDK: en su lugar se realizó una </w:t>
+      </w:r>
+      <w:r>
+        <w:rPr>
+          <w:i/>
+          <w:iCs/>
+        </w:rPr>
+        <w:t xml:space="preserve">corrida de referencia</w:t>
+      </w:r>
+      <w:r>
+        <w:t xml:space="preserve"> empleando como modelo generativo un asistente de IA generativa, que ejecutó las cuatro etapas del pipeline —extracción, clasificación, descripción y auto-verificación, en la configuración C2c— sobre el corpus de las cuatro entrevistas, produciendo un LEL que luego se midió con el motor de evaluación determinístico.</w:t>
+      </w:r>
+    </w:p>
+    <w:p>
+      <w:pPr>
+        <w:spacing w:after="160" w:line="276"/>
+        <w:jc w:val="both"/>
+      </w:pPr>
+      <w:r>
+        <w:t xml:space="preserve">Esta corrida debe leerse con dos salvedades explícitas. Primero, el </w:t>
+      </w:r>
+      <w:r>
+        <w:rPr>
+          <w:i/>
+          <w:iCs/>
+        </w:rPr>
+        <w:t xml:space="preserve">modelo</w:t>
+      </w:r>
+      <w:r>
+        <w:t xml:space="preserve"> utilizado es el asistente, y no necesariamente representa el desempeño de los modelos comerciales que se someterán a benchmarking en la réplica definitiva. Segundo, aplica una </w:t>
+      </w:r>
+      <w:r>
+        <w:rPr>
+          <w:i/>
+          <w:iCs/>
+        </w:rPr>
+        <w:t xml:space="preserve">salvedad de contaminación</w:t>
+      </w:r>
+      <w:r>
+        <w:t xml:space="preserve">: el operador tuvo exposición previa al Gold Standard durante el desarrollo del trabajo, lo que puede sesgar qué candidatos se seleccionan o cómo se redactan las descripciones. Por ambas razones, los valores que siguen se interpretan como una </w:t>
+      </w:r>
+      <w:r>
+        <w:rPr>
+          <w:i/>
+          <w:iCs/>
+        </w:rPr>
+        <w:t xml:space="preserve">cota optimista</w:t>
+      </w:r>
+      <w:r>
+        <w:t xml:space="preserve"> y como una demostración de que el pipeline produce un LEL real y evaluable, y no como el resultado final del experimento, que requiere una réplica en condiciones ciegas con modelos frescos (Sección 7.9).</w:t>
+      </w:r>
+    </w:p>
+    <w:p>
+      <w:pPr>
+        <w:pStyle w:val="Heading3"/>
+        <w:keepNext/>
+      </w:pPr>
+      <w:r>
+        <w:t xml:space="preserve">7.4.2 Resultados</w:t>
+      </w:r>
+    </w:p>
+    <w:p>
+      <w:pPr>
+        <w:spacing w:after="160" w:line="276"/>
+        <w:jc w:val="both"/>
+      </w:pPr>
+      <w:r>
+        <w:t xml:space="preserve">El LEL producido por el prototipo contiene 19 símbolos descriptos: 8 Sujeto, 8 Objeto y 3 Verbo — ningún Estado, un resultado en sí mismo informativo. La Tabla 7.3 reporta su evaluación contra ambos conjuntos de referencia.</w:t>
+      </w:r>
     </w:p>
     <w:p>
       <w:pPr>
@@ -18252,7 +17392,985 @@
           <w:sz w:val="19"/>
           <w:szCs w:val="19"/>
         </w:rPr>
-        <w:t xml:space="preserve">Tabla 7.5. Comparación del baseline de frecuencia (C1a) y el pipeline LLM (C2c) frente al GS-Corpus.</w:t>
+        <w:t xml:space="preserve">Tabla 7.3. Pipeline LLM (configuración C2c, modelo: asistente) sobre el corpus de cuatro entrevistas reales.</w:t>
+      </w:r>
+    </w:p>
+    <w:tbl>
+      <w:tblPr>
+        <w:tblW w:type="dxa" w:w="8480"/>
+        <w:tblBorders>
+          <w:top w:val="single" w:color="auto" w:sz="4"/>
+          <w:left w:val="single" w:color="auto" w:sz="4"/>
+          <w:bottom w:val="single" w:color="auto" w:sz="4"/>
+          <w:right w:val="single" w:color="auto" w:sz="4"/>
+          <w:insideH w:val="single" w:color="auto" w:sz="4"/>
+          <w:insideV w:val="single" w:color="auto" w:sz="4"/>
+        </w:tblBorders>
+      </w:tblPr>
+      <w:tblGrid>
+        <w:gridCol w:w="2100"/>
+        <w:gridCol w:w="500"/>
+        <w:gridCol w:w="500"/>
+        <w:gridCol w:w="500"/>
+        <w:gridCol w:w="1180"/>
+        <w:gridCol w:w="1240"/>
+        <w:gridCol w:w="900"/>
+        <w:gridCol w:w="780"/>
+        <w:gridCol w:w="780"/>
+      </w:tblGrid>
+      <w:tr>
+        <w:trPr>
+          <w:cantSplit/>
+          <w:tblHeader/>
+        </w:trPr>
+        <w:tc>
+          <w:tcPr>
+            <w:tcW w:type="dxa" w:w="2100"/>
+            <w:tcBorders>
+              <w:top w:val="single" w:color="BFBFBF" w:sz="4"/>
+              <w:left w:val="single" w:color="BFBFBF" w:sz="4"/>
+              <w:bottom w:val="single" w:color="BFBFBF" w:sz="4"/>
+              <w:right w:val="single" w:color="BFBFBF" w:sz="4"/>
+            </w:tcBorders>
+            <w:shd w:fill="1F4E79" w:val="clear"/>
+            <w:tcMar>
+              <w:top w:type="dxa" w:w="70"/>
+              <w:left w:type="dxa" w:w="110"/>
+              <w:bottom w:type="dxa" w:w="70"/>
+              <w:right w:type="dxa" w:w="110"/>
+            </w:tcMar>
+            <w:vAlign w:val="center"/>
+          </w:tcPr>
+          <w:p>
+            <w:r>
+              <w:rPr>
+                <w:b/>
+                <w:bCs/>
+                <w:color w:val="FFFFFF"/>
+                <w:sz w:val="20"/>
+                <w:szCs w:val="20"/>
+              </w:rPr>
+              <w:t xml:space="preserve">Blanco de comparación</w:t>
+            </w:r>
+          </w:p>
+        </w:tc>
+        <w:tc>
+          <w:tcPr>
+            <w:tcW w:type="dxa" w:w="500"/>
+            <w:tcBorders>
+              <w:top w:val="single" w:color="BFBFBF" w:sz="4"/>
+              <w:left w:val="single" w:color="BFBFBF" w:sz="4"/>
+              <w:bottom w:val="single" w:color="BFBFBF" w:sz="4"/>
+              <w:right w:val="single" w:color="BFBFBF" w:sz="4"/>
+            </w:tcBorders>
+            <w:shd w:fill="1F4E79" w:val="clear"/>
+            <w:tcMar>
+              <w:top w:type="dxa" w:w="70"/>
+              <w:left w:type="dxa" w:w="110"/>
+              <w:bottom w:type="dxa" w:w="70"/>
+              <w:right w:type="dxa" w:w="110"/>
+            </w:tcMar>
+            <w:vAlign w:val="center"/>
+          </w:tcPr>
+          <w:p>
+            <w:r>
+              <w:rPr>
+                <w:b/>
+                <w:bCs/>
+                <w:color w:val="FFFFFF"/>
+                <w:sz w:val="20"/>
+                <w:szCs w:val="20"/>
+              </w:rPr>
+              <w:t xml:space="preserve">VP</w:t>
+            </w:r>
+          </w:p>
+        </w:tc>
+        <w:tc>
+          <w:tcPr>
+            <w:tcW w:type="dxa" w:w="500"/>
+            <w:tcBorders>
+              <w:top w:val="single" w:color="BFBFBF" w:sz="4"/>
+              <w:left w:val="single" w:color="BFBFBF" w:sz="4"/>
+              <w:bottom w:val="single" w:color="BFBFBF" w:sz="4"/>
+              <w:right w:val="single" w:color="BFBFBF" w:sz="4"/>
+            </w:tcBorders>
+            <w:shd w:fill="1F4E79" w:val="clear"/>
+            <w:tcMar>
+              <w:top w:type="dxa" w:w="70"/>
+              <w:left w:type="dxa" w:w="110"/>
+              <w:bottom w:type="dxa" w:w="70"/>
+              <w:right w:type="dxa" w:w="110"/>
+            </w:tcMar>
+            <w:vAlign w:val="center"/>
+          </w:tcPr>
+          <w:p>
+            <w:r>
+              <w:rPr>
+                <w:b/>
+                <w:bCs/>
+                <w:color w:val="FFFFFF"/>
+                <w:sz w:val="20"/>
+                <w:szCs w:val="20"/>
+              </w:rPr>
+              <w:t xml:space="preserve">FP</w:t>
+            </w:r>
+          </w:p>
+        </w:tc>
+        <w:tc>
+          <w:tcPr>
+            <w:tcW w:type="dxa" w:w="500"/>
+            <w:tcBorders>
+              <w:top w:val="single" w:color="BFBFBF" w:sz="4"/>
+              <w:left w:val="single" w:color="BFBFBF" w:sz="4"/>
+              <w:bottom w:val="single" w:color="BFBFBF" w:sz="4"/>
+              <w:right w:val="single" w:color="BFBFBF" w:sz="4"/>
+            </w:tcBorders>
+            <w:shd w:fill="1F4E79" w:val="clear"/>
+            <w:tcMar>
+              <w:top w:type="dxa" w:w="70"/>
+              <w:left w:type="dxa" w:w="110"/>
+              <w:bottom w:type="dxa" w:w="70"/>
+              <w:right w:type="dxa" w:w="110"/>
+            </w:tcMar>
+            <w:vAlign w:val="center"/>
+          </w:tcPr>
+          <w:p>
+            <w:r>
+              <w:rPr>
+                <w:b/>
+                <w:bCs/>
+                <w:color w:val="FFFFFF"/>
+                <w:sz w:val="20"/>
+                <w:szCs w:val="20"/>
+              </w:rPr>
+              <w:t xml:space="preserve">FN</w:t>
+            </w:r>
+          </w:p>
+        </w:tc>
+        <w:tc>
+          <w:tcPr>
+            <w:tcW w:type="dxa" w:w="1180"/>
+            <w:tcBorders>
+              <w:top w:val="single" w:color="BFBFBF" w:sz="4"/>
+              <w:left w:val="single" w:color="BFBFBF" w:sz="4"/>
+              <w:bottom w:val="single" w:color="BFBFBF" w:sz="4"/>
+              <w:right w:val="single" w:color="BFBFBF" w:sz="4"/>
+            </w:tcBorders>
+            <w:shd w:fill="1F4E79" w:val="clear"/>
+            <w:tcMar>
+              <w:top w:type="dxa" w:w="70"/>
+              <w:left w:type="dxa" w:w="110"/>
+              <w:bottom w:type="dxa" w:w="70"/>
+              <w:right w:type="dxa" w:w="110"/>
+            </w:tcMar>
+            <w:vAlign w:val="center"/>
+          </w:tcPr>
+          <w:p>
+            <w:r>
+              <w:rPr>
+                <w:b/>
+                <w:bCs/>
+                <w:color w:val="FFFFFF"/>
+                <w:sz w:val="20"/>
+                <w:szCs w:val="20"/>
+              </w:rPr>
+              <w:t xml:space="preserve">Precisión</w:t>
+            </w:r>
+          </w:p>
+        </w:tc>
+        <w:tc>
+          <w:tcPr>
+            <w:tcW w:type="dxa" w:w="1240"/>
+            <w:tcBorders>
+              <w:top w:val="single" w:color="BFBFBF" w:sz="4"/>
+              <w:left w:val="single" w:color="BFBFBF" w:sz="4"/>
+              <w:bottom w:val="single" w:color="BFBFBF" w:sz="4"/>
+              <w:right w:val="single" w:color="BFBFBF" w:sz="4"/>
+            </w:tcBorders>
+            <w:shd w:fill="1F4E79" w:val="clear"/>
+            <w:tcMar>
+              <w:top w:type="dxa" w:w="70"/>
+              <w:left w:type="dxa" w:w="110"/>
+              <w:bottom w:type="dxa" w:w="70"/>
+              <w:right w:type="dxa" w:w="110"/>
+            </w:tcMar>
+            <w:vAlign w:val="center"/>
+          </w:tcPr>
+          <w:p>
+            <w:r>
+              <w:rPr>
+                <w:b/>
+                <w:bCs/>
+                <w:color w:val="FFFFFF"/>
+                <w:sz w:val="20"/>
+                <w:szCs w:val="20"/>
+              </w:rPr>
+              <w:t xml:space="preserve">Cobertura</w:t>
+            </w:r>
+          </w:p>
+        </w:tc>
+        <w:tc>
+          <w:tcPr>
+            <w:tcW w:type="dxa" w:w="900"/>
+            <w:tcBorders>
+              <w:top w:val="single" w:color="BFBFBF" w:sz="4"/>
+              <w:left w:val="single" w:color="BFBFBF" w:sz="4"/>
+              <w:bottom w:val="single" w:color="BFBFBF" w:sz="4"/>
+              <w:right w:val="single" w:color="BFBFBF" w:sz="4"/>
+            </w:tcBorders>
+            <w:shd w:fill="1F4E79" w:val="clear"/>
+            <w:tcMar>
+              <w:top w:type="dxa" w:w="70"/>
+              <w:left w:type="dxa" w:w="110"/>
+              <w:bottom w:type="dxa" w:w="70"/>
+              <w:right w:type="dxa" w:w="110"/>
+            </w:tcMar>
+            <w:vAlign w:val="center"/>
+          </w:tcPr>
+          <w:p>
+            <w:r>
+              <w:rPr>
+                <w:b/>
+                <w:bCs/>
+                <w:color w:val="FFFFFF"/>
+                <w:sz w:val="20"/>
+                <w:szCs w:val="20"/>
+              </w:rPr>
+              <w:t xml:space="preserve">F1</w:t>
+            </w:r>
+          </w:p>
+        </w:tc>
+        <w:tc>
+          <w:tcPr>
+            <w:tcW w:type="dxa" w:w="780"/>
+            <w:tcBorders>
+              <w:top w:val="single" w:color="BFBFBF" w:sz="4"/>
+              <w:left w:val="single" w:color="BFBFBF" w:sz="4"/>
+              <w:bottom w:val="single" w:color="BFBFBF" w:sz="4"/>
+              <w:right w:val="single" w:color="BFBFBF" w:sz="4"/>
+            </w:tcBorders>
+            <w:shd w:fill="1F4E79" w:val="clear"/>
+            <w:tcMar>
+              <w:top w:type="dxa" w:w="70"/>
+              <w:left w:type="dxa" w:w="110"/>
+              <w:bottom w:type="dxa" w:w="70"/>
+              <w:right w:type="dxa" w:w="110"/>
+            </w:tcMar>
+            <w:vAlign w:val="center"/>
+          </w:tcPr>
+          <w:p>
+            <w:r>
+              <w:rPr>
+                <w:b/>
+                <w:bCs/>
+                <w:color w:val="FFFFFF"/>
+                <w:sz w:val="20"/>
+                <w:szCs w:val="20"/>
+              </w:rPr>
+              <w:t xml:space="preserve">Tipo</w:t>
+            </w:r>
+          </w:p>
+        </w:tc>
+        <w:tc>
+          <w:tcPr>
+            <w:tcW w:type="dxa" w:w="780"/>
+            <w:tcBorders>
+              <w:top w:val="single" w:color="BFBFBF" w:sz="4"/>
+              <w:left w:val="single" w:color="BFBFBF" w:sz="4"/>
+              <w:bottom w:val="single" w:color="BFBFBF" w:sz="4"/>
+              <w:right w:val="single" w:color="BFBFBF" w:sz="4"/>
+            </w:tcBorders>
+            <w:shd w:fill="1F4E79" w:val="clear"/>
+            <w:tcMar>
+              <w:top w:type="dxa" w:w="70"/>
+              <w:left w:type="dxa" w:w="110"/>
+              <w:bottom w:type="dxa" w:w="70"/>
+              <w:right w:type="dxa" w:w="110"/>
+            </w:tcMar>
+            <w:vAlign w:val="center"/>
+          </w:tcPr>
+          <w:p>
+            <w:r>
+              <w:rPr>
+                <w:b/>
+                <w:bCs/>
+                <w:color w:val="FFFFFF"/>
+                <w:sz w:val="20"/>
+                <w:szCs w:val="20"/>
+              </w:rPr>
+              <w:t xml:space="preserve">Descr.</w:t>
+            </w:r>
+          </w:p>
+        </w:tc>
+      </w:tr>
+      <w:tr>
+        <w:trPr>
+          <w:cantSplit/>
+        </w:trPr>
+        <w:tc>
+          <w:tcPr>
+            <w:tcW w:type="dxa" w:w="2100"/>
+            <w:tcBorders>
+              <w:top w:val="single" w:color="BFBFBF" w:sz="4"/>
+              <w:left w:val="single" w:color="BFBFBF" w:sz="4"/>
+              <w:bottom w:val="single" w:color="BFBFBF" w:sz="4"/>
+              <w:right w:val="single" w:color="BFBFBF" w:sz="4"/>
+            </w:tcBorders>
+            <w:shd w:fill="FFFFFF" w:val="clear"/>
+            <w:tcMar>
+              <w:top w:type="dxa" w:w="60"/>
+              <w:left w:type="dxa" w:w="110"/>
+              <w:bottom w:type="dxa" w:w="60"/>
+              <w:right w:type="dxa" w:w="110"/>
+            </w:tcMar>
+            <w:vAlign w:val="center"/>
+          </w:tcPr>
+          <w:p>
+            <w:pPr>
+              <w:spacing w:line="250"/>
+            </w:pPr>
+            <w:r>
+              <w:t xml:space="preserve">GS-Corpus (15)</w:t>
+            </w:r>
+          </w:p>
+        </w:tc>
+        <w:tc>
+          <w:tcPr>
+            <w:tcW w:type="dxa" w:w="500"/>
+            <w:tcBorders>
+              <w:top w:val="single" w:color="BFBFBF" w:sz="4"/>
+              <w:left w:val="single" w:color="BFBFBF" w:sz="4"/>
+              <w:bottom w:val="single" w:color="BFBFBF" w:sz="4"/>
+              <w:right w:val="single" w:color="BFBFBF" w:sz="4"/>
+            </w:tcBorders>
+            <w:shd w:fill="FFFFFF" w:val="clear"/>
+            <w:tcMar>
+              <w:top w:type="dxa" w:w="60"/>
+              <w:left w:type="dxa" w:w="110"/>
+              <w:bottom w:type="dxa" w:w="60"/>
+              <w:right w:type="dxa" w:w="110"/>
+            </w:tcMar>
+            <w:vAlign w:val="center"/>
+          </w:tcPr>
+          <w:p>
+            <w:pPr>
+              <w:spacing w:line="250"/>
+            </w:pPr>
+            <w:r>
+              <w:t xml:space="preserve">9</w:t>
+            </w:r>
+          </w:p>
+        </w:tc>
+        <w:tc>
+          <w:tcPr>
+            <w:tcW w:type="dxa" w:w="500"/>
+            <w:tcBorders>
+              <w:top w:val="single" w:color="BFBFBF" w:sz="4"/>
+              <w:left w:val="single" w:color="BFBFBF" w:sz="4"/>
+              <w:bottom w:val="single" w:color="BFBFBF" w:sz="4"/>
+              <w:right w:val="single" w:color="BFBFBF" w:sz="4"/>
+            </w:tcBorders>
+            <w:shd w:fill="FFFFFF" w:val="clear"/>
+            <w:tcMar>
+              <w:top w:type="dxa" w:w="60"/>
+              <w:left w:type="dxa" w:w="110"/>
+              <w:bottom w:type="dxa" w:w="60"/>
+              <w:right w:type="dxa" w:w="110"/>
+            </w:tcMar>
+            <w:vAlign w:val="center"/>
+          </w:tcPr>
+          <w:p>
+            <w:pPr>
+              <w:spacing w:line="250"/>
+            </w:pPr>
+            <w:r>
+              <w:t xml:space="preserve">10</w:t>
+            </w:r>
+          </w:p>
+        </w:tc>
+        <w:tc>
+          <w:tcPr>
+            <w:tcW w:type="dxa" w:w="500"/>
+            <w:tcBorders>
+              <w:top w:val="single" w:color="BFBFBF" w:sz="4"/>
+              <w:left w:val="single" w:color="BFBFBF" w:sz="4"/>
+              <w:bottom w:val="single" w:color="BFBFBF" w:sz="4"/>
+              <w:right w:val="single" w:color="BFBFBF" w:sz="4"/>
+            </w:tcBorders>
+            <w:shd w:fill="FFFFFF" w:val="clear"/>
+            <w:tcMar>
+              <w:top w:type="dxa" w:w="60"/>
+              <w:left w:type="dxa" w:w="110"/>
+              <w:bottom w:type="dxa" w:w="60"/>
+              <w:right w:type="dxa" w:w="110"/>
+            </w:tcMar>
+            <w:vAlign w:val="center"/>
+          </w:tcPr>
+          <w:p>
+            <w:pPr>
+              <w:spacing w:line="250"/>
+            </w:pPr>
+            <w:r>
+              <w:t xml:space="preserve">6</w:t>
+            </w:r>
+          </w:p>
+        </w:tc>
+        <w:tc>
+          <w:tcPr>
+            <w:tcW w:type="dxa" w:w="1180"/>
+            <w:tcBorders>
+              <w:top w:val="single" w:color="BFBFBF" w:sz="4"/>
+              <w:left w:val="single" w:color="BFBFBF" w:sz="4"/>
+              <w:bottom w:val="single" w:color="BFBFBF" w:sz="4"/>
+              <w:right w:val="single" w:color="BFBFBF" w:sz="4"/>
+            </w:tcBorders>
+            <w:shd w:fill="FFFFFF" w:val="clear"/>
+            <w:tcMar>
+              <w:top w:type="dxa" w:w="60"/>
+              <w:left w:type="dxa" w:w="110"/>
+              <w:bottom w:type="dxa" w:w="60"/>
+              <w:right w:type="dxa" w:w="110"/>
+            </w:tcMar>
+            <w:vAlign w:val="center"/>
+          </w:tcPr>
+          <w:p>
+            <w:pPr>
+              <w:spacing w:line="250"/>
+            </w:pPr>
+            <w:r>
+              <w:t xml:space="preserve">0,474</w:t>
+            </w:r>
+          </w:p>
+        </w:tc>
+        <w:tc>
+          <w:tcPr>
+            <w:tcW w:type="dxa" w:w="1240"/>
+            <w:tcBorders>
+              <w:top w:val="single" w:color="BFBFBF" w:sz="4"/>
+              <w:left w:val="single" w:color="BFBFBF" w:sz="4"/>
+              <w:bottom w:val="single" w:color="BFBFBF" w:sz="4"/>
+              <w:right w:val="single" w:color="BFBFBF" w:sz="4"/>
+            </w:tcBorders>
+            <w:shd w:fill="FFFFFF" w:val="clear"/>
+            <w:tcMar>
+              <w:top w:type="dxa" w:w="60"/>
+              <w:left w:type="dxa" w:w="110"/>
+              <w:bottom w:type="dxa" w:w="60"/>
+              <w:right w:type="dxa" w:w="110"/>
+            </w:tcMar>
+            <w:vAlign w:val="center"/>
+          </w:tcPr>
+          <w:p>
+            <w:pPr>
+              <w:spacing w:line="250"/>
+            </w:pPr>
+            <w:r>
+              <w:t xml:space="preserve">0,600</w:t>
+            </w:r>
+          </w:p>
+        </w:tc>
+        <w:tc>
+          <w:tcPr>
+            <w:tcW w:type="dxa" w:w="900"/>
+            <w:tcBorders>
+              <w:top w:val="single" w:color="BFBFBF" w:sz="4"/>
+              <w:left w:val="single" w:color="BFBFBF" w:sz="4"/>
+              <w:bottom w:val="single" w:color="BFBFBF" w:sz="4"/>
+              <w:right w:val="single" w:color="BFBFBF" w:sz="4"/>
+            </w:tcBorders>
+            <w:shd w:fill="FFFFFF" w:val="clear"/>
+            <w:tcMar>
+              <w:top w:type="dxa" w:w="60"/>
+              <w:left w:type="dxa" w:w="110"/>
+              <w:bottom w:type="dxa" w:w="60"/>
+              <w:right w:type="dxa" w:w="110"/>
+            </w:tcMar>
+            <w:vAlign w:val="center"/>
+          </w:tcPr>
+          <w:p>
+            <w:pPr>
+              <w:spacing w:line="250"/>
+            </w:pPr>
+            <w:r>
+              <w:t xml:space="preserve">0,529</w:t>
+            </w:r>
+          </w:p>
+        </w:tc>
+        <w:tc>
+          <w:tcPr>
+            <w:tcW w:type="dxa" w:w="780"/>
+            <w:tcBorders>
+              <w:top w:val="single" w:color="BFBFBF" w:sz="4"/>
+              <w:left w:val="single" w:color="BFBFBF" w:sz="4"/>
+              <w:bottom w:val="single" w:color="BFBFBF" w:sz="4"/>
+              <w:right w:val="single" w:color="BFBFBF" w:sz="4"/>
+            </w:tcBorders>
+            <w:shd w:fill="FFFFFF" w:val="clear"/>
+            <w:tcMar>
+              <w:top w:type="dxa" w:w="60"/>
+              <w:left w:type="dxa" w:w="110"/>
+              <w:bottom w:type="dxa" w:w="60"/>
+              <w:right w:type="dxa" w:w="110"/>
+            </w:tcMar>
+            <w:vAlign w:val="center"/>
+          </w:tcPr>
+          <w:p>
+            <w:pPr>
+              <w:spacing w:line="250"/>
+            </w:pPr>
+            <w:r>
+              <w:t xml:space="preserve">0,889</w:t>
+            </w:r>
+          </w:p>
+        </w:tc>
+        <w:tc>
+          <w:tcPr>
+            <w:tcW w:type="dxa" w:w="780"/>
+            <w:tcBorders>
+              <w:top w:val="single" w:color="BFBFBF" w:sz="4"/>
+              <w:left w:val="single" w:color="BFBFBF" w:sz="4"/>
+              <w:bottom w:val="single" w:color="BFBFBF" w:sz="4"/>
+              <w:right w:val="single" w:color="BFBFBF" w:sz="4"/>
+            </w:tcBorders>
+            <w:shd w:fill="FFFFFF" w:val="clear"/>
+            <w:tcMar>
+              <w:top w:type="dxa" w:w="60"/>
+              <w:left w:type="dxa" w:w="110"/>
+              <w:bottom w:type="dxa" w:w="60"/>
+              <w:right w:type="dxa" w:w="110"/>
+            </w:tcMar>
+            <w:vAlign w:val="center"/>
+          </w:tcPr>
+          <w:p>
+            <w:pPr>
+              <w:spacing w:line="250"/>
+            </w:pPr>
+            <w:r>
+              <w:t xml:space="preserve">100 %</w:t>
+            </w:r>
+          </w:p>
+        </w:tc>
+      </w:tr>
+      <w:tr>
+        <w:trPr>
+          <w:cantSplit/>
+        </w:trPr>
+        <w:tc>
+          <w:tcPr>
+            <w:tcW w:type="dxa" w:w="2100"/>
+            <w:tcBorders>
+              <w:top w:val="single" w:color="BFBFBF" w:sz="4"/>
+              <w:left w:val="single" w:color="BFBFBF" w:sz="4"/>
+              <w:bottom w:val="single" w:color="BFBFBF" w:sz="4"/>
+              <w:right w:val="single" w:color="BFBFBF" w:sz="4"/>
+            </w:tcBorders>
+            <w:shd w:fill="F2F6FB" w:val="clear"/>
+            <w:tcMar>
+              <w:top w:type="dxa" w:w="60"/>
+              <w:left w:type="dxa" w:w="110"/>
+              <w:bottom w:type="dxa" w:w="60"/>
+              <w:right w:type="dxa" w:w="110"/>
+            </w:tcMar>
+            <w:vAlign w:val="center"/>
+          </w:tcPr>
+          <w:p>
+            <w:pPr>
+              <w:spacing w:line="250"/>
+            </w:pPr>
+            <w:r>
+              <w:t xml:space="preserve">GS-Completo (21)</w:t>
+            </w:r>
+          </w:p>
+        </w:tc>
+        <w:tc>
+          <w:tcPr>
+            <w:tcW w:type="dxa" w:w="500"/>
+            <w:tcBorders>
+              <w:top w:val="single" w:color="BFBFBF" w:sz="4"/>
+              <w:left w:val="single" w:color="BFBFBF" w:sz="4"/>
+              <w:bottom w:val="single" w:color="BFBFBF" w:sz="4"/>
+              <w:right w:val="single" w:color="BFBFBF" w:sz="4"/>
+            </w:tcBorders>
+            <w:shd w:fill="F2F6FB" w:val="clear"/>
+            <w:tcMar>
+              <w:top w:type="dxa" w:w="60"/>
+              <w:left w:type="dxa" w:w="110"/>
+              <w:bottom w:type="dxa" w:w="60"/>
+              <w:right w:type="dxa" w:w="110"/>
+            </w:tcMar>
+            <w:vAlign w:val="center"/>
+          </w:tcPr>
+          <w:p>
+            <w:pPr>
+              <w:spacing w:line="250"/>
+            </w:pPr>
+            <w:r>
+              <w:t xml:space="preserve">10</w:t>
+            </w:r>
+          </w:p>
+        </w:tc>
+        <w:tc>
+          <w:tcPr>
+            <w:tcW w:type="dxa" w:w="500"/>
+            <w:tcBorders>
+              <w:top w:val="single" w:color="BFBFBF" w:sz="4"/>
+              <w:left w:val="single" w:color="BFBFBF" w:sz="4"/>
+              <w:bottom w:val="single" w:color="BFBFBF" w:sz="4"/>
+              <w:right w:val="single" w:color="BFBFBF" w:sz="4"/>
+            </w:tcBorders>
+            <w:shd w:fill="F2F6FB" w:val="clear"/>
+            <w:tcMar>
+              <w:top w:type="dxa" w:w="60"/>
+              <w:left w:type="dxa" w:w="110"/>
+              <w:bottom w:type="dxa" w:w="60"/>
+              <w:right w:type="dxa" w:w="110"/>
+            </w:tcMar>
+            <w:vAlign w:val="center"/>
+          </w:tcPr>
+          <w:p>
+            <w:pPr>
+              <w:spacing w:line="250"/>
+            </w:pPr>
+            <w:r>
+              <w:t xml:space="preserve">9</w:t>
+            </w:r>
+          </w:p>
+        </w:tc>
+        <w:tc>
+          <w:tcPr>
+            <w:tcW w:type="dxa" w:w="500"/>
+            <w:tcBorders>
+              <w:top w:val="single" w:color="BFBFBF" w:sz="4"/>
+              <w:left w:val="single" w:color="BFBFBF" w:sz="4"/>
+              <w:bottom w:val="single" w:color="BFBFBF" w:sz="4"/>
+              <w:right w:val="single" w:color="BFBFBF" w:sz="4"/>
+            </w:tcBorders>
+            <w:shd w:fill="F2F6FB" w:val="clear"/>
+            <w:tcMar>
+              <w:top w:type="dxa" w:w="60"/>
+              <w:left w:type="dxa" w:w="110"/>
+              <w:bottom w:type="dxa" w:w="60"/>
+              <w:right w:type="dxa" w:w="110"/>
+            </w:tcMar>
+            <w:vAlign w:val="center"/>
+          </w:tcPr>
+          <w:p>
+            <w:pPr>
+              <w:spacing w:line="250"/>
+            </w:pPr>
+            <w:r>
+              <w:t xml:space="preserve">11</w:t>
+            </w:r>
+          </w:p>
+        </w:tc>
+        <w:tc>
+          <w:tcPr>
+            <w:tcW w:type="dxa" w:w="1180"/>
+            <w:tcBorders>
+              <w:top w:val="single" w:color="BFBFBF" w:sz="4"/>
+              <w:left w:val="single" w:color="BFBFBF" w:sz="4"/>
+              <w:bottom w:val="single" w:color="BFBFBF" w:sz="4"/>
+              <w:right w:val="single" w:color="BFBFBF" w:sz="4"/>
+            </w:tcBorders>
+            <w:shd w:fill="F2F6FB" w:val="clear"/>
+            <w:tcMar>
+              <w:top w:type="dxa" w:w="60"/>
+              <w:left w:type="dxa" w:w="110"/>
+              <w:bottom w:type="dxa" w:w="60"/>
+              <w:right w:type="dxa" w:w="110"/>
+            </w:tcMar>
+            <w:vAlign w:val="center"/>
+          </w:tcPr>
+          <w:p>
+            <w:pPr>
+              <w:spacing w:line="250"/>
+            </w:pPr>
+            <w:r>
+              <w:t xml:space="preserve">0,526</w:t>
+            </w:r>
+          </w:p>
+        </w:tc>
+        <w:tc>
+          <w:tcPr>
+            <w:tcW w:type="dxa" w:w="1240"/>
+            <w:tcBorders>
+              <w:top w:val="single" w:color="BFBFBF" w:sz="4"/>
+              <w:left w:val="single" w:color="BFBFBF" w:sz="4"/>
+              <w:bottom w:val="single" w:color="BFBFBF" w:sz="4"/>
+              <w:right w:val="single" w:color="BFBFBF" w:sz="4"/>
+            </w:tcBorders>
+            <w:shd w:fill="F2F6FB" w:val="clear"/>
+            <w:tcMar>
+              <w:top w:type="dxa" w:w="60"/>
+              <w:left w:type="dxa" w:w="110"/>
+              <w:bottom w:type="dxa" w:w="60"/>
+              <w:right w:type="dxa" w:w="110"/>
+            </w:tcMar>
+            <w:vAlign w:val="center"/>
+          </w:tcPr>
+          <w:p>
+            <w:pPr>
+              <w:spacing w:line="250"/>
+            </w:pPr>
+            <w:r>
+              <w:t xml:space="preserve">0,476</w:t>
+            </w:r>
+          </w:p>
+        </w:tc>
+        <w:tc>
+          <w:tcPr>
+            <w:tcW w:type="dxa" w:w="900"/>
+            <w:tcBorders>
+              <w:top w:val="single" w:color="BFBFBF" w:sz="4"/>
+              <w:left w:val="single" w:color="BFBFBF" w:sz="4"/>
+              <w:bottom w:val="single" w:color="BFBFBF" w:sz="4"/>
+              <w:right w:val="single" w:color="BFBFBF" w:sz="4"/>
+            </w:tcBorders>
+            <w:shd w:fill="F2F6FB" w:val="clear"/>
+            <w:tcMar>
+              <w:top w:type="dxa" w:w="60"/>
+              <w:left w:type="dxa" w:w="110"/>
+              <w:bottom w:type="dxa" w:w="60"/>
+              <w:right w:type="dxa" w:w="110"/>
+            </w:tcMar>
+            <w:vAlign w:val="center"/>
+          </w:tcPr>
+          <w:p>
+            <w:pPr>
+              <w:spacing w:line="250"/>
+            </w:pPr>
+            <w:r>
+              <w:t xml:space="preserve">0,500</w:t>
+            </w:r>
+          </w:p>
+        </w:tc>
+        <w:tc>
+          <w:tcPr>
+            <w:tcW w:type="dxa" w:w="780"/>
+            <w:tcBorders>
+              <w:top w:val="single" w:color="BFBFBF" w:sz="4"/>
+              <w:left w:val="single" w:color="BFBFBF" w:sz="4"/>
+              <w:bottom w:val="single" w:color="BFBFBF" w:sz="4"/>
+              <w:right w:val="single" w:color="BFBFBF" w:sz="4"/>
+            </w:tcBorders>
+            <w:shd w:fill="F2F6FB" w:val="clear"/>
+            <w:tcMar>
+              <w:top w:type="dxa" w:w="60"/>
+              <w:left w:type="dxa" w:w="110"/>
+              <w:bottom w:type="dxa" w:w="60"/>
+              <w:right w:type="dxa" w:w="110"/>
+            </w:tcMar>
+            <w:vAlign w:val="center"/>
+          </w:tcPr>
+          <w:p>
+            <w:pPr>
+              <w:spacing w:line="250"/>
+            </w:pPr>
+            <w:r>
+              <w:t xml:space="preserve">0,900</w:t>
+            </w:r>
+          </w:p>
+        </w:tc>
+        <w:tc>
+          <w:tcPr>
+            <w:tcW w:type="dxa" w:w="780"/>
+            <w:tcBorders>
+              <w:top w:val="single" w:color="BFBFBF" w:sz="4"/>
+              <w:left w:val="single" w:color="BFBFBF" w:sz="4"/>
+              <w:bottom w:val="single" w:color="BFBFBF" w:sz="4"/>
+              <w:right w:val="single" w:color="BFBFBF" w:sz="4"/>
+            </w:tcBorders>
+            <w:shd w:fill="F2F6FB" w:val="clear"/>
+            <w:tcMar>
+              <w:top w:type="dxa" w:w="60"/>
+              <w:left w:type="dxa" w:w="110"/>
+              <w:bottom w:type="dxa" w:w="60"/>
+              <w:right w:type="dxa" w:w="110"/>
+            </w:tcMar>
+            <w:vAlign w:val="center"/>
+          </w:tcPr>
+          <w:p>
+            <w:pPr>
+              <w:spacing w:line="250"/>
+            </w:pPr>
+            <w:r>
+              <w:t xml:space="preserve">100 %</w:t>
+            </w:r>
+          </w:p>
+        </w:tc>
+      </w:tr>
+    </w:tbl>
+    <w:p>
+      <w:pPr>
+        <w:spacing w:after="120"/>
+      </w:pPr>
+    </w:p>
+    <w:p>
+      <w:pPr>
+        <w:spacing w:after="160" w:line="276"/>
+        <w:jc w:val="both"/>
+      </w:pPr>
+      <w:r>
+        <w:t xml:space="preserve">Contra el GS-Corpus —el blanco alcanzable desde el corpus disponible—, el pipeline alcanza una </w:t>
+      </w:r>
+      <w:r>
+        <w:rPr>
+          <w:i/>
+          <w:iCs/>
+        </w:rPr>
+        <w:t xml:space="preserve">cobertura de 0,600</w:t>
+      </w:r>
+      <w:r>
+        <w:t xml:space="preserve"> (9 de 15 símbolos), una </w:t>
+      </w:r>
+      <w:r>
+        <w:rPr>
+          <w:i/>
+          <w:iCs/>
+        </w:rPr>
+        <w:t xml:space="preserve">precisión de 0,474</w:t>
+      </w:r>
+      <w:r>
+        <w:t xml:space="preserve"> y un </w:t>
+      </w:r>
+      <w:r>
+        <w:rPr>
+          <w:i/>
+          <w:iCs/>
+        </w:rPr>
+        <w:t xml:space="preserve">F1 de 0,529</w:t>
+      </w:r>
+      <w:r>
+        <w:t xml:space="preserve">. Entre los falsos positivos aparecen tres actores legítimos del dominio —</w:t>
+      </w:r>
+      <w:r>
+        <w:rPr>
+          <w:i/>
+          <w:iCs/>
+        </w:rPr>
+        <w:t xml:space="preserve">Dueño</w:t>
+      </w:r>
+      <w:r>
+        <w:t xml:space="preserve">, </w:t>
+      </w:r>
+      <w:r>
+        <w:rPr>
+          <w:i/>
+          <w:iCs/>
+        </w:rPr>
+        <w:t xml:space="preserve">Gerente Comercial</w:t>
+      </w:r>
+      <w:r>
+        <w:t xml:space="preserve"> y </w:t>
+      </w:r>
+      <w:r>
+        <w:rPr>
+          <w:i/>
+          <w:iCs/>
+        </w:rPr>
+        <w:t xml:space="preserve">Responsable ERP</w:t>
+      </w:r>
+      <w:r>
+        <w:t xml:space="preserve">— que no figuran en el Gold Standard de 21 símbolos simplemente porque este último se construyó sin acceso a la entrevista del Responsable ERP; no son alucinaciones sino símbolos plausibles que el Gold Standard original no pudo cubrir. La exactitud de clasificación de tipo es alta (0,889–0,900) y la cobertura de descripciones es del 100 %, la diferencia cualitativa que el baseline de PLN por frecuencia no alcanza.</w:t>
+      </w:r>
+    </w:p>
+    <w:p>
+      <w:pPr>
+        <w:pStyle w:val="Heading3"/>
+        <w:keepNext/>
+      </w:pPr>
+      <w:r>
+        <w:t xml:space="preserve">7.4.3 Comparación con el PLN tradicional</w:t>
+      </w:r>
+    </w:p>
+    <w:p>
+      <w:pPr>
+        <w:spacing w:after="160" w:line="276"/>
+        <w:jc w:val="both"/>
+      </w:pPr>
+      <w:r>
+        <w:t xml:space="preserve">El contraste con el baseline de frecuencia, frente al mismo blanco de comparación (GS-Corpus), es nítido (Fig. 7.2).</w:t>
+      </w:r>
+    </w:p>
+    <w:p>
+      <w:pPr>
+        <w:keepNext/>
+        <w:spacing w:after="60" w:before="160"/>
+        <w:jc w:val="center"/>
+      </w:pPr>
+      <w:r>
+        <w:drawing>
+          <wp:inline distT="0" distB="0" distL="0" distR="0">
+            <wp:extent cx="5334000" cy="2667000"/>
+            <wp:effectExtent t="0" r="0" b="0" l="0"/>
+            <wp:docPr id="1" name="" descr="" title=""/>
+            <wp:cNvGraphicFramePr>
+              <a:graphicFrameLocks xmlns:a="http://schemas.openxmlformats.org/drawingml/2006/main" noChangeAspect="1"/>
+            </wp:cNvGraphicFramePr>
+            <a:graphic xmlns:a="http://schemas.openxmlformats.org/drawingml/2006/main">
+              <a:graphicData uri="http://schemas.openxmlformats.org/drawingml/2006/picture">
+                <pic:pic xmlns:pic="http://schemas.openxmlformats.org/drawingml/2006/picture">
+                  <pic:nvPicPr>
+                    <pic:cNvPr id="0" name="" descr=""/>
+                    <pic:cNvPicPr>
+                      <a:picLocks noChangeAspect="1" noChangeArrowheads="1"/>
+                    </pic:cNvPicPr>
+                  </pic:nvPicPr>
+                  <pic:blipFill>
+                    <a:blip r:embed="rId26" cstate="none"/>
+                    <a:srcRect/>
+                    <a:stretch>
+                      <a:fillRect/>
+                    </a:stretch>
+                  </pic:blipFill>
+                  <pic:spPr bwMode="auto">
+                    <a:xfrm>
+                      <a:off x="0" y="0"/>
+                      <a:ext cx="5334000" cy="2667000"/>
+                    </a:xfrm>
+                    <a:prstGeom prst="rect">
+                      <a:avLst/>
+                    </a:prstGeom>
+                  </pic:spPr>
+                </pic:pic>
+              </a:graphicData>
+            </a:graphic>
+          </wp:inline>
+        </w:drawing>
+      </w:r>
+    </w:p>
+    <w:p>
+      <w:pPr>
+        <w:keepLines/>
+        <w:spacing w:after="200"/>
+        <w:jc w:val="center"/>
+      </w:pPr>
+      <w:r>
+        <w:rPr>
+          <w:color w:val="333333"/>
+          <w:sz w:val="19"/>
+          <w:szCs w:val="19"/>
+        </w:rPr>
+        <w:t xml:space="preserve">Fig. 7.2. PLN tradicional frente al pipeline LLM en las métricas de identificación, clasificación y descripción, contra el GS-Corpus.</w:t>
+      </w:r>
+    </w:p>
+    <w:p>
+      <w:pPr>
+        <w:spacing w:after="120"/>
+      </w:pPr>
+    </w:p>
+    <w:p>
+      <w:pPr>
+        <w:spacing w:after="70" w:before="180"/>
+        <w:jc w:val="center"/>
+      </w:pPr>
+      <w:r>
+        <w:rPr>
+          <w:color w:val="333333"/>
+          <w:sz w:val="19"/>
+          <w:szCs w:val="19"/>
+        </w:rPr>
+        <w:t xml:space="preserve">Tabla 7.4. Comparación del baseline de frecuencia (C1a) y el pipeline LLM (C2c) frente al GS-Corpus.</w:t>
       </w:r>
     </w:p>
     <w:tbl>
@@ -19148,7 +19266,7 @@
         <w:jc w:val="both"/>
       </w:pPr>
       <w:r>
-        <w:t xml:space="preserve">Para comprobar que el prototipo opera sobre entradas arbitrarias y se comporta de manera consistente fuera de ecoFactory, se generó un caso de muestreo en un dominio distinto: una clínica veterinaria, con dos entrevistas redactadas desde el rol (un veterinario y una recepcionista) y un LEL de referencia de 16 símbolos. Conviene ser explícito sobre su estatus metodológico: como el LEL de referencia fue construido por los mismos autores, este caso vale como demostración de robustez y generalidad, no como evaluación cuantitativa rigurosa —incurriría en la circularidad advertida en el Capítulo 4—; y, como en la Sección 7.4, el LLM es el asistente, con su salvedad de contaminación. Con esos recaudos, los resultados se muestran en la Tabla 7.6.</w:t>
+        <w:t xml:space="preserve">Para comprobar que el prototipo opera sobre entradas arbitrarias y se comporta de manera consistente fuera de ecoFactory, se generó un caso de muestreo en un dominio distinto: una clínica veterinaria, con dos entrevistas redactadas desde el rol (un veterinario y una recepcionista) y un LEL de referencia de 16 símbolos. Conviene ser explícito sobre su estatus metodológico: como el LEL de referencia fue construido por los mismos autores, este caso vale como demostración de robustez y generalidad, no como evaluación cuantitativa rigurosa —incurriría en la circularidad advertida en el Capítulo 4—; y, como en la Sección 7.4, el LLM es el asistente, con su salvedad de contaminación. Con esos recaudos, los resultados se muestran en la Tabla 7.5.</w:t>
       </w:r>
     </w:p>
     <w:p>
@@ -19162,7 +19280,7 @@
           <w:sz w:val="19"/>
           <w:szCs w:val="19"/>
         </w:rPr>
-        <w:t xml:space="preserve">Tabla 7.6. Caso de muestreo (veterinaria): resultados frente al LEL de referencia de 16 símbolos.</w:t>
+        <w:t xml:space="preserve">Tabla 7.5. Caso de muestreo (veterinaria): resultados frente al LEL de referencia de 16 símbolos.</w:t>
       </w:r>
     </w:p>
     <w:tbl>
@@ -20000,7 +20118,7 @@
                     </pic:cNvPicPr>
                   </pic:nvPicPr>
                   <pic:blipFill>
-                    <a:blip r:embed="rId26" cstate="none"/>
+                    <a:blip r:embed="rId27" cstate="none"/>
                     <a:srcRect/>
                     <a:stretch>
                       <a:fillRect/>
@@ -20116,7 +20234,7 @@
         <w:t xml:space="preserve">mock</w:t>
       </w:r>
       <w:r>
-        <w:t xml:space="preserve">, lo que verifica la orquestación completa sin llamar a ningún modelo externo:</w:t>
+        <w:t xml:space="preserve"> —que reproduce, sin llamar a ningún modelo, el LEL de la corrida de referencia—, lo que verifica la orquestación completa (extracción, clasificación, descripción y verificación) sin acceso a la red:</w:t>
       </w:r>
     </w:p>
     <w:p>
@@ -20146,7 +20264,7 @@
           <w:sz w:val="16"/>
           <w:szCs w:val="16"/>
         </w:rPr>
-        <w:t xml:space="preserve">  C2a: OK — 5 símbolos, 5 con noción+impacto</w:t>
+        <w:t xml:space="preserve">  C2a: OK — 19 símbolos, 19 con noción+impacto</w:t>
       </w:r>
       <w:r>
         <w:br/>
@@ -20158,7 +20276,7 @@
           <w:sz w:val="16"/>
           <w:szCs w:val="16"/>
         </w:rPr>
-        <w:t xml:space="preserve">  C2b: OK — 5 símbolos, 5 con noción+impacto</w:t>
+        <w:t xml:space="preserve">  C2b: OK — 19 símbolos, 19 con noción+impacto</w:t>
       </w:r>
       <w:r>
         <w:br/>
@@ -20170,7 +20288,7 @@
           <w:sz w:val="16"/>
           <w:szCs w:val="16"/>
         </w:rPr>
-        <w:t xml:space="preserve">  C2c: OK — 5 símbolos, 5 con noción+impacto</w:t>
+        <w:t xml:space="preserve">  C2c: OK — 19 símbolos, 19 con noción+impacto</w:t>
       </w:r>
       <w:r>
         <w:br/>
@@ -20441,7 +20559,7 @@
         <w:t xml:space="preserve">seis dominios independientes</w:t>
       </w:r>
       <w:r>
-        <w:t xml:space="preserve"> sobre los que se corrió el prototipo. Rige el mismo recaudo metodológico ya señalado: como los LEL de referencia fueron construidos por el autor de este trabajo, estos casos valen como demostración de robustez y generalidad, no como evaluación cuantitativa rigurosa, y el LLM es el asistente. La Tabla 7.7 resume los resultados.</w:t>
+        <w:t xml:space="preserve"> sobre los que se corrió el prototipo. Rige el mismo recaudo metodológico ya señalado: como los LEL de referencia fueron construidos por el autor de este trabajo, estos casos valen como demostración de robustez y generalidad, no como evaluación cuantitativa rigurosa, y el LLM es el asistente. La Tabla 7.6 resume los resultados.</w:t>
       </w:r>
     </w:p>
     <w:p>
@@ -20455,7 +20573,7 @@
           <w:sz w:val="19"/>
           <w:szCs w:val="19"/>
         </w:rPr>
-        <w:t xml:space="preserve">Tabla 7.7. Evaluación multi-dominio: PLN de frecuencia frente al pipeline LLM (F1 contra el LEL de referencia de cada dominio).</w:t>
+        <w:t xml:space="preserve">Tabla 7.6. Evaluación multi-dominio: PLN de frecuencia frente al pipeline LLM (F1 contra el LEL de referencia de cada dominio).</w:t>
       </w:r>
     </w:p>
     <w:tbl>
@@ -22312,7 +22430,7 @@
                     </pic:cNvPicPr>
                   </pic:nvPicPr>
                   <pic:blipFill>
-                    <a:blip r:embed="rId27" cstate="none"/>
+                    <a:blip r:embed="rId28" cstate="none"/>
                     <a:srcRect/>
                     <a:stretch>
                       <a:fillRect/>
@@ -22521,7 +22639,7 @@
         <w:jc w:val="both"/>
       </w:pPr>
       <w:r>
-        <w:t xml:space="preserve">C2a, C2b y C2c con modelos comerciales (réplica ciega). No se ejecutaron. Requieren una clave de API de un proveedor real (OpenAI o Anthropic), no disponible durante la elaboración de este trabajo. El protocolo está completamente especificado —2 a 3 modelos, de 3 a 5 corridas por combinación, temperatura 0,2, sin exposición previa al Gold Standard por parte de quien la ejecute— y listo para correrse con `scripts/run_pipeline_llm.py --config C2a|C2b|C2c`.</w:t>
+        <w:t xml:space="preserve">C2a, C2b y C2c con modelos comerciales (réplica ciega). No se ejecutaron como réplica ciega sistemática. Con posterioridad se verificó, de manera operativa, que el pipeline corre contra la API de un proveedor real (Anthropic; véase el Anexo D), pero la réplica definitiva requiere ejecutarla sin exposición previa al Gold Standard y sobre varios modelos y corridas. El protocolo está completamente especificado —2 a 3 modelos, de 3 a 5 corridas por combinación, temperatura 0,2, sin exposición previa al Gold Standard por parte de quien la ejecute— y listo para correrse con `scripts/run_pipeline_llm.py --config C2a|C2b|C2c`.</w:t>
       </w:r>
     </w:p>
     <w:p>
@@ -22906,571 +23024,6 @@
         <w:drawing>
           <wp:inline distT="0" distB="0" distL="0" distR="0">
             <wp:extent cx="5334000" cy="1857375"/>
-            <wp:effectExtent t="0" r="0" b="0" l="0"/>
-            <wp:docPr id="1" name="" descr="" title=""/>
-            <wp:cNvGraphicFramePr>
-              <a:graphicFrameLocks xmlns:a="http://schemas.openxmlformats.org/drawingml/2006/main" noChangeAspect="1"/>
-            </wp:cNvGraphicFramePr>
-            <a:graphic xmlns:a="http://schemas.openxmlformats.org/drawingml/2006/main">
-              <a:graphicData uri="http://schemas.openxmlformats.org/drawingml/2006/picture">
-                <pic:pic xmlns:pic="http://schemas.openxmlformats.org/drawingml/2006/picture">
-                  <pic:nvPicPr>
-                    <pic:cNvPr id="0" name="" descr=""/>
-                    <pic:cNvPicPr>
-                      <a:picLocks noChangeAspect="1" noChangeArrowheads="1"/>
-                    </pic:cNvPicPr>
-                  </pic:nvPicPr>
-                  <pic:blipFill>
-                    <a:blip r:embed="rId28" cstate="none"/>
-                    <a:srcRect/>
-                    <a:stretch>
-                      <a:fillRect/>
-                    </a:stretch>
-                  </pic:blipFill>
-                  <pic:spPr bwMode="auto">
-                    <a:xfrm>
-                      <a:off x="0" y="0"/>
-                      <a:ext cx="5334000" cy="1857375"/>
-                    </a:xfrm>
-                    <a:prstGeom prst="rect">
-                      <a:avLst/>
-                    </a:prstGeom>
-                  </pic:spPr>
-                </pic:pic>
-              </a:graphicData>
-            </a:graphic>
-          </wp:inline>
-        </w:drawing>
-      </w:r>
-    </w:p>
-    <w:p>
-      <w:pPr>
-        <w:keepLines/>
-        <w:spacing w:after="200"/>
-        <w:jc w:val="center"/>
-      </w:pPr>
-      <w:r>
-        <w:rPr>
-          <w:color w:val="333333"/>
-          <w:sz w:val="19"/>
-          <w:szCs w:val="19"/>
-        </w:rPr>
-        <w:t xml:space="preserve">Fig. 8.1. El LEL generado y la revisión humana: el enfoque generativo desplaza el esfuerzo del ingeniero de redactar el LEL desde cero a revisar y corregir un borrador.</w:t>
-      </w:r>
-    </w:p>
-    <w:p>
-      <w:pPr>
-        <w:spacing w:after="120"/>
-      </w:pPr>
-    </w:p>
-    <w:p>
-      <w:pPr>
-        <w:spacing w:after="160" w:line="276"/>
-        <w:jc w:val="both"/>
-      </w:pPr>
-      <w:r>
-        <w:t xml:space="preserve">Pasar de </w:t>
-      </w:r>
-      <w:r>
-        <w:rPr>
-          <w:i/>
-          <w:iCs/>
-        </w:rPr>
-        <w:t xml:space="preserve">redactar</w:t>
-      </w:r>
-      <w:r>
-        <w:t xml:space="preserve"> a </w:t>
-      </w:r>
-      <w:r>
-        <w:rPr>
-          <w:i/>
-          <w:iCs/>
-        </w:rPr>
-        <w:t xml:space="preserve">revisar</w:t>
-      </w:r>
-      <w:r>
-        <w:t xml:space="preserve"> es, potencialmente, una reducción significativa de esfuerzo, análoga a la diferencia entre escribir un texto y corregir uno ya escrito. La etapa de auto-verificación del prototipo busca, además, que el borrador llegue a la revisión humana con una calidad ya depurada. La cuantificación precisa de este ahorro —usando como referencia el tiempo de construcción manual registrado en el caso— es una de las mediciones a completar con la ejecución del pipeline.</w:t>
-      </w:r>
-    </w:p>
-    <w:p>
-      <w:pPr>
-        <w:spacing w:after="160" w:line="276"/>
-        <w:jc w:val="both"/>
-      </w:pPr>
-      <w:r>
-        <w:t xml:space="preserve">Una pregunta pendiente es si el pipeline, tal como está implementado, admite una iteración posterior a la revisión humana: que el ingeniero corrija o descarte símbolos del LEL y esa lista revisada vuelva a entrar al prototipo para completar o ajustar noción e impacto. Hoy no la admite: el prototipo corre las cuatro etapas de punta a punta sobre un corpus y no expone un punto de entrada intermedio que reciba una lista de símbolos ya clasificada y la lleve directamente al prompt de descripción. Habilitarlo requeriría descomponer `construir_lel` en llamadas independientes por etapa —la función ya está organizada en cuatro pasos discretos, por lo que el cambio es acotado— y queda señalado como trabajo futuro (Sección 9.4), no como algo resuelto en esta versión.</w:t>
-      </w:r>
-    </w:p>
-    <w:p>
-      <w:pPr>
-        <w:pStyle w:val="Heading2"/>
-        <w:keepNext/>
-      </w:pPr>
-      <w:r>
-        <w:t xml:space="preserve">8.6 Sobre la validez de los resultados</w:t>
-      </w:r>
-    </w:p>
-    <w:p>
-      <w:pPr>
-        <w:spacing w:after="160" w:line="276"/>
-        <w:jc w:val="both"/>
-      </w:pPr>
-      <w:r>
-        <w:t xml:space="preserve">Los resultados deben leerse teniendo presentes las amenazas a la validez discutidas en el Capítulo 4. La más relevante es que, si bien ecoFactory es una empresa real, los usuarios entrevistados en el trabajo de origen fueron interpretados en rol y no son personal efectivo de la empresa (Sección 5.1), de modo que las conclusiones valen para ese caso y no pueden extrapolarse sin más a un relevamiento de campo con usuarios finales. A ello se suma que la evaluación se realiza sobre un </w:t>
-      </w:r>
-      <w:r>
-        <w:rPr>
-          <w:i/>
-          <w:iCs/>
-        </w:rPr>
-        <w:t xml:space="preserve">único dominio</w:t>
-      </w:r>
-      <w:r>
-        <w:t xml:space="preserve"> principal, complementado con casos de muestreo en dominios adicionales cuyo corpus sí es simulado por el autor, lo que limita la generalización; que la </w:t>
-      </w:r>
-      <w:r>
-        <w:rPr>
-          <w:i/>
-          <w:iCs/>
-        </w:rPr>
-        <w:t xml:space="preserve">medición primaria</w:t>
-      </w:r>
-      <w:r>
-        <w:t xml:space="preserve"> se restringe a la configuración de corpus original del caso, inmune al sesgo de autoría del LEL; y que la </w:t>
-      </w:r>
-      <w:r>
-        <w:rPr>
-          <w:i/>
-          <w:iCs/>
-        </w:rPr>
-        <w:t xml:space="preserve">variabilidad</w:t>
-      </w:r>
-      <w:r>
-        <w:t xml:space="preserve"> propia de los LLM exige reportar resultados sobre múltiples corridas. La fortaleza compensatoria es que la evaluación es completamente determinística y reproducible, y que el caso aporta un Gold Standard </w:t>
-      </w:r>
-      <w:r>
-        <w:rPr>
-          <w:i/>
-          <w:iCs/>
-        </w:rPr>
-        <w:t xml:space="preserve">previo e independiente</w:t>
-      </w:r>
-      <w:r>
-        <w:t xml:space="preserve"> del prototipo, construido a mano antes del desarrollo de este trabajo final de carrera. Cabe agregar, como elemento a favor de la generalidad, que el prototipo en su configuración C2c se aplicó también a otros seis dominios de muestreo, con resultados consistentes entre sí (Sección 7.8); esos casos, sin embargo, emplean referencias construidas por el propio autor, por lo que valen como indicio de robustez y no como evaluación independiente.</w:t>
-      </w:r>
-    </w:p>
-    <w:p>
-      <w:pPr>
-        <w:pStyle w:val="Heading2"/>
-        <w:keepNext/>
-      </w:pPr>
-      <w:r>
-        <w:t xml:space="preserve">8.7 Un experimento aparte: entrevistas simuladas para ecoFactory</w:t>
-      </w:r>
-    </w:p>
-    <w:p>
-      <w:pPr>
-        <w:spacing w:after="160" w:line="276"/>
-        <w:jc w:val="both"/>
-      </w:pPr>
-      <w:r>
-        <w:t xml:space="preserve">Durante el desarrollo de este trabajo, y antes de disponer de las cuatro transcripciones reales del estudio original, se realizó un experimento adicional que conviene documentar por separado, ya que </w:t>
-      </w:r>
-      <w:r>
-        <w:rPr>
-          <w:i/>
-          <w:iCs/>
-        </w:rPr>
-        <w:t xml:space="preserve">no forma parte de la evaluación de los tratamientos</w:t>
-      </w:r>
-      <w:r>
-        <w:t xml:space="preserve"> del Capítulo 7 —todos ellos corren sobre el mismo corpus real— sino que constituye una prueba de concepto independiente sobre la simulación de entrevistas.</w:t>
-      </w:r>
-    </w:p>
-    <w:p>
-      <w:pPr>
-        <w:spacing w:after="160" w:line="276"/>
-        <w:jc w:val="both"/>
-      </w:pPr>
-      <w:r>
-        <w:t xml:space="preserve">Este experimento preliminar consistió en redactar dos entrevistas </w:t>
-      </w:r>
-      <w:r>
-        <w:rPr>
-          <w:i/>
-          <w:iCs/>
-        </w:rPr>
-        <w:t xml:space="preserve">simuladas</w:t>
-      </w:r>
-      <w:r>
-        <w:t xml:space="preserve"> para dos roles de ecoFactory (el Gerente Comercial y un responsable funcional del ERP), escritas desde el discurso natural de cada rol, para explorar en qué medida un corpus simulado permite reconstruir el LEL. Cuando más tarde se incorporaron las transcripciones reales de esos mismos roles, la comparación entre ambas versiones arrojó un hallazgo metodológico interesante: la entrevista simulada tendía a reproducir el vocabulario exacto del Gold Standard —por ejemplo, introducía explícitamente la distinción «cliente mayorista» / «cliente minorista», mientras que la transcripción real menciona «mayorista» una sola vez y «minorista» ninguna.</w:t>
-      </w:r>
-    </w:p>
-    <w:p>
-      <w:pPr>
-        <w:spacing w:after="160" w:line="276"/>
-        <w:jc w:val="both"/>
-      </w:pPr>
-      <w:r>
-        <w:t xml:space="preserve">La lección es directa y de valor general para la disciplina: redactar entrevistas simuladas con conocimiento previo del resultado esperado —aun con la mejor intención de imparcialidad— tiende a sesgarlas hacia ese resultado, inflando de manera artificial la cobertura que un método pueda alcanzar sobre ellas. Por esa razón, la evaluación de este trabajo se realiza exclusivamente sobre las entrevistas reales, y las simuladas se reservan para los casos de muestreo de otros dominios (Sección 7.8), donde su rol es distinto: allí no existe un Gold Standard previo que puedan copiar, sino que se construyen junto con su referencia para medir la robustez del enfoque en dominios diversos.</w:t>
-      </w:r>
-    </w:p>
-    <w:p>
-      <w:pPr>
-        <w:pStyle w:val="Heading2"/>
-        <w:keepNext/>
-      </w:pPr>
-      <w:r>
-        <w:t xml:space="preserve">8.8 Lecciones aprendidas</w:t>
-      </w:r>
-    </w:p>
-    <w:p>
-      <w:pPr>
-        <w:pStyle w:val="ListParagraph"/>
-        <w:numPr>
-          <w:ilvl w:val="0"/>
-          <w:numId w:val="3"/>
-        </w:numPr>
-        <w:spacing w:after="90" w:line="270"/>
-        <w:jc w:val="both"/>
-      </w:pPr>
-      <w:r>
-        <w:t xml:space="preserve">Separar el problema en identificar, clasificar y describir clarifica tanto el diseño del prototipo como la interpretación de los resultados.</w:t>
-      </w:r>
-    </w:p>
-    <w:p>
-      <w:pPr>
-        <w:pStyle w:val="ListParagraph"/>
-        <w:numPr>
-          <w:ilvl w:val="0"/>
-          <w:numId w:val="3"/>
-        </w:numPr>
-        <w:spacing w:after="90" w:line="270"/>
-        <w:jc w:val="both"/>
-      </w:pPr>
-      <w:r>
-        <w:t xml:space="preserve">La cobertura alcanzable está acotada por el corpus: ningún método puede recuperar lo que no fue elicitado, y esto se sostiene incluso al ampliar el corpus con más entrevistas reales (Sección 5.7).</w:t>
-      </w:r>
-    </w:p>
-    <w:p>
-      <w:pPr>
-        <w:pStyle w:val="ListParagraph"/>
-        <w:numPr>
-          <w:ilvl w:val="0"/>
-          <w:numId w:val="3"/>
-        </w:numPr>
-        <w:spacing w:after="90" w:line="270"/>
-        <w:jc w:val="both"/>
-      </w:pPr>
-      <w:r>
-        <w:t xml:space="preserve">Un método automático puede actuar como revisor del modelo manual, revelando omisiones como la del </w:t>
-      </w:r>
-      <w:r>
-        <w:rPr>
-          <w:i/>
-          <w:iCs/>
-        </w:rPr>
-        <w:t xml:space="preserve">Remito</w:t>
-      </w:r>
-      <w:r>
-        <w:t xml:space="preserve">.</w:t>
-      </w:r>
-    </w:p>
-    <w:p>
-      <w:pPr>
-        <w:pStyle w:val="ListParagraph"/>
-        <w:numPr>
-          <w:ilvl w:val="0"/>
-          <w:numId w:val="3"/>
-        </w:numPr>
-        <w:spacing w:after="90" w:line="270"/>
-        <w:jc w:val="both"/>
-      </w:pPr>
-      <w:r>
-        <w:t xml:space="preserve">Las contradicciones entre actores no son ruido a eliminar, sino información a preservar y un test exigente para cualquier método.</w:t>
-      </w:r>
-    </w:p>
-    <w:p>
-      <w:pPr>
-        <w:pStyle w:val="ListParagraph"/>
-        <w:numPr>
-          <w:ilvl w:val="0"/>
-          <w:numId w:val="3"/>
-        </w:numPr>
-        <w:spacing w:after="90" w:line="270"/>
-        <w:jc w:val="both"/>
-      </w:pPr>
-      <w:r>
-        <w:t xml:space="preserve">La cobertura alcanzable está acotada por el corpus disponible: seis de los veintiún símbolos del LEL experto no tienen sustento textual en las cuatro entrevistas, por lo que ningún método —automático o manual— podría recuperarlos partiendo solo de esas transcripciones. Medir contra el conjunto recuperable, y no solo contra el LEL completo, es la única forma de evaluar con justicia a cada enfoque.</w:t>
-      </w:r>
-    </w:p>
-    <w:p>
-      <w:pPr>
-        <w:pStyle w:val="ListParagraph"/>
-        <w:numPr>
-          <w:ilvl w:val="0"/>
-          <w:numId w:val="3"/>
-        </w:numPr>
-        <w:spacing w:after="90" w:line="270"/>
-        <w:jc w:val="both"/>
-      </w:pPr>
-      <w:r>
-        <w:t xml:space="preserve">El valor del enfoque generativo se mide mejor por lo que </w:t>
-      </w:r>
-      <w:r>
-        <w:rPr>
-          <w:i/>
-          <w:iCs/>
-        </w:rPr>
-        <w:t xml:space="preserve">habilita</w:t>
-      </w:r>
-      <w:r>
-        <w:t xml:space="preserve"> (la descripción automática) que por mejoras incrementales en lo que el PLN ya proveía.</w:t>
-      </w:r>
-    </w:p>
-    <w:p>
-      <w:pPr>
-        <w:pStyle w:val="Heading1"/>
-        <w:keepNext/>
-        <w:pageBreakBefore/>
-        <w:spacing w:after="200" w:before="420"/>
-      </w:pPr>
-      <w:r>
-        <w:t xml:space="preserve">Capítulo 9 — Conclusiones y Trabajos Futuros</w:t>
-      </w:r>
-    </w:p>
-    <w:p>
-      <w:pPr>
-        <w:pStyle w:val="Heading2"/>
-        <w:keepNext/>
-      </w:pPr>
-      <w:r>
-        <w:t xml:space="preserve">9.1 Conclusiones</w:t>
-      </w:r>
-    </w:p>
-    <w:p>
-      <w:pPr>
-        <w:spacing w:after="160" w:line="276"/>
-        <w:jc w:val="both"/>
-      </w:pPr>
-      <w:r>
-        <w:t xml:space="preserve">Este trabajo se propuso estudiar, diseñar e implementar un prototipo capaz de colaborar con la construcción del modelo Léxico Extendido del Lenguaje a partir de entrevistas transcriptas, empleando Inteligencia Artificial Generativa, y evaluarlo frente a un Gold Standard y frente a enfoques tradicionales de PLN. A lo largo del trabajo se alcanzaron los objetivos planteados: se sistematizó el marco teórico del modelo LEL para su uso como reglas en los prompts del LLM; se analizaron trabajos relacionados con la construcción del LEL y el uso de LLM en actividades de la IR; se consolidó un caso de estudio con un Gold Standard riguroso; se construyó un prototipo funcional con dos baselines de comparación; y se definió y aplicó un protocolo de evaluación reproducible.</w:t>
-      </w:r>
-    </w:p>
-    <w:p>
-      <w:pPr>
-        <w:spacing w:after="160" w:line="276"/>
-        <w:jc w:val="both"/>
-      </w:pPr>
-      <w:r>
-        <w:t xml:space="preserve">La evidencia reunida sostiene el núcleo de la hipótesis. Los baselines de PLN establecen un </w:t>
-      </w:r>
-      <w:r>
-        <w:rPr>
-          <w:i/>
-          <w:iCs/>
-        </w:rPr>
-        <w:t xml:space="preserve">piso</w:t>
-      </w:r>
-      <w:r>
-        <w:t xml:space="preserve"> caracterizado por una cobertura moderada, una precisión baja y, de manera concluyente, la ausencia total de descripciones. El enfoque generativo se dirige precisamente a esa carencia: clasificar los símbolos y redactar su noción e impacto, tareas que el PLN no resuelve. La contribución central del trabajo, por tanto, no es competir con el PLN en la identificación de términos, sino habilitar la automatización de la parte del proceso que antes era exclusivamente manual, siempre bajo una revisión humana que el propio diseño contempla.</w:t>
-      </w:r>
-    </w:p>
-    <w:p>
-      <w:pPr>
-        <w:pStyle w:val="Heading2"/>
-        <w:keepNext/>
-      </w:pPr>
-      <w:r>
-        <w:t xml:space="preserve">9.2 Contribuciones</w:t>
-      </w:r>
-    </w:p>
-    <w:p>
-      <w:pPr>
-        <w:spacing w:after="160" w:line="276"/>
-        <w:jc w:val="both"/>
-      </w:pPr>
-      <w:r>
-        <w:t xml:space="preserve">El trabajo deja las siguientes contribuciones concretas:</w:t>
-      </w:r>
-    </w:p>
-    <w:p>
-      <w:pPr>
-        <w:pStyle w:val="ListParagraph"/>
-        <w:numPr>
-          <w:ilvl w:val="0"/>
-          <w:numId w:val="3"/>
-        </w:numPr>
-        <w:spacing w:after="90" w:line="270"/>
-        <w:jc w:val="both"/>
-      </w:pPr>
-      <w:r>
-        <w:t xml:space="preserve">Un prototipo funcional, documentado y reproducible para asistir en la construcción del LEL con IA Generativa, con un pipeline de cuatro etapas, que incluye una auto-evaluación, y abstracción del proveedor para el benchmarking de modelos.</w:t>
-      </w:r>
-    </w:p>
-    <w:p>
-      <w:pPr>
-        <w:pStyle w:val="ListParagraph"/>
-        <w:numPr>
-          <w:ilvl w:val="0"/>
-          <w:numId w:val="3"/>
-        </w:numPr>
-        <w:spacing w:after="90" w:line="270"/>
-        <w:jc w:val="both"/>
-      </w:pPr>
-      <w:r>
-        <w:t xml:space="preserve">Elaboración de casos de muestreo con sus Gold Standards (LEL de referencia legibles por máquina), incluyendo la trazabilidad símbolo–fuente (Tabla 5.2) y la distinción entre conjunto completo y conjunto recuperable del caso principal.</w:t>
-      </w:r>
-    </w:p>
-    <w:p>
-      <w:pPr>
-        <w:pStyle w:val="ListParagraph"/>
-        <w:numPr>
-          <w:ilvl w:val="0"/>
-          <w:numId w:val="3"/>
-        </w:numPr>
-        <w:spacing w:after="90" w:line="270"/>
-        <w:jc w:val="both"/>
-      </w:pPr>
-      <w:r>
-        <w:t xml:space="preserve">Un protocolo de evaluación determinístico con métricas de identificación, clasificación y descripción, replicable por terceros e independiente del método de construcción.</w:t>
-      </w:r>
-    </w:p>
-    <w:p>
-      <w:pPr>
-        <w:pStyle w:val="ListParagraph"/>
-        <w:numPr>
-          <w:ilvl w:val="0"/>
-          <w:numId w:val="3"/>
-        </w:numPr>
-        <w:spacing w:after="90" w:line="270"/>
-        <w:jc w:val="both"/>
-      </w:pPr>
-      <w:r>
-        <w:rPr>
-          <w:i/>
-          <w:iCs/>
-        </w:rPr>
-        <w:t xml:space="preserve">Evidencia empírica comparativa</w:t>
-      </w:r>
-      <w:r>
-        <w:t xml:space="preserve"> entre PLN tradicional y el enfoque generativo para esta tarea, incluyendo el análisis de la recuperabilidad según el corpus.</w:t>
-      </w:r>
-    </w:p>
-    <w:p>
-      <w:pPr>
-        <w:pStyle w:val="ListParagraph"/>
-        <w:numPr>
-          <w:ilvl w:val="0"/>
-          <w:numId w:val="3"/>
-        </w:numPr>
-        <w:spacing w:after="90" w:line="270"/>
-        <w:jc w:val="both"/>
-      </w:pPr>
-      <w:r>
-        <w:rPr>
-          <w:i/>
-          <w:iCs/>
-        </w:rPr>
-        <w:t xml:space="preserve">Una discusión metodológica</w:t>
-      </w:r>
-      <w:r>
-        <w:t xml:space="preserve"> sobre el rol de la revisión humana, el tratamiento de omisiones y contradicciones, y las salvaguardas frente a las alucinaciones.</w:t>
-      </w:r>
-    </w:p>
-    <w:p>
-      <w:pPr>
-        <w:pStyle w:val="Heading2"/>
-        <w:keepNext/>
-      </w:pPr>
-      <w:r>
-        <w:t xml:space="preserve">9.3 Limitaciones</w:t>
-      </w:r>
-    </w:p>
-    <w:p>
-      <w:pPr>
-        <w:pStyle w:val="ListParagraph"/>
-        <w:numPr>
-          <w:ilvl w:val="0"/>
-          <w:numId w:val="3"/>
-        </w:numPr>
-        <w:spacing w:after="90" w:line="270"/>
-        <w:jc w:val="both"/>
-      </w:pPr>
-      <w:r>
-        <w:t xml:space="preserve">La evaluación rigurosa se circunscribe a un único dominio principal (ecoFactory), lo que limita la generalización de las conclusiones.</w:t>
-      </w:r>
-    </w:p>
-    <w:p>
-      <w:pPr>
-        <w:pStyle w:val="ListParagraph"/>
-        <w:numPr>
-          <w:ilvl w:val="0"/>
-          <w:numId w:val="3"/>
-        </w:numPr>
-        <w:spacing w:after="90" w:line="270"/>
-        <w:jc w:val="both"/>
-      </w:pPr>
-      <w:r>
-        <w:t xml:space="preserve">Los seis casos de muestreo adicionales usan entrevistas simuladas por el autor, que no reemplazan datos de campo y valen como demostración de robustez, no como evaluación rigurosa.</w:t>
-      </w:r>
-    </w:p>
-    <w:p>
-      <w:pPr>
-        <w:pStyle w:val="ListParagraph"/>
-        <w:numPr>
-          <w:ilvl w:val="0"/>
-          <w:numId w:val="3"/>
-        </w:numPr>
-        <w:spacing w:after="90" w:line="270"/>
-        <w:jc w:val="both"/>
-      </w:pPr>
-      <w:r>
-        <w:t xml:space="preserve">La variabilidad inherente a los LLM exige múltiples corridas y un reporte cuidadoso de la dispersión.</w:t>
-      </w:r>
-    </w:p>
-    <w:p>
-      <w:pPr>
-        <w:pStyle w:val="ListParagraph"/>
-        <w:numPr>
-          <w:ilvl w:val="0"/>
-          <w:numId w:val="3"/>
-        </w:numPr>
-        <w:spacing w:after="90" w:line="270"/>
-        <w:jc w:val="both"/>
-      </w:pPr>
-      <w:r>
-        <w:t xml:space="preserve">La evaluación de la calidad de las descripciones a nivel de oración conserva un componente de adjudicación que conviene complementar con más de un evaluador.</w:t>
-      </w:r>
-    </w:p>
-    <w:p>
-      <w:pPr>
-        <w:pStyle w:val="Heading2"/>
-        <w:keepNext/>
-      </w:pPr>
-      <w:r>
-        <w:t xml:space="preserve">9.4 Trabajos futuros</w:t>
-      </w:r>
-    </w:p>
-    <w:p>
-      <w:pPr>
-        <w:spacing w:after="160" w:line="276"/>
-        <w:jc w:val="both"/>
-      </w:pPr>
-      <w:r>
-        <w:t xml:space="preserve">El prototipo abre varias líneas de continuación, resumidas en la Fig. 9.1.</w:t>
-      </w:r>
-    </w:p>
-    <w:p>
-      <w:pPr>
-        <w:keepNext/>
-        <w:spacing w:after="60" w:before="160"/>
-        <w:jc w:val="center"/>
-      </w:pPr>
-      <w:r>
-        <w:drawing>
-          <wp:inline distT="0" distB="0" distL="0" distR="0">
-            <wp:extent cx="4953000" cy="2476500"/>
             <wp:effectExtent t="0" r="0" b="0" l="0"/>
             <wp:docPr id="1" name="" descr="" title=""/>
             <wp:cNvGraphicFramePr>
@@ -23495,6 +23048,571 @@
                   <pic:spPr bwMode="auto">
                     <a:xfrm>
                       <a:off x="0" y="0"/>
+                      <a:ext cx="5334000" cy="1857375"/>
+                    </a:xfrm>
+                    <a:prstGeom prst="rect">
+                      <a:avLst/>
+                    </a:prstGeom>
+                  </pic:spPr>
+                </pic:pic>
+              </a:graphicData>
+            </a:graphic>
+          </wp:inline>
+        </w:drawing>
+      </w:r>
+    </w:p>
+    <w:p>
+      <w:pPr>
+        <w:keepLines/>
+        <w:spacing w:after="200"/>
+        <w:jc w:val="center"/>
+      </w:pPr>
+      <w:r>
+        <w:rPr>
+          <w:color w:val="333333"/>
+          <w:sz w:val="19"/>
+          <w:szCs w:val="19"/>
+        </w:rPr>
+        <w:t xml:space="preserve">Fig. 8.1. El LEL generado y la revisión humana: el enfoque generativo desplaza el esfuerzo del ingeniero de redactar el LEL desde cero a revisar y corregir un borrador.</w:t>
+      </w:r>
+    </w:p>
+    <w:p>
+      <w:pPr>
+        <w:spacing w:after="120"/>
+      </w:pPr>
+    </w:p>
+    <w:p>
+      <w:pPr>
+        <w:spacing w:after="160" w:line="276"/>
+        <w:jc w:val="both"/>
+      </w:pPr>
+      <w:r>
+        <w:t xml:space="preserve">Pasar de </w:t>
+      </w:r>
+      <w:r>
+        <w:rPr>
+          <w:i/>
+          <w:iCs/>
+        </w:rPr>
+        <w:t xml:space="preserve">redactar</w:t>
+      </w:r>
+      <w:r>
+        <w:t xml:space="preserve"> a </w:t>
+      </w:r>
+      <w:r>
+        <w:rPr>
+          <w:i/>
+          <w:iCs/>
+        </w:rPr>
+        <w:t xml:space="preserve">revisar</w:t>
+      </w:r>
+      <w:r>
+        <w:t xml:space="preserve"> es, potencialmente, una reducción significativa de esfuerzo, análoga a la diferencia entre escribir un texto y corregir uno ya escrito. La etapa de auto-verificación del prototipo busca, además, que el borrador llegue a la revisión humana con una calidad ya depurada. La cuantificación precisa de este ahorro —usando como referencia el tiempo de construcción manual registrado en el caso— es una de las mediciones a completar con la ejecución del pipeline.</w:t>
+      </w:r>
+    </w:p>
+    <w:p>
+      <w:pPr>
+        <w:spacing w:after="160" w:line="276"/>
+        <w:jc w:val="both"/>
+      </w:pPr>
+      <w:r>
+        <w:t xml:space="preserve">Una pregunta pendiente es si el pipeline, tal como está implementado, admite una iteración posterior a la revisión humana: que el ingeniero corrija o descarte símbolos del LEL y esa lista revisada vuelva a entrar al prototipo para completar o ajustar noción e impacto. Hoy no la admite: el prototipo corre las cuatro etapas de punta a punta sobre un corpus y no expone un punto de entrada intermedio que reciba una lista de símbolos ya clasificada y la lleve directamente al prompt de descripción. Habilitarlo requeriría descomponer `construir_lel` en llamadas independientes por etapa —la función ya está organizada en cuatro pasos discretos, por lo que el cambio es acotado— y queda señalado como trabajo futuro (Sección 9.4), no como algo resuelto en esta versión.</w:t>
+      </w:r>
+    </w:p>
+    <w:p>
+      <w:pPr>
+        <w:pStyle w:val="Heading2"/>
+        <w:keepNext/>
+      </w:pPr>
+      <w:r>
+        <w:t xml:space="preserve">8.6 Sobre la validez de los resultados</w:t>
+      </w:r>
+    </w:p>
+    <w:p>
+      <w:pPr>
+        <w:spacing w:after="160" w:line="276"/>
+        <w:jc w:val="both"/>
+      </w:pPr>
+      <w:r>
+        <w:t xml:space="preserve">Los resultados deben leerse teniendo presentes las amenazas a la validez discutidas en el Capítulo 4. La más relevante es que, si bien ecoFactory es una empresa real, los usuarios entrevistados en el trabajo de origen fueron interpretados en rol y no son personal efectivo de la empresa (Sección 5.1), de modo que las conclusiones valen para ese caso y no pueden extrapolarse sin más a un relevamiento de campo con usuarios finales. A ello se suma que la evaluación se realiza sobre un </w:t>
+      </w:r>
+      <w:r>
+        <w:rPr>
+          <w:i/>
+          <w:iCs/>
+        </w:rPr>
+        <w:t xml:space="preserve">único dominio</w:t>
+      </w:r>
+      <w:r>
+        <w:t xml:space="preserve"> principal, complementado con casos de muestreo en dominios adicionales cuyo corpus sí es simulado por el autor, lo que limita la generalización; que la </w:t>
+      </w:r>
+      <w:r>
+        <w:rPr>
+          <w:i/>
+          <w:iCs/>
+        </w:rPr>
+        <w:t xml:space="preserve">medición primaria</w:t>
+      </w:r>
+      <w:r>
+        <w:t xml:space="preserve"> se restringe a la configuración de corpus original del caso, inmune al sesgo de autoría del LEL; y que la </w:t>
+      </w:r>
+      <w:r>
+        <w:rPr>
+          <w:i/>
+          <w:iCs/>
+        </w:rPr>
+        <w:t xml:space="preserve">variabilidad</w:t>
+      </w:r>
+      <w:r>
+        <w:t xml:space="preserve"> propia de los LLM exige reportar resultados sobre múltiples corridas. La fortaleza compensatoria es que la evaluación es completamente determinística y reproducible, y que el caso aporta un Gold Standard </w:t>
+      </w:r>
+      <w:r>
+        <w:rPr>
+          <w:i/>
+          <w:iCs/>
+        </w:rPr>
+        <w:t xml:space="preserve">previo e independiente</w:t>
+      </w:r>
+      <w:r>
+        <w:t xml:space="preserve"> del prototipo, construido a mano antes del desarrollo de este trabajo final de carrera. Cabe agregar, como elemento a favor de la generalidad, que el prototipo en su configuración C2c se aplicó también a otros seis dominios de muestreo, con resultados consistentes entre sí (Sección 7.8); esos casos, sin embargo, emplean referencias construidas por el propio autor, por lo que valen como indicio de robustez y no como evaluación independiente.</w:t>
+      </w:r>
+    </w:p>
+    <w:p>
+      <w:pPr>
+        <w:pStyle w:val="Heading2"/>
+        <w:keepNext/>
+      </w:pPr>
+      <w:r>
+        <w:t xml:space="preserve">8.7 Un experimento aparte: entrevistas simuladas para ecoFactory</w:t>
+      </w:r>
+    </w:p>
+    <w:p>
+      <w:pPr>
+        <w:spacing w:after="160" w:line="276"/>
+        <w:jc w:val="both"/>
+      </w:pPr>
+      <w:r>
+        <w:t xml:space="preserve">Durante el desarrollo de este trabajo, y antes de disponer de las cuatro transcripciones reales del estudio original, se realizó un experimento adicional que conviene documentar por separado, ya que </w:t>
+      </w:r>
+      <w:r>
+        <w:rPr>
+          <w:i/>
+          <w:iCs/>
+        </w:rPr>
+        <w:t xml:space="preserve">no forma parte de la evaluación de los tratamientos</w:t>
+      </w:r>
+      <w:r>
+        <w:t xml:space="preserve"> del Capítulo 7 —todos ellos corren sobre el mismo corpus real— sino que constituye una prueba de concepto independiente sobre la simulación de entrevistas.</w:t>
+      </w:r>
+    </w:p>
+    <w:p>
+      <w:pPr>
+        <w:spacing w:after="160" w:line="276"/>
+        <w:jc w:val="both"/>
+      </w:pPr>
+      <w:r>
+        <w:t xml:space="preserve">Este experimento preliminar consistió en redactar dos entrevistas </w:t>
+      </w:r>
+      <w:r>
+        <w:rPr>
+          <w:i/>
+          <w:iCs/>
+        </w:rPr>
+        <w:t xml:space="preserve">simuladas</w:t>
+      </w:r>
+      <w:r>
+        <w:t xml:space="preserve"> para dos roles de ecoFactory (el Gerente Comercial y un responsable funcional del ERP), escritas desde el discurso natural de cada rol, para explorar en qué medida un corpus simulado permite reconstruir el LEL. Cuando más tarde se incorporaron las transcripciones reales de esos mismos roles, la comparación entre ambas versiones arrojó un hallazgo metodológico interesante: la entrevista simulada tendía a reproducir el vocabulario exacto del Gold Standard —por ejemplo, introducía explícitamente la distinción «cliente mayorista» / «cliente minorista», mientras que la transcripción real menciona «mayorista» una sola vez y «minorista» ninguna.</w:t>
+      </w:r>
+    </w:p>
+    <w:p>
+      <w:pPr>
+        <w:spacing w:after="160" w:line="276"/>
+        <w:jc w:val="both"/>
+      </w:pPr>
+      <w:r>
+        <w:t xml:space="preserve">La lección es directa y de valor general para la disciplina: redactar entrevistas simuladas con conocimiento previo del resultado esperado —aun con la mejor intención de imparcialidad— tiende a sesgarlas hacia ese resultado, inflando de manera artificial la cobertura que un método pueda alcanzar sobre ellas. Por esa razón, la evaluación de este trabajo se realiza exclusivamente sobre las entrevistas reales, y las simuladas se reservan para los casos de muestreo de otros dominios (Sección 7.8), donde su rol es distinto: allí no existe un Gold Standard previo que puedan copiar, sino que se construyen junto con su referencia para medir la robustez del enfoque en dominios diversos.</w:t>
+      </w:r>
+    </w:p>
+    <w:p>
+      <w:pPr>
+        <w:pStyle w:val="Heading2"/>
+        <w:keepNext/>
+      </w:pPr>
+      <w:r>
+        <w:t xml:space="preserve">8.8 Lecciones aprendidas</w:t>
+      </w:r>
+    </w:p>
+    <w:p>
+      <w:pPr>
+        <w:pStyle w:val="ListParagraph"/>
+        <w:numPr>
+          <w:ilvl w:val="0"/>
+          <w:numId w:val="3"/>
+        </w:numPr>
+        <w:spacing w:after="90" w:line="270"/>
+        <w:jc w:val="both"/>
+      </w:pPr>
+      <w:r>
+        <w:t xml:space="preserve">Separar el problema en identificar, clasificar y describir clarifica tanto el diseño del prototipo como la interpretación de los resultados.</w:t>
+      </w:r>
+    </w:p>
+    <w:p>
+      <w:pPr>
+        <w:pStyle w:val="ListParagraph"/>
+        <w:numPr>
+          <w:ilvl w:val="0"/>
+          <w:numId w:val="3"/>
+        </w:numPr>
+        <w:spacing w:after="90" w:line="270"/>
+        <w:jc w:val="both"/>
+      </w:pPr>
+      <w:r>
+        <w:t xml:space="preserve">La cobertura alcanzable está acotada por el corpus: ningún método puede recuperar lo que no fue elicitado, y esto se sostiene incluso al ampliar el corpus con más entrevistas reales (Sección 5.7).</w:t>
+      </w:r>
+    </w:p>
+    <w:p>
+      <w:pPr>
+        <w:pStyle w:val="ListParagraph"/>
+        <w:numPr>
+          <w:ilvl w:val="0"/>
+          <w:numId w:val="3"/>
+        </w:numPr>
+        <w:spacing w:after="90" w:line="270"/>
+        <w:jc w:val="both"/>
+      </w:pPr>
+      <w:r>
+        <w:t xml:space="preserve">Un método automático puede actuar como revisor del modelo manual, revelando omisiones como la del </w:t>
+      </w:r>
+      <w:r>
+        <w:rPr>
+          <w:i/>
+          <w:iCs/>
+        </w:rPr>
+        <w:t xml:space="preserve">Remito</w:t>
+      </w:r>
+      <w:r>
+        <w:t xml:space="preserve">.</w:t>
+      </w:r>
+    </w:p>
+    <w:p>
+      <w:pPr>
+        <w:pStyle w:val="ListParagraph"/>
+        <w:numPr>
+          <w:ilvl w:val="0"/>
+          <w:numId w:val="3"/>
+        </w:numPr>
+        <w:spacing w:after="90" w:line="270"/>
+        <w:jc w:val="both"/>
+      </w:pPr>
+      <w:r>
+        <w:t xml:space="preserve">Las contradicciones entre actores no son ruido a eliminar, sino información a preservar y un test exigente para cualquier método.</w:t>
+      </w:r>
+    </w:p>
+    <w:p>
+      <w:pPr>
+        <w:pStyle w:val="ListParagraph"/>
+        <w:numPr>
+          <w:ilvl w:val="0"/>
+          <w:numId w:val="3"/>
+        </w:numPr>
+        <w:spacing w:after="90" w:line="270"/>
+        <w:jc w:val="both"/>
+      </w:pPr>
+      <w:r>
+        <w:t xml:space="preserve">La cobertura alcanzable está acotada por el corpus disponible: seis de los veintiún símbolos del LEL experto no tienen sustento textual en las cuatro entrevistas, por lo que ningún método —automático o manual— podría recuperarlos partiendo solo de esas transcripciones. Medir contra el conjunto recuperable, y no solo contra el LEL completo, es la única forma de evaluar con justicia a cada enfoque.</w:t>
+      </w:r>
+    </w:p>
+    <w:p>
+      <w:pPr>
+        <w:pStyle w:val="ListParagraph"/>
+        <w:numPr>
+          <w:ilvl w:val="0"/>
+          <w:numId w:val="3"/>
+        </w:numPr>
+        <w:spacing w:after="90" w:line="270"/>
+        <w:jc w:val="both"/>
+      </w:pPr>
+      <w:r>
+        <w:t xml:space="preserve">El valor del enfoque generativo se mide mejor por lo que </w:t>
+      </w:r>
+      <w:r>
+        <w:rPr>
+          <w:i/>
+          <w:iCs/>
+        </w:rPr>
+        <w:t xml:space="preserve">habilita</w:t>
+      </w:r>
+      <w:r>
+        <w:t xml:space="preserve"> (la descripción automática) que por mejoras incrementales en lo que el PLN ya proveía.</w:t>
+      </w:r>
+    </w:p>
+    <w:p>
+      <w:pPr>
+        <w:pStyle w:val="Heading1"/>
+        <w:keepNext/>
+        <w:pageBreakBefore/>
+        <w:spacing w:after="200" w:before="420"/>
+      </w:pPr>
+      <w:r>
+        <w:t xml:space="preserve">Capítulo 9 — Conclusiones y Trabajos Futuros</w:t>
+      </w:r>
+    </w:p>
+    <w:p>
+      <w:pPr>
+        <w:pStyle w:val="Heading2"/>
+        <w:keepNext/>
+      </w:pPr>
+      <w:r>
+        <w:t xml:space="preserve">9.1 Conclusiones</w:t>
+      </w:r>
+    </w:p>
+    <w:p>
+      <w:pPr>
+        <w:spacing w:after="160" w:line="276"/>
+        <w:jc w:val="both"/>
+      </w:pPr>
+      <w:r>
+        <w:t xml:space="preserve">Este trabajo se propuso estudiar, diseñar e implementar un prototipo capaz de colaborar con la construcción del modelo Léxico Extendido del Lenguaje a partir de entrevistas transcriptas, empleando Inteligencia Artificial Generativa, y evaluarlo frente a un Gold Standard y frente a enfoques tradicionales de PLN. A lo largo del trabajo se alcanzaron los objetivos planteados: se sistematizó el marco teórico del modelo LEL para su uso como reglas en los prompts del LLM; se analizaron trabajos relacionados con la construcción del LEL y el uso de LLM en actividades de la IR; se consolidó un caso de estudio con un Gold Standard riguroso; se construyó un prototipo funcional con dos baselines de comparación; y se definió y aplicó un protocolo de evaluación reproducible.</w:t>
+      </w:r>
+    </w:p>
+    <w:p>
+      <w:pPr>
+        <w:spacing w:after="160" w:line="276"/>
+        <w:jc w:val="both"/>
+      </w:pPr>
+      <w:r>
+        <w:t xml:space="preserve">La evidencia reunida sostiene el núcleo de la hipótesis. Los baselines de PLN establecen un </w:t>
+      </w:r>
+      <w:r>
+        <w:rPr>
+          <w:i/>
+          <w:iCs/>
+        </w:rPr>
+        <w:t xml:space="preserve">piso</w:t>
+      </w:r>
+      <w:r>
+        <w:t xml:space="preserve"> caracterizado por una cobertura moderada, una precisión baja y, de manera concluyente, la ausencia total de descripciones. El enfoque generativo se dirige precisamente a esa carencia: clasificar los símbolos y redactar su noción e impacto, tareas que el PLN no resuelve. La contribución central del trabajo, por tanto, no es competir con el PLN en la identificación de términos, sino habilitar la automatización de la parte del proceso que antes era exclusivamente manual, siempre bajo una revisión humana que el propio diseño contempla.</w:t>
+      </w:r>
+    </w:p>
+    <w:p>
+      <w:pPr>
+        <w:pStyle w:val="Heading2"/>
+        <w:keepNext/>
+      </w:pPr>
+      <w:r>
+        <w:t xml:space="preserve">9.2 Contribuciones</w:t>
+      </w:r>
+    </w:p>
+    <w:p>
+      <w:pPr>
+        <w:spacing w:after="160" w:line="276"/>
+        <w:jc w:val="both"/>
+      </w:pPr>
+      <w:r>
+        <w:t xml:space="preserve">El trabajo deja las siguientes contribuciones concretas:</w:t>
+      </w:r>
+    </w:p>
+    <w:p>
+      <w:pPr>
+        <w:pStyle w:val="ListParagraph"/>
+        <w:numPr>
+          <w:ilvl w:val="0"/>
+          <w:numId w:val="3"/>
+        </w:numPr>
+        <w:spacing w:after="90" w:line="270"/>
+        <w:jc w:val="both"/>
+      </w:pPr>
+      <w:r>
+        <w:t xml:space="preserve">Un prototipo funcional, documentado y reproducible para asistir en la construcción del LEL con IA Generativa, con un pipeline de cuatro etapas, que incluye una auto-evaluación, y abstracción del proveedor para el benchmarking de modelos.</w:t>
+      </w:r>
+    </w:p>
+    <w:p>
+      <w:pPr>
+        <w:pStyle w:val="ListParagraph"/>
+        <w:numPr>
+          <w:ilvl w:val="0"/>
+          <w:numId w:val="3"/>
+        </w:numPr>
+        <w:spacing w:after="90" w:line="270"/>
+        <w:jc w:val="both"/>
+      </w:pPr>
+      <w:r>
+        <w:t xml:space="preserve">Elaboración de casos de muestreo con sus Gold Standards (LEL de referencia legibles por máquina), incluyendo la trazabilidad símbolo–fuente (Tabla 5.2) y la distinción entre conjunto completo y conjunto recuperable del caso principal.</w:t>
+      </w:r>
+    </w:p>
+    <w:p>
+      <w:pPr>
+        <w:pStyle w:val="ListParagraph"/>
+        <w:numPr>
+          <w:ilvl w:val="0"/>
+          <w:numId w:val="3"/>
+        </w:numPr>
+        <w:spacing w:after="90" w:line="270"/>
+        <w:jc w:val="both"/>
+      </w:pPr>
+      <w:r>
+        <w:t xml:space="preserve">Un protocolo de evaluación determinístico con métricas de identificación, clasificación y descripción, replicable por terceros e independiente del método de construcción.</w:t>
+      </w:r>
+    </w:p>
+    <w:p>
+      <w:pPr>
+        <w:pStyle w:val="ListParagraph"/>
+        <w:numPr>
+          <w:ilvl w:val="0"/>
+          <w:numId w:val="3"/>
+        </w:numPr>
+        <w:spacing w:after="90" w:line="270"/>
+        <w:jc w:val="both"/>
+      </w:pPr>
+      <w:r>
+        <w:rPr>
+          <w:i/>
+          <w:iCs/>
+        </w:rPr>
+        <w:t xml:space="preserve">Evidencia empírica comparativa</w:t>
+      </w:r>
+      <w:r>
+        <w:t xml:space="preserve"> entre PLN tradicional y el enfoque generativo para esta tarea, incluyendo el análisis de la recuperabilidad según el corpus.</w:t>
+      </w:r>
+    </w:p>
+    <w:p>
+      <w:pPr>
+        <w:pStyle w:val="ListParagraph"/>
+        <w:numPr>
+          <w:ilvl w:val="0"/>
+          <w:numId w:val="3"/>
+        </w:numPr>
+        <w:spacing w:after="90" w:line="270"/>
+        <w:jc w:val="both"/>
+      </w:pPr>
+      <w:r>
+        <w:rPr>
+          <w:i/>
+          <w:iCs/>
+        </w:rPr>
+        <w:t xml:space="preserve">Una discusión metodológica</w:t>
+      </w:r>
+      <w:r>
+        <w:t xml:space="preserve"> sobre el rol de la revisión humana, el tratamiento de omisiones y contradicciones, y las salvaguardas frente a las alucinaciones.</w:t>
+      </w:r>
+    </w:p>
+    <w:p>
+      <w:pPr>
+        <w:pStyle w:val="Heading2"/>
+        <w:keepNext/>
+      </w:pPr>
+      <w:r>
+        <w:t xml:space="preserve">9.3 Limitaciones</w:t>
+      </w:r>
+    </w:p>
+    <w:p>
+      <w:pPr>
+        <w:pStyle w:val="ListParagraph"/>
+        <w:numPr>
+          <w:ilvl w:val="0"/>
+          <w:numId w:val="3"/>
+        </w:numPr>
+        <w:spacing w:after="90" w:line="270"/>
+        <w:jc w:val="both"/>
+      </w:pPr>
+      <w:r>
+        <w:t xml:space="preserve">La evaluación rigurosa se circunscribe a un único dominio principal (ecoFactory), lo que limita la generalización de las conclusiones.</w:t>
+      </w:r>
+    </w:p>
+    <w:p>
+      <w:pPr>
+        <w:pStyle w:val="ListParagraph"/>
+        <w:numPr>
+          <w:ilvl w:val="0"/>
+          <w:numId w:val="3"/>
+        </w:numPr>
+        <w:spacing w:after="90" w:line="270"/>
+        <w:jc w:val="both"/>
+      </w:pPr>
+      <w:r>
+        <w:t xml:space="preserve">Los seis casos de muestreo adicionales usan entrevistas simuladas por el autor, que no reemplazan datos de campo y valen como demostración de robustez, no como evaluación rigurosa.</w:t>
+      </w:r>
+    </w:p>
+    <w:p>
+      <w:pPr>
+        <w:pStyle w:val="ListParagraph"/>
+        <w:numPr>
+          <w:ilvl w:val="0"/>
+          <w:numId w:val="3"/>
+        </w:numPr>
+        <w:spacing w:after="90" w:line="270"/>
+        <w:jc w:val="both"/>
+      </w:pPr>
+      <w:r>
+        <w:t xml:space="preserve">La variabilidad inherente a los LLM exige múltiples corridas y un reporte cuidadoso de la dispersión.</w:t>
+      </w:r>
+    </w:p>
+    <w:p>
+      <w:pPr>
+        <w:pStyle w:val="ListParagraph"/>
+        <w:numPr>
+          <w:ilvl w:val="0"/>
+          <w:numId w:val="3"/>
+        </w:numPr>
+        <w:spacing w:after="90" w:line="270"/>
+        <w:jc w:val="both"/>
+      </w:pPr>
+      <w:r>
+        <w:t xml:space="preserve">La evaluación de la calidad de las descripciones a nivel de oración conserva un componente de adjudicación que conviene complementar con más de un evaluador.</w:t>
+      </w:r>
+    </w:p>
+    <w:p>
+      <w:pPr>
+        <w:pStyle w:val="Heading2"/>
+        <w:keepNext/>
+      </w:pPr>
+      <w:r>
+        <w:t xml:space="preserve">9.4 Trabajos futuros</w:t>
+      </w:r>
+    </w:p>
+    <w:p>
+      <w:pPr>
+        <w:spacing w:after="160" w:line="276"/>
+        <w:jc w:val="both"/>
+      </w:pPr>
+      <w:r>
+        <w:t xml:space="preserve">El prototipo abre varias líneas de continuación, resumidas en la Fig. 9.1.</w:t>
+      </w:r>
+    </w:p>
+    <w:p>
+      <w:pPr>
+        <w:keepNext/>
+        <w:spacing w:after="60" w:before="160"/>
+        <w:jc w:val="center"/>
+      </w:pPr>
+      <w:r>
+        <w:drawing>
+          <wp:inline distT="0" distB="0" distL="0" distR="0">
+            <wp:extent cx="4953000" cy="2476500"/>
+            <wp:effectExtent t="0" r="0" b="0" l="0"/>
+            <wp:docPr id="1" name="" descr="" title=""/>
+            <wp:cNvGraphicFramePr>
+              <a:graphicFrameLocks xmlns:a="http://schemas.openxmlformats.org/drawingml/2006/main" noChangeAspect="1"/>
+            </wp:cNvGraphicFramePr>
+            <a:graphic xmlns:a="http://schemas.openxmlformats.org/drawingml/2006/main">
+              <a:graphicData uri="http://schemas.openxmlformats.org/drawingml/2006/picture">
+                <pic:pic xmlns:pic="http://schemas.openxmlformats.org/drawingml/2006/picture">
+                  <pic:nvPicPr>
+                    <pic:cNvPr id="0" name="" descr=""/>
+                    <pic:cNvPicPr>
+                      <a:picLocks noChangeAspect="1" noChangeArrowheads="1"/>
+                    </pic:cNvPicPr>
+                  </pic:nvPicPr>
+                  <pic:blipFill>
+                    <a:blip r:embed="rId30" cstate="none"/>
+                    <a:srcRect/>
+                    <a:stretch>
+                      <a:fillRect/>
+                    </a:stretch>
+                  </pic:blipFill>
+                  <pic:spPr bwMode="auto">
+                    <a:xfrm>
+                      <a:off x="0" y="0"/>
                       <a:ext cx="4953000" cy="2476500"/>
                     </a:xfrm>
                     <a:prstGeom prst="rect">
@@ -26737,6 +26855,93 @@
       </w:r>
       <w:r>
         <w:t xml:space="preserve"> Es ofrecida por el Responsable ERP a los clientes del proveedor del Sistema ERP. Ya existe, por ejemplo, con puntos de venta de terceros.</w:t>
+      </w:r>
+    </w:p>
+    <w:p>
+      <w:pPr>
+        <w:pStyle w:val="Heading1"/>
+        <w:keepNext/>
+        <w:pageBreakBefore/>
+        <w:spacing w:after="200" w:before="420"/>
+      </w:pPr>
+      <w:r>
+        <w:t xml:space="preserve">Anexo D — Verificación de ejecución con modelos comerciales vía API</w:t>
+      </w:r>
+    </w:p>
+    <w:p>
+      <w:pPr>
+        <w:spacing w:after="160" w:line="276"/>
+        <w:jc w:val="both"/>
+      </w:pPr>
+      <w:r>
+        <w:t xml:space="preserve">Este anexo deja constancia de una verificación </w:t>
+      </w:r>
+      <w:r>
+        <w:rPr>
+          <w:i/>
+          <w:iCs/>
+        </w:rPr>
+        <w:t xml:space="preserve">operativa</w:t>
+      </w:r>
+      <w:r>
+        <w:t xml:space="preserve"> realizada sobre el prototipo: comprobar que el pipeline se ejecuta de punta a punta contra la API de un proveedor comercial de LLM, y no solo en la corrida de referencia descripta en el Capítulo 7. Su alcance es el funcionamiento de la herramienta; no constituye una evaluación cuantitativa adicional ni modifica los resultados reportados.</w:t>
+      </w:r>
+    </w:p>
+    <w:p>
+      <w:pPr>
+        <w:spacing w:after="160" w:line="276"/>
+        <w:jc w:val="both"/>
+      </w:pPr>
+      <w:r>
+        <w:t xml:space="preserve">La verificación se realizó configurando en config.yaml el proveedor </w:t>
+      </w:r>
+      <w:r>
+        <w:rPr>
+          <w:i/>
+          <w:iCs/>
+        </w:rPr>
+        <w:t xml:space="preserve">anthropic</w:t>
+      </w:r>
+      <w:r>
+        <w:t xml:space="preserve"> con el modelo </w:t>
+      </w:r>
+      <w:r>
+        <w:rPr>
+          <w:i/>
+          <w:iCs/>
+        </w:rPr>
+        <w:t xml:space="preserve">claude-sonnet-4-6</w:t>
+      </w:r>
+      <w:r>
+        <w:t xml:space="preserve"> y temperatura 0,2, con la credencial provista por variable de entorno. Se ejecutó la configuración C2c completa —extracción, clasificación, descripción y auto-verificación— tanto desde la línea de comandos como desde la interfaz gráfica, sobre el corpus real de ecoFactory y sobre uno de los casos de muestreo (la clínica veterinaria de la Sección 7.6). En ambos casos las cuatro etapas se completaron y se generaron correctamente el LEL en formato JSON y los dos reportes (el LEL navegable y la evaluación contra el Gold Standard correspondiente a cada corpus).</w:t>
+      </w:r>
+    </w:p>
+    <w:p>
+      <w:pPr>
+        <w:spacing w:after="160" w:line="276"/>
+        <w:jc w:val="both"/>
+      </w:pPr>
+      <w:r>
+        <w:t xml:space="preserve">De la verificación surgieron algunas observaciones prácticas, útiles para quien reproduzca el trabajo. El identificador del modelo debe ser uno vigente y habilitado para la cuenta: los alias genéricos no siempre resuelven. Algunos modelos de última generación </w:t>
+      </w:r>
+      <w:r>
+        <w:rPr>
+          <w:i/>
+          <w:iCs/>
+        </w:rPr>
+        <w:t xml:space="preserve">deprecaron el parámetro de temperatura</w:t>
+      </w:r>
+      <w:r>
+        <w:t xml:space="preserve">, por lo que fijar la temperatura —recurso del que depende la reproducibilidad declarada en la Sección 4.13— no es posible con todos ellos; el cliente del prototipo contempla ese caso y continúa la ejecución advirtiéndolo por consola. En la misma línea, la versión 1.x del SDK del proveedor eliminó ese parámetro de su interfaz, de modo que requirements.txt acota la dependencia a la línea 0.x. Por último, la etapa de auto-verificación se procesa por lotes de símbolos: al enviarse el LEL completo en una sola solicitud, la respuesta puede exceder el límite de tokens de salida y llegar truncada.</w:t>
+      </w:r>
+    </w:p>
+    <w:p>
+      <w:pPr>
+        <w:spacing w:after="160" w:line="276"/>
+        <w:jc w:val="both"/>
+      </w:pPr>
+      <w:r>
+        <w:t xml:space="preserve">Se deja constancia expresa de que esta verificación no altera lo reportado en el Capítulo 7: la evaluación cuantitativa del trabajo sigue siendo la de la corrida de referencia, con las salvedades allí explicitadas. La corrida ciega sistemática con distintos modelos comerciales, junto con el análisis comparativo de sus resultados, permanece como la línea de trabajo futuro señalada en el Capítulo 9.</w:t>
       </w:r>
     </w:p>
     <w:sectPr>

</xml_diff>